<commit_message>
Fixed boss, gameplay statistics are now recorded and victory menu added
</commit_message>
<xml_diff>
--- a/DocumentationBachelor/Bachelor_Documentation_Eduard_Iorga.docx
+++ b/DocumentationBachelor/Bachelor_Documentation_Eduard_Iorga.docx
@@ -1305,7 +1305,23 @@
           <w:szCs w:val="28"/>
           <w:lang w:val="en-GB"/>
         </w:rPr>
-        <w:t xml:space="preserve">the procedural generation of levels, fluid melee combat, permadeath as well as upgrades/unlocks across runs. The engine used for developing this game was a custom one, made by the </w:t>
+        <w:t>the procedural generation of levels, fluid melee combat, permadeath as well as upgrades/unlocks across runs</w:t>
+      </w:r>
+      <w:r>
+        <w:rPr>
+          <w:iCs/>
+          <w:szCs w:val="28"/>
+          <w:lang w:val="en-GB"/>
+        </w:rPr>
+        <w:t xml:space="preserve"> [1]</w:t>
+      </w:r>
+      <w:r>
+        <w:rPr>
+          <w:iCs/>
+          <w:szCs w:val="28"/>
+          <w:lang w:val="en-GB"/>
+        </w:rPr>
+        <w:t xml:space="preserve">. The engine used for developing this game was a custom one, made by the </w:t>
       </w:r>
       <w:r>
         <w:rPr>
@@ -3199,6 +3215,143 @@
     </w:p>
     <w:p>
       <w:pPr>
+        <w:pStyle w:val="ListParagraph"/>
+        <w:numPr>
+          <w:ilvl w:val="0"/>
+          <w:numId w:val="6"/>
+        </w:numPr>
+        <w:rPr>
+          <w:b/>
+          <w:bCs/>
+          <w:lang w:val="en-GB"/>
+        </w:rPr>
+      </w:pPr>
+      <w:r>
+        <w:rPr>
+          <w:b/>
+          <w:bCs/>
+          <w:noProof/>
+          <w:lang w:val="en-GB"/>
+        </w:rPr>
+        <w:drawing>
+          <wp:anchor distT="0" distB="0" distL="114300" distR="114300" simplePos="0" relativeHeight="251667456" behindDoc="0" locked="0" layoutInCell="1" allowOverlap="1" wp14:anchorId="18BA9CDB" wp14:editId="7BAD1EDE">
+            <wp:simplePos x="0" y="0"/>
+            <wp:positionH relativeFrom="margin">
+              <wp:posOffset>268280</wp:posOffset>
+            </wp:positionH>
+            <wp:positionV relativeFrom="paragraph">
+              <wp:posOffset>300798</wp:posOffset>
+            </wp:positionV>
+            <wp:extent cx="5873750" cy="3083560"/>
+            <wp:effectExtent l="0" t="0" r="0" b="2540"/>
+            <wp:wrapSquare wrapText="bothSides"/>
+            <wp:docPr id="3" name="Picture 3"/>
+            <wp:cNvGraphicFramePr>
+              <a:graphicFrameLocks xmlns:a="http://schemas.openxmlformats.org/drawingml/2006/main" noChangeAspect="1"/>
+            </wp:cNvGraphicFramePr>
+            <a:graphic xmlns:a="http://schemas.openxmlformats.org/drawingml/2006/main">
+              <a:graphicData uri="http://schemas.openxmlformats.org/drawingml/2006/picture">
+                <pic:pic xmlns:pic="http://schemas.openxmlformats.org/drawingml/2006/picture">
+                  <pic:nvPicPr>
+                    <pic:cNvPr id="3" name="Picture 3"/>
+                    <pic:cNvPicPr/>
+                  </pic:nvPicPr>
+                  <pic:blipFill>
+                    <a:blip r:embed="rId15">
+                      <a:extLst>
+                        <a:ext uri="{28A0092B-C50C-407E-A947-70E740481C1C}">
+                          <a14:useLocalDpi xmlns:a14="http://schemas.microsoft.com/office/drawing/2010/main" val="0"/>
+                        </a:ext>
+                      </a:extLst>
+                    </a:blip>
+                    <a:stretch>
+                      <a:fillRect/>
+                    </a:stretch>
+                  </pic:blipFill>
+                  <pic:spPr>
+                    <a:xfrm>
+                      <a:off x="0" y="0"/>
+                      <a:ext cx="5873750" cy="3083560"/>
+                    </a:xfrm>
+                    <a:prstGeom prst="rect">
+                      <a:avLst/>
+                    </a:prstGeom>
+                  </pic:spPr>
+                </pic:pic>
+              </a:graphicData>
+            </a:graphic>
+            <wp14:sizeRelH relativeFrom="page">
+              <wp14:pctWidth>0</wp14:pctWidth>
+            </wp14:sizeRelH>
+            <wp14:sizeRelV relativeFrom="page">
+              <wp14:pctHeight>0</wp14:pctHeight>
+            </wp14:sizeRelV>
+          </wp:anchor>
+        </w:drawing>
+      </w:r>
+      <w:r>
+        <w:rPr>
+          <w:rFonts w:ascii="Arial" w:hAnsi="Arial" w:cs="Arial"/>
+          <w:sz w:val="24"/>
+          <w:szCs w:val="24"/>
+          <w:lang w:val="en-GB"/>
+        </w:rPr>
+        <w:t>Asset Store</w:t>
+      </w:r>
+    </w:p>
+    <w:p>
+      <w:pPr>
+        <w:pStyle w:val="ListParagraph"/>
+        <w:ind w:left="1571" w:firstLine="0"/>
+        <w:jc w:val="center"/>
+        <w:rPr>
+          <w:rFonts w:ascii="Arial" w:hAnsi="Arial" w:cs="Arial"/>
+          <w:sz w:val="24"/>
+          <w:szCs w:val="24"/>
+          <w:lang w:val="en-GB"/>
+        </w:rPr>
+      </w:pPr>
+      <w:r>
+        <w:rPr>
+          <w:rFonts w:ascii="Arial" w:hAnsi="Arial" w:cs="Arial"/>
+          <w:sz w:val="24"/>
+          <w:szCs w:val="24"/>
+          <w:lang w:val="en-GB"/>
+        </w:rPr>
+        <w:t>Figure 3.1.0 – Showcase of Unity (source:</w:t>
+      </w:r>
+      <w:r>
+        <w:rPr>
+          <w:rFonts w:ascii="Arial" w:hAnsi="Arial" w:cs="Arial"/>
+          <w:sz w:val="24"/>
+          <w:szCs w:val="24"/>
+          <w:lang w:val="en-GB"/>
+        </w:rPr>
+        <w:t xml:space="preserve"> </w:t>
+      </w:r>
+      <w:hyperlink r:id="rId16" w:history="1">
+        <w:r>
+          <w:rPr>
+            <w:rFonts w:ascii="Arial" w:hAnsi="Arial" w:cs="Arial"/>
+            <w:sz w:val="24"/>
+            <w:szCs w:val="24"/>
+            <w:lang w:val="en-GB"/>
+          </w:rPr>
+          <w:t>Unity</w:t>
+        </w:r>
+      </w:hyperlink>
+      <w:r>
+        <w:rPr>
+          <w:rFonts w:ascii="Arial" w:hAnsi="Arial" w:cs="Arial"/>
+          <w:sz w:val="24"/>
+          <w:szCs w:val="24"/>
+          <w:lang w:val="en-GB"/>
+        </w:rPr>
+        <w:t>)</w:t>
+      </w:r>
+    </w:p>
+    <w:p>
+      <w:pPr>
         <w:rPr>
           <w:b/>
           <w:bCs/>
@@ -3270,6 +3423,64 @@
       </w:pPr>
       <w:r>
         <w:rPr>
+          <w:b/>
+          <w:bCs/>
+          <w:noProof/>
+          <w:lang w:val="en-GB"/>
+        </w:rPr>
+        <w:lastRenderedPageBreak/>
+        <w:drawing>
+          <wp:anchor distT="0" distB="0" distL="114300" distR="114300" simplePos="0" relativeHeight="251669504" behindDoc="0" locked="0" layoutInCell="1" allowOverlap="1" wp14:anchorId="67BFBE47" wp14:editId="6F9FD377">
+            <wp:simplePos x="0" y="0"/>
+            <wp:positionH relativeFrom="column">
+              <wp:posOffset>166163</wp:posOffset>
+            </wp:positionH>
+            <wp:positionV relativeFrom="paragraph">
+              <wp:posOffset>861385</wp:posOffset>
+            </wp:positionV>
+            <wp:extent cx="6120765" cy="3444875"/>
+            <wp:effectExtent l="0" t="0" r="0" b="3175"/>
+            <wp:wrapSquare wrapText="bothSides"/>
+            <wp:docPr id="14" name="Picture 14"/>
+            <wp:cNvGraphicFramePr>
+              <a:graphicFrameLocks xmlns:a="http://schemas.openxmlformats.org/drawingml/2006/main" noChangeAspect="1"/>
+            </wp:cNvGraphicFramePr>
+            <a:graphic xmlns:a="http://schemas.openxmlformats.org/drawingml/2006/main">
+              <a:graphicData uri="http://schemas.openxmlformats.org/drawingml/2006/picture">
+                <pic:pic xmlns:pic="http://schemas.openxmlformats.org/drawingml/2006/picture">
+                  <pic:nvPicPr>
+                    <pic:cNvPr id="14" name="Picture 14"/>
+                    <pic:cNvPicPr/>
+                  </pic:nvPicPr>
+                  <pic:blipFill>
+                    <a:blip r:embed="rId17">
+                      <a:extLst>
+                        <a:ext uri="{28A0092B-C50C-407E-A947-70E740481C1C}">
+                          <a14:useLocalDpi xmlns:a14="http://schemas.microsoft.com/office/drawing/2010/main" val="0"/>
+                        </a:ext>
+                      </a:extLst>
+                    </a:blip>
+                    <a:stretch>
+                      <a:fillRect/>
+                    </a:stretch>
+                  </pic:blipFill>
+                  <pic:spPr>
+                    <a:xfrm>
+                      <a:off x="0" y="0"/>
+                      <a:ext cx="6120765" cy="3444875"/>
+                    </a:xfrm>
+                    <a:prstGeom prst="rect">
+                      <a:avLst/>
+                    </a:prstGeom>
+                  </pic:spPr>
+                </pic:pic>
+              </a:graphicData>
+            </a:graphic>
+          </wp:anchor>
+        </w:drawing>
+      </w:r>
+      <w:r>
+        <w:rPr>
           <w:rFonts w:ascii="Arial" w:hAnsi="Arial" w:cs="Arial"/>
           <w:sz w:val="24"/>
           <w:szCs w:val="24"/>
@@ -3277,6 +3488,88 @@
         </w:rPr>
         <w:t>Component-Based Design -&gt; used to modularize functionality into reusable scripts, such as EnemyPatrol.cs and HealthSystem.cs scripts, that don’t have only one single purpose.</w:t>
       </w:r>
+    </w:p>
+    <w:p>
+      <w:pPr>
+        <w:ind w:firstLine="0"/>
+        <w:jc w:val="center"/>
+        <w:rPr>
+          <w:b/>
+          <w:bCs/>
+          <w:lang w:val="en-GB"/>
+        </w:rPr>
+      </w:pPr>
+      <w:r>
+        <w:rPr>
+          <w:rFonts w:cs="Arial"/>
+          <w:lang w:val="en-GB"/>
+        </w:rPr>
+        <w:t>Figure 3.1.</w:t>
+      </w:r>
+      <w:r>
+        <w:rPr>
+          <w:rFonts w:cs="Arial"/>
+          <w:lang w:val="en-GB"/>
+        </w:rPr>
+        <w:t>1</w:t>
+      </w:r>
+      <w:r>
+        <w:rPr>
+          <w:rFonts w:cs="Arial"/>
+          <w:lang w:val="en-GB"/>
+        </w:rPr>
+        <w:t xml:space="preserve"> -Showcase of </w:t>
+      </w:r>
+      <w:r>
+        <w:rPr>
+          <w:rFonts w:cs="Arial"/>
+          <w:lang w:val="en-GB"/>
+        </w:rPr>
+        <w:t xml:space="preserve">C# language </w:t>
+      </w:r>
+      <w:r>
+        <w:rPr>
+          <w:rFonts w:cs="Arial"/>
+          <w:lang w:val="en-GB"/>
+        </w:rPr>
+        <w:t>(source</w:t>
+      </w:r>
+      <w:r>
+        <w:rPr>
+          <w:rFonts w:cs="Arial"/>
+          <w:lang w:val="en-GB"/>
+        </w:rPr>
+        <w:t xml:space="preserve">: </w:t>
+      </w:r>
+      <w:hyperlink r:id="rId18" w:history="1">
+        <w:r>
+          <w:rPr>
+            <w:rStyle w:val="Hyperlink"/>
+            <w:rFonts w:cs="Arial"/>
+            <w:lang w:val="en-GB"/>
+          </w:rPr>
+          <w:t>C#</w:t>
+        </w:r>
+      </w:hyperlink>
+      <w:r>
+        <w:rPr>
+          <w:rFonts w:cs="Arial"/>
+          <w:lang w:val="en-GB"/>
+        </w:rPr>
+        <w:t>)</w:t>
+      </w:r>
+    </w:p>
+    <w:p>
+      <w:pPr>
+        <w:pStyle w:val="ListParagraph"/>
+        <w:ind w:left="1571" w:firstLine="0"/>
+        <w:jc w:val="center"/>
+        <w:rPr>
+          <w:b/>
+          <w:bCs/>
+          <w:lang w:val="en-GB"/>
+        </w:rPr>
+      </w:pPr>
     </w:p>
     <w:p>
       <w:pPr>
@@ -3362,6 +3655,132 @@
     </w:p>
     <w:p>
       <w:pPr>
+        <w:pStyle w:val="ListParagraph"/>
+        <w:numPr>
+          <w:ilvl w:val="0"/>
+          <w:numId w:val="8"/>
+        </w:numPr>
+        <w:rPr>
+          <w:b/>
+          <w:bCs/>
+          <w:lang w:val="en-GB"/>
+        </w:rPr>
+      </w:pPr>
+      <w:r>
+        <w:rPr>
+          <w:b/>
+          <w:bCs/>
+          <w:noProof/>
+          <w:lang w:val="en-GB"/>
+        </w:rPr>
+        <w:lastRenderedPageBreak/>
+        <w:drawing>
+          <wp:anchor distT="0" distB="0" distL="114300" distR="114300" simplePos="0" relativeHeight="251668480" behindDoc="0" locked="0" layoutInCell="1" allowOverlap="1" wp14:anchorId="0AD199FF" wp14:editId="5CF5A407">
+            <wp:simplePos x="0" y="0"/>
+            <wp:positionH relativeFrom="column">
+              <wp:posOffset>177357</wp:posOffset>
+            </wp:positionH>
+            <wp:positionV relativeFrom="paragraph">
+              <wp:posOffset>223874</wp:posOffset>
+            </wp:positionV>
+            <wp:extent cx="6120765" cy="2922905"/>
+            <wp:effectExtent l="0" t="0" r="0" b="0"/>
+            <wp:wrapSquare wrapText="bothSides"/>
+            <wp:docPr id="13" name="Picture 13"/>
+            <wp:cNvGraphicFramePr>
+              <a:graphicFrameLocks xmlns:a="http://schemas.openxmlformats.org/drawingml/2006/main" noChangeAspect="1"/>
+            </wp:cNvGraphicFramePr>
+            <a:graphic xmlns:a="http://schemas.openxmlformats.org/drawingml/2006/main">
+              <a:graphicData uri="http://schemas.openxmlformats.org/drawingml/2006/picture">
+                <pic:pic xmlns:pic="http://schemas.openxmlformats.org/drawingml/2006/picture">
+                  <pic:nvPicPr>
+                    <pic:cNvPr id="13" name="Picture 13"/>
+                    <pic:cNvPicPr/>
+                  </pic:nvPicPr>
+                  <pic:blipFill>
+                    <a:blip r:embed="rId19" cstate="print">
+                      <a:extLst>
+                        <a:ext uri="{28A0092B-C50C-407E-A947-70E740481C1C}">
+                          <a14:useLocalDpi xmlns:a14="http://schemas.microsoft.com/office/drawing/2010/main" val="0"/>
+                        </a:ext>
+                      </a:extLst>
+                    </a:blip>
+                    <a:stretch>
+                      <a:fillRect/>
+                    </a:stretch>
+                  </pic:blipFill>
+                  <pic:spPr>
+                    <a:xfrm>
+                      <a:off x="0" y="0"/>
+                      <a:ext cx="6120765" cy="2922905"/>
+                    </a:xfrm>
+                    <a:prstGeom prst="rect">
+                      <a:avLst/>
+                    </a:prstGeom>
+                  </pic:spPr>
+                </pic:pic>
+              </a:graphicData>
+            </a:graphic>
+            <wp14:sizeRelH relativeFrom="margin">
+              <wp14:pctWidth>0</wp14:pctWidth>
+            </wp14:sizeRelH>
+            <wp14:sizeRelV relativeFrom="margin">
+              <wp14:pctHeight>0</wp14:pctHeight>
+            </wp14:sizeRelV>
+          </wp:anchor>
+        </w:drawing>
+      </w:r>
+      <w:r>
+        <w:rPr>
+          <w:rFonts w:ascii="Arial" w:hAnsi="Arial" w:cs="Arial"/>
+          <w:sz w:val="24"/>
+          <w:szCs w:val="24"/>
+          <w:lang w:val="en-GB"/>
+        </w:rPr>
+        <w:t>Unity Asset Store</w:t>
+      </w:r>
+    </w:p>
+    <w:p>
+      <w:pPr>
+        <w:pStyle w:val="ListParagraph"/>
+        <w:ind w:left="1571" w:firstLine="0"/>
+        <w:jc w:val="center"/>
+        <w:rPr>
+          <w:b/>
+          <w:bCs/>
+          <w:lang w:val="en-GB"/>
+        </w:rPr>
+      </w:pPr>
+      <w:r>
+        <w:rPr>
+          <w:rFonts w:ascii="Arial" w:hAnsi="Arial" w:cs="Arial"/>
+          <w:sz w:val="24"/>
+          <w:szCs w:val="24"/>
+          <w:lang w:val="en-GB"/>
+        </w:rPr>
+        <w:t>Figure 3.1.</w:t>
+      </w:r>
+      <w:r>
+        <w:rPr>
+          <w:rFonts w:ascii="Arial" w:hAnsi="Arial" w:cs="Arial"/>
+          <w:sz w:val="24"/>
+          <w:szCs w:val="24"/>
+          <w:lang w:val="en-GB"/>
+        </w:rPr>
+        <w:t>2</w:t>
+      </w:r>
+      <w:r>
+        <w:rPr>
+          <w:rFonts w:ascii="Arial" w:hAnsi="Arial" w:cs="Arial"/>
+          <w:sz w:val="24"/>
+          <w:szCs w:val="24"/>
+          <w:lang w:val="en-GB"/>
+        </w:rPr>
+        <w:t xml:space="preserve"> -Showcase of Unity Asset Store (source: Screenshot)</w:t>
+      </w:r>
+    </w:p>
+    <w:p>
+      <w:pPr>
         <w:rPr>
           <w:b/>
           <w:bCs/>
@@ -3442,42 +3861,36 @@
         <w:rPr>
           <w:lang w:val="en-GB"/>
         </w:rPr>
-        <w:t xml:space="preserve">y two edges, the enemy flipping direction when colliding with them. The sprite’s scale is flipped on the x-axis to mirror direction and animations are toggle via the Unity Animator. The moment the enemy reaches the edge, he remains idle for a few seconds before changing direction of his patrol; this is due to the fact that I wanted to take a realistic </w:t>
-      </w:r>
-      <w:r>
-        <w:rPr>
+        <w:t xml:space="preserve">y two edges, the enemy flipping direction when colliding with them. The sprite’s scale is flipped on the x-axis to mirror direction and animations are toggle via the Unity Animator. The moment the enemy reaches the edge, he remains idle for a few seconds before changing direction of his patrol; this is due to the fact that I wanted to take a realistic approach </w:t>
+      </w:r>
+      <w:r>
+        <w:rPr>
+          <w:lang w:val="en-GB"/>
+        </w:rPr>
+        <w:t>to the way an enemy patrols. The animator triggers in order to sync movement with visual state.</w:t>
+      </w:r>
+    </w:p>
+    <w:p>
+      <w:pPr>
+        <w:ind w:firstLine="0"/>
+        <w:rPr>
+          <w:lang w:val="en-GB"/>
+        </w:rPr>
+      </w:pPr>
+    </w:p>
+    <w:p>
+      <w:pPr>
+        <w:ind w:firstLine="0"/>
+        <w:rPr>
+          <w:lang w:val="en-GB"/>
+        </w:rPr>
+      </w:pPr>
+      <w:r>
+        <w:rPr>
+          <w:noProof/>
           <w:lang w:val="en-GB"/>
         </w:rPr>
         <w:lastRenderedPageBreak/>
-        <w:t xml:space="preserve">approach </w:t>
-      </w:r>
-      <w:r>
-        <w:rPr>
-          <w:lang w:val="en-GB"/>
-        </w:rPr>
-        <w:t>to the way an enemy patrols. The animator triggers in order to sync movement with visual state.</w:t>
-      </w:r>
-    </w:p>
-    <w:p>
-      <w:pPr>
-        <w:ind w:firstLine="0"/>
-        <w:rPr>
-          <w:lang w:val="en-GB"/>
-        </w:rPr>
-      </w:pPr>
-    </w:p>
-    <w:p>
-      <w:pPr>
-        <w:ind w:firstLine="0"/>
-        <w:rPr>
-          <w:lang w:val="en-GB"/>
-        </w:rPr>
-      </w:pPr>
-      <w:r>
-        <w:rPr>
-          <w:noProof/>
-          <w:lang w:val="en-GB"/>
-        </w:rPr>
         <w:drawing>
           <wp:inline distT="0" distB="0" distL="0" distR="0" wp14:anchorId="08501CB8" wp14:editId="63C59AAA">
             <wp:extent cx="6120765" cy="3556635"/>
@@ -3494,7 +3907,7 @@
                     <pic:cNvPicPr/>
                   </pic:nvPicPr>
                   <pic:blipFill>
-                    <a:blip r:embed="rId15">
+                    <a:blip r:embed="rId20">
                       <a:extLst>
                         <a:ext uri="{28A0092B-C50C-407E-A947-70E740481C1C}">
                           <a14:useLocalDpi xmlns:a14="http://schemas.microsoft.com/office/drawing/2010/main" val="0"/>
@@ -3732,7 +4145,7 @@
                     <pic:cNvPicPr/>
                   </pic:nvPicPr>
                   <pic:blipFill>
-                    <a:blip r:embed="rId16">
+                    <a:blip r:embed="rId21">
                       <a:extLst>
                         <a:ext uri="{28A0092B-C50C-407E-A947-70E740481C1C}">
                           <a14:useLocalDpi xmlns:a14="http://schemas.microsoft.com/office/drawing/2010/main" val="0"/>
@@ -4010,7 +4423,7 @@
                     <pic:cNvPicPr/>
                   </pic:nvPicPr>
                   <pic:blipFill>
-                    <a:blip r:embed="rId17" cstate="print">
+                    <a:blip r:embed="rId22" cstate="print">
                       <a:extLst>
                         <a:ext uri="{28A0092B-C50C-407E-A947-70E740481C1C}">
                           <a14:useLocalDpi xmlns:a14="http://schemas.microsoft.com/office/drawing/2010/main" val="0"/>
@@ -4548,7 +4961,7 @@
                     <pic:cNvPicPr/>
                   </pic:nvPicPr>
                   <pic:blipFill>
-                    <a:blip r:embed="rId18" cstate="print">
+                    <a:blip r:embed="rId23" cstate="print">
                       <a:extLst>
                         <a:ext uri="{28A0092B-C50C-407E-A947-70E740481C1C}">
                           <a14:useLocalDpi xmlns:a14="http://schemas.microsoft.com/office/drawing/2010/main" val="0"/>
@@ -4921,7 +5334,7 @@
                     <pic:cNvPicPr/>
                   </pic:nvPicPr>
                   <pic:blipFill>
-                    <a:blip r:embed="rId19" cstate="print">
+                    <a:blip r:embed="rId24" cstate="print">
                       <a:extLst>
                         <a:ext uri="{28A0092B-C50C-407E-A947-70E740481C1C}">
                           <a14:useLocalDpi xmlns:a14="http://schemas.microsoft.com/office/drawing/2010/main" val="0"/>
@@ -5167,7 +5580,19 @@
           <w:lang w:val="en-GB"/>
         </w:rPr>
         <w:lastRenderedPageBreak/>
-        <w:t xml:space="preserve">4.6 Class Diagram </w:t>
+        <w:t xml:space="preserve">4.6 </w:t>
+      </w:r>
+      <w:r>
+        <w:rPr>
+          <w:lang w:val="en-GB"/>
+        </w:rPr>
+        <w:t>Player Attack System</w:t>
+      </w:r>
+      <w:r>
+        <w:rPr>
+          <w:lang w:val="en-GB"/>
+        </w:rPr>
+        <w:t xml:space="preserve"> </w:t>
       </w:r>
     </w:p>
     <w:p>
@@ -5213,7 +5638,7 @@
                     <pic:cNvPicPr/>
                   </pic:nvPicPr>
                   <pic:blipFill>
-                    <a:blip r:embed="rId20">
+                    <a:blip r:embed="rId25">
                       <a:extLst>
                         <a:ext uri="{28A0092B-C50C-407E-A947-70E740481C1C}">
                           <a14:useLocalDpi xmlns:a14="http://schemas.microsoft.com/office/drawing/2010/main" val="0"/>
@@ -5491,7 +5916,25 @@
           <w:szCs w:val="24"/>
           <w:lang w:val="en-GB"/>
         </w:rPr>
-        <w:t>objects. A fireball has attributes such as speed, direction and lifetime. They are used in order to make sure the gameplay is well balanced, but their values can be modified through items. Namely, the speed and direction can be modified. Once a fireball reaches its lifetime limit, it will deactivate through deactivate() function. Update() is used for the general behaviour of the fireball and Awake() is used in order to initialize variables. The function onTrigerEnter2D() has the purpose of handling the behaviour of a fireball once it collides with an object, more specifically set the animator and call deactivate after the collision</w:t>
+        <w:t>objects. A fireball has attributes such as speed, direction and lifetime. They are used in order to make sure the gameplay is well balanced, but their values can be modified through items. Namely, the speed and direction can be modified. Once a fireball reaches its lifetime limit, it will deactivate through deactivate() function. Update() is used for the general behaviour of the fireball and Awake() is used in order to initialize variables. The function onTrig</w:t>
+      </w:r>
+      <w:r>
+        <w:rPr>
+          <w:rFonts w:ascii="Arial" w:hAnsi="Arial" w:cs="Arial"/>
+          <w:sz w:val="24"/>
+          <w:szCs w:val="24"/>
+          <w:lang w:val="en-GB"/>
+        </w:rPr>
+        <w:t>g</w:t>
+      </w:r>
+      <w:r>
+        <w:rPr>
+          <w:rFonts w:ascii="Arial" w:hAnsi="Arial" w:cs="Arial"/>
+          <w:sz w:val="24"/>
+          <w:szCs w:val="24"/>
+          <w:lang w:val="en-GB"/>
+        </w:rPr>
+        <w:t>erEnter2D() has the purpose of handling the behaviour of a fireball once it collides with an object, more specifically set the animator and call deactivate after the collision</w:t>
       </w:r>
     </w:p>
     <w:p>
@@ -5540,567 +5983,44 @@
           <w:szCs w:val="24"/>
           <w:lang w:val="en-GB"/>
         </w:rPr>
-        <w:t>has the simple purpose of holding multiple fireballs. It acts as an array of fireballs from which the player can access the projectile,</w:t>
-      </w:r>
-    </w:p>
-    <w:p>
-      <w:pPr>
-        <w:spacing w:before="240"/>
-        <w:rPr>
-          <w:lang w:val="en-GB"/>
-        </w:rPr>
-      </w:pPr>
-      <w:r>
-        <w:rPr>
-          <w:lang w:val="en-GB"/>
-        </w:rPr>
-        <w:t>ach sub-section title (e.g. 1.1 General information) shall begin after a 12 points blankline</w:t>
-      </w:r>
-    </w:p>
-    <w:p>
-      <w:pPr>
-        <w:spacing w:before="240"/>
-        <w:rPr>
-          <w:lang w:val="en-GB"/>
-        </w:rPr>
-      </w:pPr>
-      <w:r>
-        <w:rPr>
-          <w:lang w:val="en-GB"/>
-        </w:rPr>
-        <w:t xml:space="preserve"> after the text and shall be followed by a 12 points blank line. </w:t>
-      </w:r>
-      <w:r>
-        <w:rPr>
-          <w:lang w:val="en-GB"/>
-        </w:rPr>
-        <w:t xml:space="preserve"> </w:t>
-      </w:r>
-    </w:p>
-    <w:p>
-      <w:pPr>
-        <w:rPr>
-          <w:lang w:val="en-GB"/>
-        </w:rPr>
-      </w:pPr>
-      <w:r>
-        <w:rPr>
-          <w:rFonts w:cs="Arial"/>
-          <w:lang w:val="en-GB"/>
-        </w:rPr>
-        <w:t xml:space="preserve">The text of the paper will be </w:t>
-      </w:r>
-      <w:r>
-        <w:rPr>
-          <w:rFonts w:cs="Arial"/>
-          <w:i/>
-          <w:lang w:val="en-GB"/>
-        </w:rPr>
-        <w:t>justified</w:t>
-      </w:r>
-      <w:r>
-        <w:rPr>
-          <w:rFonts w:cs="Arial"/>
-          <w:lang w:val="en-GB"/>
-        </w:rPr>
-        <w:t xml:space="preserve">. It is recommended to check the spelling of the text with the help of the speller of the Word program. </w:t>
-      </w:r>
-      <w:r>
-        <w:rPr>
-          <w:lang w:val="en-GB"/>
-        </w:rPr>
-        <w:t>It is recommended that the thesis paper should not exceed a number of 100 pages, annexes included.</w:t>
-      </w:r>
-    </w:p>
-    <w:p>
-      <w:pPr>
-        <w:spacing w:line="240" w:lineRule="auto"/>
-        <w:rPr>
-          <w:rFonts w:cs="Arial"/>
-          <w:lang w:val="en-GB" w:eastAsia="ro-RO"/>
-        </w:rPr>
-      </w:pPr>
-      <w:r>
-        <w:rPr>
-          <w:rFonts w:cs="Arial"/>
-          <w:lang w:val="en-GB" w:eastAsia="ro-RO"/>
-        </w:rPr>
-        <w:t>Rules app</w:t>
-      </w:r>
-      <w:r>
-        <w:rPr>
-          <w:rFonts w:cs="Arial"/>
-          <w:lang w:val="en-GB" w:eastAsia="ro-RO"/>
-        </w:rPr>
-        <w:t>l</w:t>
-      </w:r>
-      <w:r>
-        <w:rPr>
-          <w:rFonts w:cs="Arial"/>
-          <w:lang w:val="en-GB" w:eastAsia="ro-RO"/>
-        </w:rPr>
-        <w:t>ying to the text of the paper:</w:t>
-      </w:r>
-    </w:p>
-    <w:p>
-      <w:pPr>
-        <w:numPr>
-          <w:ilvl w:val="0"/>
-          <w:numId w:val="4"/>
-        </w:numPr>
-        <w:spacing w:line="240" w:lineRule="auto"/>
-        <w:ind w:left="661" w:hanging="338"/>
-        <w:rPr>
-          <w:rFonts w:cs="Arial"/>
-          <w:lang w:val="en-GB" w:eastAsia="ro-RO"/>
-        </w:rPr>
-      </w:pPr>
-      <w:r>
-        <w:rPr>
-          <w:rFonts w:cs="Arial"/>
-          <w:i/>
-          <w:lang w:val="en-GB" w:eastAsia="ro-RO"/>
-        </w:rPr>
-        <w:t xml:space="preserve">Margins of the page </w:t>
-      </w:r>
-      <w:r>
-        <w:rPr>
-          <w:rFonts w:cs="Arial"/>
-          <w:lang w:val="en-GB" w:eastAsia="ro-RO"/>
-        </w:rPr>
-        <w:t xml:space="preserve">– the following values will be used (Page Setup -&gt; Margins-&gt; Mirror Margins): </w:t>
-      </w:r>
-    </w:p>
-    <w:p>
-      <w:pPr>
-        <w:numPr>
-          <w:ilvl w:val="2"/>
-          <w:numId w:val="5"/>
-        </w:numPr>
-        <w:spacing w:line="240" w:lineRule="auto"/>
-        <w:ind w:hanging="338"/>
-        <w:rPr>
-          <w:rFonts w:cs="Arial"/>
-          <w:lang w:val="en-GB" w:eastAsia="ro-RO"/>
-        </w:rPr>
-      </w:pPr>
-      <w:r>
-        <w:rPr>
-          <w:rFonts w:cs="Arial"/>
-          <w:lang w:val="en-GB" w:eastAsia="ro-RO"/>
-        </w:rPr>
-        <w:t xml:space="preserve">interior: 2 cm  </w:t>
-      </w:r>
-    </w:p>
-    <w:p>
-      <w:pPr>
-        <w:numPr>
-          <w:ilvl w:val="2"/>
-          <w:numId w:val="5"/>
-        </w:numPr>
-        <w:spacing w:line="240" w:lineRule="auto"/>
-        <w:ind w:hanging="338"/>
-        <w:rPr>
-          <w:rFonts w:cs="Arial"/>
-          <w:lang w:val="en-GB" w:eastAsia="ro-RO"/>
-        </w:rPr>
-      </w:pPr>
-      <w:r>
-        <w:rPr>
-          <w:rFonts w:cs="Arial"/>
-          <w:lang w:val="en-GB" w:eastAsia="ro-RO"/>
-        </w:rPr>
-        <w:t xml:space="preserve">exterior: 2 cm </w:t>
-      </w:r>
-    </w:p>
-    <w:p>
-      <w:pPr>
-        <w:numPr>
-          <w:ilvl w:val="2"/>
-          <w:numId w:val="5"/>
-        </w:numPr>
-        <w:spacing w:line="240" w:lineRule="auto"/>
-        <w:ind w:hanging="338"/>
-        <w:rPr>
-          <w:rFonts w:cs="Arial"/>
-          <w:lang w:val="en-GB" w:eastAsia="ro-RO"/>
-        </w:rPr>
-      </w:pPr>
-      <w:r>
-        <w:rPr>
-          <w:rFonts w:cs="Arial"/>
-          <w:lang w:val="en-GB" w:eastAsia="ro-RO"/>
-        </w:rPr>
-        <w:t>up: 2,5 cm (header included)</w:t>
-      </w:r>
-    </w:p>
-    <w:p>
-      <w:pPr>
-        <w:numPr>
-          <w:ilvl w:val="2"/>
-          <w:numId w:val="5"/>
-        </w:numPr>
-        <w:spacing w:line="240" w:lineRule="auto"/>
-        <w:ind w:hanging="338"/>
-        <w:rPr>
-          <w:rFonts w:cs="Arial"/>
-          <w:lang w:val="en-GB" w:eastAsia="ro-RO"/>
-        </w:rPr>
-      </w:pPr>
-      <w:r>
-        <w:rPr>
-          <w:rFonts w:cs="Arial"/>
-          <w:lang w:val="en-GB" w:eastAsia="ro-RO"/>
-        </w:rPr>
-        <w:t>down: 2 cm</w:t>
-      </w:r>
-    </w:p>
-    <w:p>
-      <w:pPr>
-        <w:numPr>
-          <w:ilvl w:val="0"/>
-          <w:numId w:val="4"/>
-        </w:numPr>
-        <w:spacing w:line="240" w:lineRule="auto"/>
-        <w:ind w:left="661" w:hanging="338"/>
-        <w:rPr>
-          <w:rFonts w:cs="Arial"/>
-          <w:lang w:val="en-GB" w:eastAsia="ro-RO"/>
-        </w:rPr>
-      </w:pPr>
-      <w:r>
-        <w:rPr>
-          <w:rFonts w:cs="Arial"/>
-          <w:i/>
-          <w:lang w:val="en-GB" w:eastAsia="ro-RO"/>
-        </w:rPr>
-        <w:t xml:space="preserve">Line spacing </w:t>
-      </w:r>
-      <w:r>
-        <w:rPr>
-          <w:rFonts w:cs="Arial"/>
-          <w:lang w:val="en-GB" w:eastAsia="ro-RO"/>
-        </w:rPr>
-        <w:t>– the text shall apply a 1.15 line spacing (Format&gt;Paragraph-&gt;Line spacing-&gt; 1,15 lines);</w:t>
-      </w:r>
-    </w:p>
-    <w:p>
-      <w:pPr>
-        <w:numPr>
-          <w:ilvl w:val="0"/>
-          <w:numId w:val="4"/>
-        </w:numPr>
-        <w:spacing w:line="240" w:lineRule="auto"/>
-        <w:ind w:left="661" w:hanging="338"/>
-        <w:rPr>
-          <w:rFonts w:cs="Arial"/>
-          <w:lang w:val="en-GB" w:eastAsia="ro-RO"/>
-        </w:rPr>
-      </w:pPr>
-      <w:r>
-        <w:rPr>
-          <w:rFonts w:cs="Arial"/>
-          <w:i/>
-          <w:lang w:val="en-GB" w:eastAsia="ro-RO"/>
-        </w:rPr>
-        <w:t xml:space="preserve">Indentation </w:t>
-      </w:r>
-      <w:r>
-        <w:rPr>
-          <w:rFonts w:cs="Arial"/>
-          <w:lang w:val="en-GB" w:eastAsia="ro-RO"/>
-        </w:rPr>
-        <w:t>– text within regular paragraphs will be aligned between the left and the right margins (justified). The first line of each paragraph will have a 1.5 cm indentation   (Format-&gt; Paragraph-&gt; Indentation-&gt; Left). There will be an exception for chapter titles, which will be aligned left, just like the titles of the tables and of the figures   (see explanations below);</w:t>
-      </w:r>
-    </w:p>
-    <w:p>
-      <w:pPr>
-        <w:numPr>
-          <w:ilvl w:val="0"/>
-          <w:numId w:val="4"/>
-        </w:numPr>
-        <w:spacing w:line="240" w:lineRule="auto"/>
-        <w:ind w:left="661" w:hanging="338"/>
-        <w:rPr>
-          <w:rFonts w:cs="Arial"/>
-          <w:lang w:val="en-GB" w:eastAsia="ro-RO"/>
-        </w:rPr>
-      </w:pPr>
-      <w:r>
-        <w:rPr>
-          <w:rFonts w:cs="Arial"/>
-          <w:i/>
-          <w:lang w:val="en-GB" w:eastAsia="ro-RO"/>
-        </w:rPr>
-        <w:t xml:space="preserve">Font </w:t>
-      </w:r>
-      <w:r>
-        <w:rPr>
-          <w:rFonts w:cs="Arial"/>
-          <w:lang w:val="en-GB" w:eastAsia="ro-RO"/>
-        </w:rPr>
-        <w:t xml:space="preserve">– the 12 points Arial font will be used, as well as the specific </w:t>
-      </w:r>
-      <w:r>
-        <w:rPr>
-          <w:rFonts w:cs="Arial"/>
-          <w:b/>
-          <w:lang w:val="en-GB" w:eastAsia="ro-RO"/>
-        </w:rPr>
-        <w:t>diacritics</w:t>
-      </w:r>
-      <w:r>
-        <w:rPr>
-          <w:rFonts w:cs="Arial"/>
-          <w:lang w:val="en-GB" w:eastAsia="ro-RO"/>
-        </w:rPr>
-        <w:t xml:space="preserve"> of the paper language (e.g.: ă, â, î, ş, ţ – for the Romanian language);</w:t>
-      </w:r>
-    </w:p>
-    <w:p>
-      <w:pPr>
-        <w:numPr>
-          <w:ilvl w:val="0"/>
-          <w:numId w:val="4"/>
-        </w:numPr>
-        <w:spacing w:line="240" w:lineRule="auto"/>
-        <w:ind w:hanging="338"/>
-        <w:rPr>
-          <w:rFonts w:cs="Arial"/>
-          <w:lang w:val="en-GB" w:eastAsia="ro-RO"/>
-        </w:rPr>
-      </w:pPr>
-      <w:r>
-        <w:rPr>
-          <w:rFonts w:cs="Arial"/>
-          <w:i/>
-          <w:lang w:val="en-GB" w:eastAsia="ro-RO"/>
-        </w:rPr>
-        <w:t xml:space="preserve">Page numbering </w:t>
-      </w:r>
-      <w:r>
-        <w:rPr>
-          <w:rFonts w:cs="Arial"/>
-          <w:lang w:val="en-GB" w:eastAsia="ro-RO"/>
-        </w:rPr>
-        <w:t>-  Page numbering runs from the title page to the last page of the paper, but the page number appears starts on the Introduction page. The page number is inserted at the bottom of the page, centered.</w:t>
-      </w:r>
-    </w:p>
-    <w:p>
-      <w:pPr>
-        <w:numPr>
-          <w:ilvl w:val="0"/>
-          <w:numId w:val="4"/>
-        </w:numPr>
-        <w:spacing w:line="240" w:lineRule="auto"/>
-        <w:ind w:left="661" w:hanging="338"/>
-        <w:rPr>
-          <w:rFonts w:cs="Arial"/>
-          <w:lang w:val="en-GB" w:eastAsia="ro-RO"/>
-        </w:rPr>
-      </w:pPr>
-      <w:r>
-        <w:rPr>
-          <w:rFonts w:cs="Arial"/>
-          <w:i/>
-          <w:lang w:val="en-GB" w:eastAsia="ro-RO"/>
-        </w:rPr>
-        <w:t xml:space="preserve">Page header </w:t>
-      </w:r>
-      <w:r>
-        <w:rPr>
-          <w:rFonts w:cs="Arial"/>
-          <w:lang w:val="en-GB" w:eastAsia="ro-RO"/>
-        </w:rPr>
-        <w:t xml:space="preserve">– it shall be inserted starting with the introduction page and contains, in successive lines, the </w:t>
-      </w:r>
-      <w:r>
-        <w:rPr>
-          <w:rFonts w:cs="Arial"/>
-          <w:lang w:val="en-GB" w:eastAsia="ro-RO"/>
-        </w:rPr>
-        <w:t>following</w:t>
-      </w:r>
-      <w:r>
-        <w:rPr>
-          <w:rFonts w:cs="Arial"/>
-          <w:lang w:val="en-GB" w:eastAsia="ro-RO"/>
-        </w:rPr>
-        <w:t xml:space="preserve"> text, aligned left and with the size of 8 points: (i) the text </w:t>
-      </w:r>
-      <w:r>
-        <w:rPr>
-          <w:rFonts w:cs="Arial"/>
-          <w:i/>
-          <w:iCs/>
-          <w:lang w:val="en-GB" w:eastAsia="ro-RO"/>
-        </w:rPr>
-        <w:t>Politehnica University of Timișoara</w:t>
-      </w:r>
-      <w:r>
-        <w:rPr>
-          <w:rFonts w:cs="Arial"/>
-          <w:lang w:val="en-GB" w:eastAsia="ro-RO"/>
-        </w:rPr>
-        <w:t xml:space="preserve"> ; (ii) the name of the program of study and the year of the paper defense; (iii) the name of the candidate (left) and the title of the paper. At the right of the header, the UPT logo may be inserted; </w:t>
-      </w:r>
-    </w:p>
-    <w:p>
-      <w:pPr>
-        <w:rPr>
-          <w:lang w:val="en-GB"/>
-        </w:rPr>
-      </w:pPr>
-    </w:p>
-    <w:p>
-      <w:pPr>
-        <w:pStyle w:val="Heading2"/>
-        <w:numPr>
-          <w:ilvl w:val="1"/>
-          <w:numId w:val="1"/>
-        </w:numPr>
-        <w:spacing w:before="240"/>
-        <w:ind w:firstLine="0"/>
-        <w:rPr>
-          <w:lang w:val="en-GB"/>
-        </w:rPr>
-      </w:pPr>
-      <w:r>
-        <w:rPr>
-          <w:lang w:val="en-GB"/>
-        </w:rPr>
-        <w:t xml:space="preserve"> </w:t>
-      </w:r>
-      <w:r>
-        <w:rPr>
-          <w:lang w:val="en-GB"/>
-        </w:rPr>
-        <w:t>FIGURES AND PHOTOGRAPHS</w:t>
-      </w:r>
-      <w:r>
-        <w:rPr>
-          <w:lang w:val="en-GB"/>
-        </w:rPr>
-        <w:t xml:space="preserve"> (12 pt, Bold, Uppercase, Left)</w:t>
-      </w:r>
-    </w:p>
-    <w:p>
-      <w:pPr>
-        <w:rPr>
-          <w:lang w:val="en-GB"/>
-        </w:rPr>
-      </w:pPr>
-    </w:p>
-    <w:p>
-      <w:pPr>
-        <w:rPr>
-          <w:lang w:val="en-GB"/>
-        </w:rPr>
-      </w:pPr>
-      <w:r>
-        <w:rPr>
-          <w:rFonts w:cs="Arial"/>
-          <w:lang w:val="en-GB"/>
-        </w:rPr>
-        <w:t>Figures (including images, graphs</w:t>
-      </w:r>
-      <w:r>
-        <w:rPr>
-          <w:rFonts w:cs="Arial"/>
-          <w:lang w:val="en-GB"/>
-        </w:rPr>
-        <w:t xml:space="preserve"> </w:t>
-      </w:r>
-      <w:r>
-        <w:rPr>
-          <w:rFonts w:cs="Arial"/>
-          <w:lang w:val="en-GB"/>
-        </w:rPr>
-        <w:t>and screenshots</w:t>
-      </w:r>
-      <w:r>
-        <w:rPr>
-          <w:rFonts w:cs="Arial"/>
-          <w:lang w:val="en-GB"/>
-        </w:rPr>
-        <w:t>) are numbered in order of their appearance in the paper. Alternatively, figures may be numbered in order in each chapter, including the chapter number. Each figure has a number and a title, which is mentioned under the figure, centered. Where applicable, the source of the figure shall be indicated in brackets after the title of the figure;</w:t>
-      </w:r>
-    </w:p>
-    <w:p>
-      <w:pPr>
-        <w:rPr>
-          <w:lang w:val="en-GB"/>
-        </w:rPr>
-      </w:pPr>
-    </w:p>
-    <w:p>
-      <w:pPr>
-        <w:rPr>
-          <w:lang w:val="en-GB"/>
-        </w:rPr>
-      </w:pPr>
-      <w:r>
-        <w:rPr>
-          <w:lang w:val="en-GB"/>
-        </w:rPr>
-        <w:t xml:space="preserve">All figures and photographs inserted in the paper must be </w:t>
-      </w:r>
-      <w:r>
-        <w:rPr>
-          <w:lang w:val="en-GB"/>
-        </w:rPr>
-        <w:t>referenced</w:t>
-      </w:r>
-      <w:r>
-        <w:rPr>
-          <w:lang w:val="en-GB"/>
-        </w:rPr>
-        <w:t xml:space="preserve"> in the text, numbered and titled. </w:t>
-      </w:r>
-    </w:p>
-    <w:p>
-      <w:pPr>
-        <w:rPr>
-          <w:lang w:val="en-GB"/>
-        </w:rPr>
-      </w:pPr>
-      <w:r>
-        <w:rPr>
-          <w:lang w:val="en-GB"/>
-        </w:rPr>
-        <w:t>There will be a blank line (Arial 12 pt) between the figure and the text. Figures will be centered.</w:t>
-      </w:r>
-    </w:p>
-    <w:p>
-      <w:pPr>
-        <w:spacing w:after="240"/>
-        <w:rPr>
-          <w:lang w:val="en-GB"/>
-        </w:rPr>
-      </w:pPr>
-    </w:p>
-    <w:p>
-      <w:pPr>
-        <w:pStyle w:val="tabel"/>
-        <w:tabs>
-          <w:tab w:val="left" w:pos="567"/>
-        </w:tabs>
-        <w:rPr>
-          <w:smallCaps w:val="0"/>
-          <w:lang w:val="en-GB"/>
-        </w:rPr>
-      </w:pPr>
-      <w:r>
-        <w:rPr>
-          <w:smallCaps w:val="0"/>
+        <w:t>has the simple purpose of holding multiple fireballs. It acts as an array of fireballs from which the player can access the projectile</w:t>
+      </w:r>
+      <w:r>
+        <w:rPr>
+          <w:rFonts w:ascii="Arial" w:hAnsi="Arial" w:cs="Arial"/>
+          <w:sz w:val="24"/>
+          <w:szCs w:val="24"/>
+          <w:lang w:val="en-GB"/>
+        </w:rPr>
+        <w:t>.</w:t>
+      </w:r>
+    </w:p>
+    <w:p>
+      <w:pPr>
+        <w:rPr>
+          <w:strike/>
+          <w:lang w:val="en-GB"/>
+        </w:rPr>
+      </w:pPr>
+      <w:r>
+        <w:rPr>
+          <w:strike/>
           <w:noProof/>
-          <w:lang w:val="en-GB" w:eastAsia="ro-RO"/>
+          <w:lang w:val="en-GB"/>
         </w:rPr>
         <w:drawing>
-          <wp:inline distT="0" distB="0" distL="0" distR="0" wp14:anchorId="293B9756" wp14:editId="293B9757">
-            <wp:extent cx="3615055" cy="2336800"/>
-            <wp:effectExtent l="0" t="0" r="4445" b="6350"/>
-            <wp:docPr id="3" name="Picture 3" descr="INT_EXTjoint"/>
+          <wp:anchor distT="0" distB="0" distL="114300" distR="114300" simplePos="0" relativeHeight="251670528" behindDoc="0" locked="0" layoutInCell="1" allowOverlap="1" wp14:anchorId="5FE51F03" wp14:editId="1972FB35">
+            <wp:simplePos x="0" y="0"/>
+            <wp:positionH relativeFrom="column">
+              <wp:posOffset>182762</wp:posOffset>
+            </wp:positionH>
+            <wp:positionV relativeFrom="paragraph">
+              <wp:posOffset>214276</wp:posOffset>
+            </wp:positionV>
+            <wp:extent cx="6120765" cy="3070860"/>
+            <wp:effectExtent l="0" t="0" r="0" b="0"/>
+            <wp:wrapSquare wrapText="bothSides"/>
+            <wp:docPr id="17" name="Picture 17"/>
             <wp:cNvGraphicFramePr>
               <a:graphicFrameLocks xmlns:a="http://schemas.openxmlformats.org/drawingml/2006/main" noChangeAspect="1"/>
             </wp:cNvGraphicFramePr>
@@ -6108,1665 +6028,199 @@
               <a:graphicData uri="http://schemas.openxmlformats.org/drawingml/2006/picture">
                 <pic:pic xmlns:pic="http://schemas.openxmlformats.org/drawingml/2006/picture">
                   <pic:nvPicPr>
-                    <pic:cNvPr id="0" name="Picture 3" descr="INT_EXTjoint"/>
-                    <pic:cNvPicPr>
-                      <a:picLocks noChangeAspect="1" noChangeArrowheads="1"/>
-                    </pic:cNvPicPr>
+                    <pic:cNvPr id="17" name="Picture 17"/>
+                    <pic:cNvPicPr/>
                   </pic:nvPicPr>
                   <pic:blipFill>
-                    <a:blip r:embed="rId21" cstate="print">
+                    <a:blip r:embed="rId26">
                       <a:extLst>
                         <a:ext uri="{28A0092B-C50C-407E-A947-70E740481C1C}">
                           <a14:useLocalDpi xmlns:a14="http://schemas.microsoft.com/office/drawing/2010/main" val="0"/>
                         </a:ext>
                       </a:extLst>
                     </a:blip>
-                    <a:srcRect l="10487" t="19064" r="38818" b="32756"/>
                     <a:stretch>
                       <a:fillRect/>
                     </a:stretch>
                   </pic:blipFill>
-                  <pic:spPr bwMode="auto">
+                  <pic:spPr>
                     <a:xfrm>
                       <a:off x="0" y="0"/>
-                      <a:ext cx="3615055" cy="2336800"/>
+                      <a:ext cx="6120765" cy="3070860"/>
                     </a:xfrm>
                     <a:prstGeom prst="rect">
                       <a:avLst/>
                     </a:prstGeom>
-                    <a:noFill/>
-                    <a:ln>
-                      <a:noFill/>
-                    </a:ln>
                   </pic:spPr>
                 </pic:pic>
               </a:graphicData>
             </a:graphic>
-          </wp:inline>
+          </wp:anchor>
         </w:drawing>
       </w:r>
     </w:p>
     <w:p>
       <w:pPr>
-        <w:pStyle w:val="tabel"/>
+        <w:rPr>
+          <w:lang w:val="en-GB"/>
+        </w:rPr>
+      </w:pPr>
+    </w:p>
+    <w:p>
+      <w:pPr>
         <w:tabs>
-          <w:tab w:val="left" w:pos="567"/>
+          <w:tab w:val="left" w:pos="3047"/>
         </w:tabs>
-        <w:rPr>
-          <w:smallCaps w:val="0"/>
-          <w:lang w:val="en-GB"/>
-        </w:rPr>
-      </w:pPr>
-      <w:r>
-        <w:rPr>
-          <w:smallCaps w:val="0"/>
-          <w:lang w:val="en-GB"/>
-        </w:rPr>
-        <w:t>Figure</w:t>
-      </w:r>
-      <w:r>
-        <w:rPr>
-          <w:smallCaps w:val="0"/>
-          <w:lang w:val="en-GB"/>
-        </w:rPr>
-        <w:t xml:space="preserve"> 1 – </w:t>
-      </w:r>
-      <w:r>
-        <w:rPr>
-          <w:smallCaps w:val="0"/>
-          <w:lang w:val="en-GB"/>
-        </w:rPr>
-        <w:t>Example of a figure</w:t>
-      </w:r>
-      <w:r>
-        <w:rPr>
-          <w:smallCaps w:val="0"/>
-          <w:lang w:val="en-GB"/>
-        </w:rPr>
-        <w:t xml:space="preserve"> (</w:t>
-      </w:r>
-      <w:r>
-        <w:rPr>
-          <w:smallCaps w:val="0"/>
-          <w:lang w:val="en-GB"/>
-        </w:rPr>
-        <w:t>source</w:t>
-      </w:r>
-      <w:r>
-        <w:rPr>
-          <w:smallCaps w:val="0"/>
-          <w:lang w:val="en-GB"/>
-        </w:rPr>
-        <w:t xml:space="preserve">: </w:t>
-      </w:r>
-      <w:r>
-        <w:rPr>
-          <w:smallCaps w:val="0"/>
-          <w:lang w:val="en-GB"/>
-        </w:rPr>
-        <w:t>The Scientific Bulletin of the UPT – series Building Engineering – Architecture</w:t>
-      </w:r>
-      <w:r>
-        <w:rPr>
-          <w:smallCaps w:val="0"/>
-          <w:lang w:val="en-GB"/>
-        </w:rPr>
-        <w:t>,</w:t>
-      </w:r>
-      <w:r>
-        <w:rPr>
-          <w:smallCaps w:val="0"/>
-          <w:lang w:val="en-GB"/>
-        </w:rPr>
-        <w:t xml:space="preserve"> issue 2/2010</w:t>
-      </w:r>
-      <w:r>
-        <w:rPr>
-          <w:smallCaps w:val="0"/>
-          <w:lang w:val="en-GB"/>
-        </w:rPr>
-        <w:t>)</w:t>
-      </w:r>
-    </w:p>
-    <w:p>
-      <w:pPr>
-        <w:pStyle w:val="tabel"/>
-        <w:tabs>
-          <w:tab w:val="left" w:pos="567"/>
-        </w:tabs>
+        <w:jc w:val="center"/>
+        <w:rPr>
+          <w:lang w:val="en-GB"/>
+        </w:rPr>
+      </w:pPr>
+      <w:r>
+        <w:rPr>
+          <w:lang w:val="en-GB"/>
+        </w:rPr>
+        <w:t>Figure 4.6.1 – Showcase of Firepoint importance</w:t>
+      </w:r>
+      <w:r>
+        <w:rPr>
+          <w:lang w:val="en-GB"/>
+        </w:rPr>
+        <w:t xml:space="preserve"> </w:t>
+      </w:r>
+      <w:r>
+        <w:rPr>
+          <w:lang w:val="en-GB"/>
+        </w:rPr>
+        <w:t>(source: screenshot)</w:t>
+      </w:r>
+    </w:p>
+    <w:p>
+      <w:pPr>
+        <w:rPr>
+          <w:lang w:val="en-GB"/>
+        </w:rPr>
+      </w:pPr>
+    </w:p>
+    <w:p>
+      <w:pPr>
+        <w:rPr>
+          <w:lang w:val="en-GB"/>
+        </w:rPr>
+      </w:pPr>
+    </w:p>
+    <w:p>
+      <w:pPr>
+        <w:rPr>
+          <w:lang w:val="en-GB"/>
+        </w:rPr>
+      </w:pPr>
+    </w:p>
+    <w:p>
+      <w:pPr>
+        <w:rPr>
+          <w:lang w:val="en-GB"/>
+        </w:rPr>
+      </w:pPr>
+    </w:p>
+    <w:p>
+      <w:pPr>
+        <w:rPr>
+          <w:lang w:val="en-GB"/>
+        </w:rPr>
+      </w:pPr>
+    </w:p>
+    <w:p>
+      <w:pPr>
+        <w:rPr>
+          <w:lang w:val="en-GB"/>
+        </w:rPr>
+      </w:pPr>
+    </w:p>
+    <w:p>
+      <w:pPr>
+        <w:rPr>
+          <w:lang w:val="en-GB"/>
+        </w:rPr>
+      </w:pPr>
+    </w:p>
+    <w:p>
+      <w:pPr>
+        <w:rPr>
+          <w:lang w:val="en-GB"/>
+        </w:rPr>
+      </w:pPr>
+    </w:p>
+    <w:p>
+      <w:pPr>
+        <w:rPr>
+          <w:lang w:val="en-GB"/>
+        </w:rPr>
+      </w:pPr>
+    </w:p>
+    <w:p>
+      <w:pPr>
+        <w:rPr>
+          <w:lang w:val="en-GB"/>
+        </w:rPr>
+      </w:pPr>
+    </w:p>
+    <w:p>
+      <w:pPr>
         <w:ind w:firstLine="0"/>
-        <w:jc w:val="both"/>
-        <w:rPr>
-          <w:smallCaps w:val="0"/>
-          <w:lang w:val="en-GB"/>
-        </w:rPr>
-      </w:pPr>
-    </w:p>
-    <w:p>
-      <w:pPr>
-        <w:pStyle w:val="Heading2"/>
-        <w:keepNext w:val="0"/>
+        <w:rPr>
+          <w:lang w:val="en-GB"/>
+        </w:rPr>
+      </w:pPr>
+    </w:p>
+    <w:p>
+      <w:pPr>
+        <w:rPr>
+          <w:lang w:val="en-GB"/>
+        </w:rPr>
+      </w:pPr>
+    </w:p>
+    <w:p>
+      <w:pPr>
+        <w:pStyle w:val="Heading1"/>
         <w:numPr>
-          <w:ilvl w:val="1"/>
+          <w:ilvl w:val="0"/>
           <w:numId w:val="1"/>
         </w:numPr>
-        <w:spacing w:before="240"/>
-        <w:ind w:firstLine="0"/>
-        <w:rPr>
-          <w:lang w:val="en-GB"/>
-        </w:rPr>
-      </w:pPr>
-      <w:r>
-        <w:rPr>
-          <w:lang w:val="en-GB"/>
-        </w:rPr>
-        <w:t>TABLE</w:t>
-      </w:r>
-      <w:r>
-        <w:rPr>
-          <w:lang w:val="en-GB"/>
-        </w:rPr>
-        <w:t>S</w:t>
-      </w:r>
-      <w:r>
-        <w:rPr>
-          <w:lang w:val="en-GB"/>
-        </w:rPr>
-        <w:t xml:space="preserve"> (12 pt, Bold, Uppercase, Left)</w:t>
-      </w:r>
-    </w:p>
-    <w:p>
-      <w:pPr>
-        <w:spacing w:before="240"/>
-        <w:rPr>
-          <w:rFonts w:cs="Arial"/>
-          <w:lang w:val="en-GB"/>
-        </w:rPr>
-      </w:pPr>
-      <w:r>
-        <w:rPr>
-          <w:rFonts w:cs="Arial"/>
-          <w:lang w:val="en-GB"/>
-        </w:rPr>
-        <w:t>Tables will be numbered in the order in which they appear in the paper. Alternatively, tables can be numbered in order in each chapter, including the chapter number in the numbering. Each table has a number and a title, which is mentioned above the table, in a centered alignment. Where applicable, the data source shall be indicated in brackets after the title of the table.</w:t>
-      </w:r>
-    </w:p>
-    <w:p>
-      <w:pPr>
-        <w:spacing w:before="240"/>
-        <w:rPr>
-          <w:lang w:val="en-GB"/>
-        </w:rPr>
-      </w:pPr>
-      <w:r>
-        <w:rPr>
-          <w:lang w:val="en-GB"/>
-        </w:rPr>
-        <w:t>All tables presented in the paper must be referenced in the text of the paper, must be numbered and accompanied by a title (see example below). If copied figures are used, the source of the photo will be indicated in parenthesis. As far as possible, the usual font (Arial 12 pt) will be kept in the table, but there are also accepted ways to highlight important results (Bold, Italics, etc.)</w:t>
-      </w:r>
-    </w:p>
-    <w:p>
-      <w:pPr>
-        <w:spacing w:after="240"/>
-        <w:rPr>
-          <w:lang w:val="en-GB"/>
-        </w:rPr>
-      </w:pPr>
-      <w:r>
-        <w:rPr>
-          <w:lang w:val="en-GB"/>
-        </w:rPr>
-        <w:lastRenderedPageBreak/>
-        <w:t xml:space="preserve">A blank line (Arial 12 pt) will be left between the text and the table. Tables will be centered. </w:t>
-      </w:r>
-    </w:p>
-    <w:p>
-      <w:pPr>
-        <w:spacing w:after="240"/>
-        <w:rPr>
-          <w:lang w:val="en-GB"/>
-        </w:rPr>
-      </w:pPr>
-    </w:p>
-    <w:p>
-      <w:pPr>
-        <w:spacing w:after="240"/>
-        <w:rPr>
-          <w:lang w:val="en-GB"/>
-        </w:rPr>
-      </w:pPr>
-    </w:p>
-    <w:p>
-      <w:pPr>
-        <w:spacing w:after="240"/>
-        <w:rPr>
-          <w:lang w:val="en-GB"/>
-        </w:rPr>
-      </w:pPr>
-    </w:p>
-    <w:p>
-      <w:pPr>
-        <w:jc w:val="center"/>
-        <w:rPr>
-          <w:lang w:val="en-GB"/>
-        </w:rPr>
-      </w:pPr>
-      <w:r>
-        <w:rPr>
-          <w:lang w:val="en-GB"/>
-        </w:rPr>
-        <w:t>Tab</w:t>
-      </w:r>
-      <w:r>
-        <w:rPr>
-          <w:lang w:val="en-GB"/>
-        </w:rPr>
-        <w:t>le</w:t>
-      </w:r>
-      <w:r>
-        <w:rPr>
-          <w:lang w:val="en-GB"/>
-        </w:rPr>
-        <w:t xml:space="preserve"> </w:t>
-      </w:r>
-      <w:r>
-        <w:rPr>
-          <w:lang w:val="en-GB"/>
-        </w:rPr>
-        <w:t>g</w:t>
-      </w:r>
-      <w:r>
-        <w:rPr>
-          <w:lang w:val="en-GB"/>
-        </w:rPr>
-        <w:t xml:space="preserve">. </w:t>
-      </w:r>
-      <w:r>
-        <w:rPr>
-          <w:lang w:val="en-GB"/>
-        </w:rPr>
-        <w:t>Example of a table</w:t>
-      </w:r>
-    </w:p>
-    <w:p>
-      <w:pPr>
-        <w:jc w:val="center"/>
-        <w:rPr>
-          <w:lang w:val="en-GB"/>
-        </w:rPr>
-      </w:pPr>
-    </w:p>
-    <w:tbl>
-      <w:tblPr>
-        <w:tblW w:w="0" w:type="auto"/>
-        <w:jc w:val="center"/>
-        <w:tblBorders>
-          <w:top w:val="single" w:sz="4" w:space="0" w:color="auto"/>
-          <w:left w:val="single" w:sz="4" w:space="0" w:color="auto"/>
-          <w:bottom w:val="single" w:sz="4" w:space="0" w:color="auto"/>
-          <w:right w:val="single" w:sz="4" w:space="0" w:color="auto"/>
-          <w:insideH w:val="single" w:sz="4" w:space="0" w:color="auto"/>
-          <w:insideV w:val="single" w:sz="4" w:space="0" w:color="auto"/>
-        </w:tblBorders>
-        <w:tblLayout w:type="fixed"/>
-        <w:tblLook w:val="0000" w:firstRow="0" w:lastRow="0" w:firstColumn="0" w:lastColumn="0" w:noHBand="0" w:noVBand="0"/>
-      </w:tblPr>
-      <w:tblGrid>
-        <w:gridCol w:w="1701"/>
-        <w:gridCol w:w="1594"/>
-        <w:gridCol w:w="1595"/>
-        <w:gridCol w:w="1595"/>
-        <w:gridCol w:w="1595"/>
-      </w:tblGrid>
-      <w:tr>
-        <w:trPr>
-          <w:cantSplit/>
-          <w:jc w:val="center"/>
-        </w:trPr>
-        <w:tc>
-          <w:tcPr>
-            <w:tcW w:w="1701" w:type="dxa"/>
-          </w:tcPr>
-          <w:p>
-            <w:pPr>
-              <w:pStyle w:val="tabel"/>
-              <w:ind w:firstLine="0"/>
-              <w:jc w:val="both"/>
-              <w:rPr>
-                <w:smallCaps w:val="0"/>
-                <w:szCs w:val="24"/>
-                <w:lang w:val="en-GB" w:eastAsia="en-GB"/>
-              </w:rPr>
-            </w:pPr>
-          </w:p>
-        </w:tc>
-        <w:tc>
-          <w:tcPr>
-            <w:tcW w:w="3189" w:type="dxa"/>
-            <w:gridSpan w:val="2"/>
-          </w:tcPr>
-          <w:p>
-            <w:pPr>
-              <w:pStyle w:val="tabel"/>
-              <w:ind w:firstLine="0"/>
-              <w:rPr>
-                <w:smallCaps w:val="0"/>
-                <w:szCs w:val="24"/>
-                <w:lang w:val="en-GB" w:eastAsia="en-GB"/>
-              </w:rPr>
-            </w:pPr>
-            <w:r>
-              <w:rPr>
-                <w:smallCaps w:val="0"/>
-                <w:szCs w:val="24"/>
-                <w:lang w:val="en-GB" w:eastAsia="en-GB"/>
-              </w:rPr>
-              <w:t>Yield stress, fy [N/mm2]</w:t>
-            </w:r>
-          </w:p>
-        </w:tc>
-        <w:tc>
-          <w:tcPr>
-            <w:tcW w:w="3190" w:type="dxa"/>
-            <w:gridSpan w:val="2"/>
-          </w:tcPr>
-          <w:p>
-            <w:pPr>
-              <w:pStyle w:val="tabel"/>
-              <w:ind w:firstLine="0"/>
-              <w:rPr>
-                <w:smallCaps w:val="0"/>
-                <w:szCs w:val="24"/>
-                <w:lang w:val="en-GB" w:eastAsia="en-GB"/>
-              </w:rPr>
-            </w:pPr>
-            <w:r>
-              <w:rPr>
-                <w:smallCaps w:val="0"/>
-                <w:szCs w:val="24"/>
-                <w:lang w:val="en-GB" w:eastAsia="en-GB"/>
-              </w:rPr>
-              <w:t>Tensile strength, fu [N/mm2]</w:t>
-            </w:r>
-          </w:p>
-        </w:tc>
-      </w:tr>
-      <w:tr>
-        <w:trPr>
-          <w:jc w:val="center"/>
-        </w:trPr>
-        <w:tc>
-          <w:tcPr>
-            <w:tcW w:w="1701" w:type="dxa"/>
-          </w:tcPr>
-          <w:p>
-            <w:pPr>
-              <w:pStyle w:val="tabel"/>
-              <w:ind w:firstLine="0"/>
-              <w:rPr>
-                <w:smallCaps w:val="0"/>
-                <w:szCs w:val="24"/>
-                <w:lang w:val="en-GB" w:eastAsia="en-GB"/>
-              </w:rPr>
-            </w:pPr>
-            <w:r>
-              <w:rPr>
-                <w:smallCaps w:val="0"/>
-                <w:szCs w:val="24"/>
-                <w:lang w:val="en-GB" w:eastAsia="en-GB"/>
-              </w:rPr>
-              <w:t>Element</w:t>
-            </w:r>
-          </w:p>
-        </w:tc>
-        <w:tc>
-          <w:tcPr>
-            <w:tcW w:w="1594" w:type="dxa"/>
-          </w:tcPr>
-          <w:p>
-            <w:pPr>
-              <w:pStyle w:val="tabel"/>
-              <w:ind w:firstLine="0"/>
-              <w:rPr>
-                <w:smallCaps w:val="0"/>
-                <w:szCs w:val="24"/>
-                <w:lang w:val="en-GB" w:eastAsia="en-GB"/>
-              </w:rPr>
-            </w:pPr>
-            <w:r>
-              <w:rPr>
-                <w:smallCaps w:val="0"/>
-                <w:szCs w:val="24"/>
-                <w:lang w:val="en-GB" w:eastAsia="en-GB"/>
-              </w:rPr>
-              <w:t>Mill certificate</w:t>
-            </w:r>
-          </w:p>
-        </w:tc>
-        <w:tc>
-          <w:tcPr>
-            <w:tcW w:w="1595" w:type="dxa"/>
-          </w:tcPr>
-          <w:p>
-            <w:pPr>
-              <w:pStyle w:val="tabel"/>
-              <w:ind w:firstLine="0"/>
-              <w:rPr>
-                <w:smallCaps w:val="0"/>
-                <w:szCs w:val="24"/>
-                <w:lang w:val="en-GB" w:eastAsia="en-GB"/>
-              </w:rPr>
-            </w:pPr>
-            <w:r>
-              <w:rPr>
-                <w:smallCaps w:val="0"/>
-                <w:szCs w:val="24"/>
-                <w:lang w:val="en-GB" w:eastAsia="en-GB"/>
-              </w:rPr>
-              <w:t>Coupon tests</w:t>
-            </w:r>
-          </w:p>
-        </w:tc>
-        <w:tc>
-          <w:tcPr>
-            <w:tcW w:w="1595" w:type="dxa"/>
-          </w:tcPr>
-          <w:p>
-            <w:pPr>
-              <w:pStyle w:val="tabel"/>
-              <w:ind w:firstLine="0"/>
-              <w:rPr>
-                <w:smallCaps w:val="0"/>
-                <w:szCs w:val="24"/>
-                <w:lang w:val="en-GB" w:eastAsia="en-GB"/>
-              </w:rPr>
-            </w:pPr>
-            <w:r>
-              <w:rPr>
-                <w:smallCaps w:val="0"/>
-                <w:szCs w:val="24"/>
-                <w:lang w:val="en-GB" w:eastAsia="en-GB"/>
-              </w:rPr>
-              <w:t>Mill certificate</w:t>
-            </w:r>
-          </w:p>
-        </w:tc>
-        <w:tc>
-          <w:tcPr>
-            <w:tcW w:w="1595" w:type="dxa"/>
-          </w:tcPr>
-          <w:p>
-            <w:pPr>
-              <w:pStyle w:val="tabel"/>
-              <w:ind w:firstLine="0"/>
-              <w:rPr>
-                <w:smallCaps w:val="0"/>
-                <w:szCs w:val="24"/>
-                <w:lang w:val="en-GB" w:eastAsia="en-GB"/>
-              </w:rPr>
-            </w:pPr>
-            <w:r>
-              <w:rPr>
-                <w:smallCaps w:val="0"/>
-                <w:szCs w:val="24"/>
-                <w:lang w:val="en-GB" w:eastAsia="en-GB"/>
-              </w:rPr>
-              <w:t>Coupon tests</w:t>
-            </w:r>
-          </w:p>
-        </w:tc>
-      </w:tr>
-      <w:tr>
-        <w:trPr>
-          <w:cantSplit/>
-          <w:jc w:val="center"/>
-        </w:trPr>
-        <w:tc>
-          <w:tcPr>
-            <w:tcW w:w="1701" w:type="dxa"/>
-          </w:tcPr>
-          <w:p>
-            <w:pPr>
-              <w:pStyle w:val="tabel"/>
-              <w:ind w:firstLine="0"/>
-              <w:rPr>
-                <w:smallCaps w:val="0"/>
-                <w:szCs w:val="24"/>
-                <w:lang w:val="en-GB" w:eastAsia="en-GB"/>
-              </w:rPr>
-            </w:pPr>
-            <w:r>
-              <w:rPr>
-                <w:smallCaps w:val="0"/>
-                <w:szCs w:val="24"/>
-                <w:lang w:val="en-GB" w:eastAsia="en-GB"/>
-              </w:rPr>
-              <w:t>Beam IPE360</w:t>
-            </w:r>
-          </w:p>
-        </w:tc>
-        <w:tc>
-          <w:tcPr>
-            <w:tcW w:w="1594" w:type="dxa"/>
-          </w:tcPr>
-          <w:p>
-            <w:pPr>
-              <w:pStyle w:val="tabel"/>
-              <w:ind w:firstLine="0"/>
-              <w:rPr>
-                <w:smallCaps w:val="0"/>
-                <w:szCs w:val="24"/>
-                <w:lang w:val="en-GB" w:eastAsia="en-GB"/>
-              </w:rPr>
-            </w:pPr>
-            <w:r>
-              <w:rPr>
-                <w:smallCaps w:val="0"/>
-                <w:szCs w:val="24"/>
-                <w:lang w:val="en-GB" w:eastAsia="en-GB"/>
-              </w:rPr>
-              <w:t>285.0</w:t>
-            </w:r>
-          </w:p>
-        </w:tc>
-        <w:tc>
-          <w:tcPr>
-            <w:tcW w:w="1595" w:type="dxa"/>
-          </w:tcPr>
-          <w:p>
-            <w:pPr>
-              <w:pStyle w:val="tabel"/>
-              <w:ind w:firstLine="0"/>
-              <w:rPr>
-                <w:smallCaps w:val="0"/>
-                <w:szCs w:val="24"/>
-                <w:lang w:val="en-GB" w:eastAsia="en-GB"/>
-              </w:rPr>
-            </w:pPr>
-            <w:r>
-              <w:rPr>
-                <w:smallCaps w:val="0"/>
-                <w:szCs w:val="24"/>
-                <w:lang w:val="en-GB" w:eastAsia="en-GB"/>
-              </w:rPr>
-              <w:t>329.8 flange</w:t>
-            </w:r>
-          </w:p>
-          <w:p>
-            <w:pPr>
-              <w:pStyle w:val="tabel"/>
-              <w:ind w:firstLine="0"/>
-              <w:rPr>
-                <w:smallCaps w:val="0"/>
-                <w:szCs w:val="24"/>
-                <w:lang w:val="en-GB" w:eastAsia="en-GB"/>
-              </w:rPr>
-            </w:pPr>
-            <w:r>
-              <w:rPr>
-                <w:smallCaps w:val="0"/>
-                <w:szCs w:val="24"/>
-                <w:lang w:val="en-GB" w:eastAsia="en-GB"/>
-              </w:rPr>
-              <w:t>348.4 web</w:t>
-            </w:r>
-          </w:p>
-        </w:tc>
-        <w:tc>
-          <w:tcPr>
-            <w:tcW w:w="1595" w:type="dxa"/>
-          </w:tcPr>
-          <w:p>
-            <w:pPr>
-              <w:pStyle w:val="tabel"/>
-              <w:ind w:firstLine="0"/>
-              <w:rPr>
-                <w:smallCaps w:val="0"/>
-                <w:szCs w:val="24"/>
-                <w:lang w:val="en-GB" w:eastAsia="en-GB"/>
-              </w:rPr>
-            </w:pPr>
-            <w:r>
-              <w:rPr>
-                <w:smallCaps w:val="0"/>
-                <w:szCs w:val="24"/>
-                <w:lang w:val="en-GB" w:eastAsia="en-GB"/>
-              </w:rPr>
-              <w:t>427.0</w:t>
-            </w:r>
-          </w:p>
-        </w:tc>
-        <w:tc>
-          <w:tcPr>
-            <w:tcW w:w="1595" w:type="dxa"/>
-          </w:tcPr>
-          <w:p>
-            <w:pPr>
-              <w:pStyle w:val="tabel"/>
-              <w:ind w:firstLine="0"/>
-              <w:rPr>
-                <w:smallCaps w:val="0"/>
-                <w:szCs w:val="24"/>
-                <w:lang w:val="en-GB" w:eastAsia="en-GB"/>
-              </w:rPr>
-            </w:pPr>
-            <w:r>
-              <w:rPr>
-                <w:smallCaps w:val="0"/>
-                <w:szCs w:val="24"/>
-                <w:lang w:val="en-GB" w:eastAsia="en-GB"/>
-              </w:rPr>
-              <w:t>463.2 flange</w:t>
-            </w:r>
-          </w:p>
-          <w:p>
-            <w:pPr>
-              <w:pStyle w:val="tabel"/>
-              <w:ind w:firstLine="0"/>
-              <w:rPr>
-                <w:smallCaps w:val="0"/>
-                <w:szCs w:val="24"/>
-                <w:lang w:val="en-GB" w:eastAsia="en-GB"/>
-              </w:rPr>
-            </w:pPr>
-            <w:r>
-              <w:rPr>
-                <w:smallCaps w:val="0"/>
-                <w:szCs w:val="24"/>
-                <w:lang w:val="en-GB" w:eastAsia="en-GB"/>
-              </w:rPr>
-              <w:t>464.0 web</w:t>
-            </w:r>
-          </w:p>
-        </w:tc>
-      </w:tr>
-      <w:tr>
-        <w:trPr>
-          <w:cantSplit/>
-          <w:jc w:val="center"/>
-        </w:trPr>
-        <w:tc>
-          <w:tcPr>
-            <w:tcW w:w="1701" w:type="dxa"/>
-          </w:tcPr>
-          <w:p>
-            <w:pPr>
-              <w:pStyle w:val="tabel"/>
-              <w:ind w:firstLine="0"/>
-              <w:jc w:val="both"/>
-              <w:rPr>
-                <w:smallCaps w:val="0"/>
-                <w:szCs w:val="24"/>
-                <w:lang w:val="en-GB" w:eastAsia="en-GB"/>
-              </w:rPr>
-            </w:pPr>
-            <w:r>
-              <w:rPr>
-                <w:smallCaps w:val="0"/>
-                <w:szCs w:val="24"/>
-                <w:lang w:val="en-GB" w:eastAsia="en-GB"/>
-              </w:rPr>
-              <w:t>Column HEB300</w:t>
-            </w:r>
-          </w:p>
-        </w:tc>
-        <w:tc>
-          <w:tcPr>
-            <w:tcW w:w="1594" w:type="dxa"/>
-          </w:tcPr>
-          <w:p>
-            <w:pPr>
-              <w:pStyle w:val="tabel"/>
-              <w:ind w:firstLine="0"/>
-              <w:rPr>
-                <w:smallCaps w:val="0"/>
-                <w:szCs w:val="24"/>
-                <w:lang w:val="en-GB" w:eastAsia="en-GB"/>
-              </w:rPr>
-            </w:pPr>
-            <w:r>
-              <w:rPr>
-                <w:smallCaps w:val="0"/>
-                <w:szCs w:val="24"/>
-                <w:lang w:val="en-GB" w:eastAsia="en-GB"/>
-              </w:rPr>
-              <w:t>311.3</w:t>
-            </w:r>
-          </w:p>
-        </w:tc>
-        <w:tc>
-          <w:tcPr>
-            <w:tcW w:w="1595" w:type="dxa"/>
-          </w:tcPr>
-          <w:p>
-            <w:pPr>
-              <w:pStyle w:val="tabel"/>
-              <w:ind w:firstLine="0"/>
-              <w:rPr>
-                <w:smallCaps w:val="0"/>
-                <w:szCs w:val="24"/>
-                <w:lang w:val="en-GB" w:eastAsia="en-GB"/>
-              </w:rPr>
-            </w:pPr>
-            <w:r>
-              <w:rPr>
-                <w:smallCaps w:val="0"/>
-                <w:szCs w:val="24"/>
-                <w:lang w:val="en-GB" w:eastAsia="en-GB"/>
-              </w:rPr>
-              <w:t>313.0 flange</w:t>
-            </w:r>
-          </w:p>
-          <w:p>
-            <w:pPr>
-              <w:pStyle w:val="tabel"/>
-              <w:ind w:firstLine="0"/>
-              <w:rPr>
-                <w:smallCaps w:val="0"/>
-                <w:szCs w:val="24"/>
-                <w:lang w:val="en-GB" w:eastAsia="en-GB"/>
-              </w:rPr>
-            </w:pPr>
-            <w:r>
-              <w:rPr>
-                <w:smallCaps w:val="0"/>
-                <w:szCs w:val="24"/>
-                <w:lang w:val="en-GB" w:eastAsia="en-GB"/>
-              </w:rPr>
-              <w:t>341.8 web</w:t>
-            </w:r>
-          </w:p>
-        </w:tc>
-        <w:tc>
-          <w:tcPr>
-            <w:tcW w:w="1595" w:type="dxa"/>
-          </w:tcPr>
-          <w:p>
-            <w:pPr>
-              <w:pStyle w:val="tabel"/>
-              <w:ind w:firstLine="0"/>
-              <w:rPr>
-                <w:smallCaps w:val="0"/>
-                <w:szCs w:val="24"/>
-                <w:lang w:val="en-GB" w:eastAsia="en-GB"/>
-              </w:rPr>
-            </w:pPr>
-            <w:r>
-              <w:rPr>
-                <w:smallCaps w:val="0"/>
-                <w:szCs w:val="24"/>
-                <w:lang w:val="en-GB" w:eastAsia="en-GB"/>
-              </w:rPr>
-              <w:t>446.0</w:t>
-            </w:r>
-          </w:p>
-        </w:tc>
-        <w:tc>
-          <w:tcPr>
-            <w:tcW w:w="1595" w:type="dxa"/>
-          </w:tcPr>
-          <w:p>
-            <w:pPr>
-              <w:pStyle w:val="tabel"/>
-              <w:ind w:firstLine="0"/>
-              <w:rPr>
-                <w:smallCaps w:val="0"/>
-                <w:szCs w:val="24"/>
-                <w:lang w:val="en-GB" w:eastAsia="en-GB"/>
-              </w:rPr>
-            </w:pPr>
-            <w:r>
-              <w:rPr>
-                <w:smallCaps w:val="0"/>
-                <w:szCs w:val="24"/>
-                <w:lang w:val="en-GB" w:eastAsia="en-GB"/>
-              </w:rPr>
-              <w:t>449.8 flange</w:t>
-            </w:r>
-          </w:p>
-          <w:p>
-            <w:pPr>
-              <w:pStyle w:val="tabel"/>
-              <w:ind w:firstLine="0"/>
-              <w:rPr>
-                <w:smallCaps w:val="0"/>
-                <w:szCs w:val="24"/>
-                <w:lang w:val="en-GB" w:eastAsia="en-GB"/>
-              </w:rPr>
-            </w:pPr>
-            <w:r>
-              <w:rPr>
-                <w:smallCaps w:val="0"/>
-                <w:szCs w:val="24"/>
-                <w:lang w:val="en-GB" w:eastAsia="en-GB"/>
-              </w:rPr>
-              <w:t>464.4 web</w:t>
-            </w:r>
-          </w:p>
-        </w:tc>
-      </w:tr>
-      <w:tr>
-        <w:trPr>
-          <w:jc w:val="center"/>
-        </w:trPr>
-        <w:tc>
-          <w:tcPr>
-            <w:tcW w:w="1701" w:type="dxa"/>
-          </w:tcPr>
-          <w:p>
-            <w:pPr>
-              <w:pStyle w:val="tabel"/>
-              <w:ind w:firstLine="0"/>
-              <w:jc w:val="both"/>
-              <w:rPr>
-                <w:smallCaps w:val="0"/>
-                <w:szCs w:val="24"/>
-                <w:lang w:val="en-GB" w:eastAsia="en-GB"/>
-              </w:rPr>
-            </w:pPr>
-            <w:r>
-              <w:rPr>
-                <w:smallCaps w:val="0"/>
-                <w:szCs w:val="24"/>
-                <w:lang w:val="en-GB" w:eastAsia="en-GB"/>
-              </w:rPr>
-              <w:t>End plate</w:t>
-            </w:r>
-          </w:p>
-        </w:tc>
-        <w:tc>
-          <w:tcPr>
-            <w:tcW w:w="1594" w:type="dxa"/>
-          </w:tcPr>
-          <w:p>
-            <w:pPr>
-              <w:pStyle w:val="tabel"/>
-              <w:ind w:firstLine="0"/>
-              <w:rPr>
-                <w:smallCaps w:val="0"/>
-                <w:szCs w:val="24"/>
-                <w:lang w:val="en-GB" w:eastAsia="en-GB"/>
-              </w:rPr>
-            </w:pPr>
-            <w:r>
-              <w:rPr>
-                <w:smallCaps w:val="0"/>
-                <w:szCs w:val="24"/>
-                <w:lang w:val="en-GB" w:eastAsia="en-GB"/>
-              </w:rPr>
-              <w:t>281.0</w:t>
-            </w:r>
-          </w:p>
-        </w:tc>
-        <w:tc>
-          <w:tcPr>
-            <w:tcW w:w="1595" w:type="dxa"/>
-          </w:tcPr>
-          <w:p>
-            <w:pPr>
-              <w:pStyle w:val="tabel"/>
-              <w:ind w:firstLine="0"/>
-              <w:rPr>
-                <w:smallCaps w:val="0"/>
-                <w:szCs w:val="24"/>
-                <w:lang w:val="en-GB" w:eastAsia="en-GB"/>
-              </w:rPr>
-            </w:pPr>
-            <w:r>
-              <w:rPr>
-                <w:smallCaps w:val="0"/>
-                <w:szCs w:val="24"/>
-                <w:lang w:val="en-GB" w:eastAsia="en-GB"/>
-              </w:rPr>
-              <w:t>248.3</w:t>
-            </w:r>
-          </w:p>
-        </w:tc>
-        <w:tc>
-          <w:tcPr>
-            <w:tcW w:w="1595" w:type="dxa"/>
-          </w:tcPr>
-          <w:p>
-            <w:pPr>
-              <w:pStyle w:val="tabel"/>
-              <w:ind w:firstLine="0"/>
-              <w:rPr>
-                <w:smallCaps w:val="0"/>
-                <w:szCs w:val="24"/>
-                <w:lang w:val="en-GB" w:eastAsia="en-GB"/>
-              </w:rPr>
-            </w:pPr>
-            <w:r>
-              <w:rPr>
-                <w:smallCaps w:val="0"/>
-                <w:szCs w:val="24"/>
-                <w:lang w:val="en-GB" w:eastAsia="en-GB"/>
-              </w:rPr>
-              <w:t>424.7</w:t>
-            </w:r>
-          </w:p>
-        </w:tc>
-        <w:tc>
-          <w:tcPr>
-            <w:tcW w:w="1595" w:type="dxa"/>
-          </w:tcPr>
-          <w:p>
-            <w:pPr>
-              <w:pStyle w:val="tabel"/>
-              <w:ind w:firstLine="0"/>
-              <w:rPr>
-                <w:smallCaps w:val="0"/>
-                <w:szCs w:val="24"/>
-                <w:lang w:val="en-GB" w:eastAsia="en-GB"/>
-              </w:rPr>
-            </w:pPr>
-            <w:r>
-              <w:rPr>
-                <w:smallCaps w:val="0"/>
-                <w:szCs w:val="24"/>
-                <w:lang w:val="en-GB" w:eastAsia="en-GB"/>
-              </w:rPr>
-              <w:t>416.0</w:t>
-            </w:r>
-          </w:p>
-        </w:tc>
-      </w:tr>
-      <w:tr>
-        <w:trPr>
-          <w:jc w:val="center"/>
-        </w:trPr>
-        <w:tc>
-          <w:tcPr>
-            <w:tcW w:w="1701" w:type="dxa"/>
-          </w:tcPr>
-          <w:p>
-            <w:pPr>
-              <w:pStyle w:val="tabel"/>
-              <w:ind w:firstLine="0"/>
-              <w:jc w:val="both"/>
-              <w:rPr>
-                <w:smallCaps w:val="0"/>
-                <w:szCs w:val="24"/>
-                <w:lang w:val="en-GB" w:eastAsia="en-GB"/>
-              </w:rPr>
-            </w:pPr>
-            <w:r>
-              <w:rPr>
-                <w:smallCaps w:val="0"/>
-                <w:szCs w:val="24"/>
-                <w:lang w:val="en-GB" w:eastAsia="en-GB"/>
-              </w:rPr>
-              <w:t>Cover plate</w:t>
-            </w:r>
-          </w:p>
-        </w:tc>
-        <w:tc>
-          <w:tcPr>
-            <w:tcW w:w="1594" w:type="dxa"/>
-          </w:tcPr>
-          <w:p>
-            <w:pPr>
-              <w:pStyle w:val="tabel"/>
-              <w:ind w:firstLine="0"/>
-              <w:rPr>
-                <w:smallCaps w:val="0"/>
-                <w:szCs w:val="24"/>
-                <w:lang w:val="en-GB" w:eastAsia="en-GB"/>
-              </w:rPr>
-            </w:pPr>
-            <w:r>
-              <w:rPr>
-                <w:smallCaps w:val="0"/>
-                <w:szCs w:val="24"/>
-                <w:lang w:val="en-GB" w:eastAsia="en-GB"/>
-              </w:rPr>
-              <w:t>296.0</w:t>
-            </w:r>
-          </w:p>
-        </w:tc>
-        <w:tc>
-          <w:tcPr>
-            <w:tcW w:w="1595" w:type="dxa"/>
-          </w:tcPr>
-          <w:p>
-            <w:pPr>
-              <w:pStyle w:val="tabel"/>
-              <w:ind w:firstLine="0"/>
-              <w:rPr>
-                <w:smallCaps w:val="0"/>
-                <w:szCs w:val="24"/>
-                <w:lang w:val="en-GB" w:eastAsia="en-GB"/>
-              </w:rPr>
-            </w:pPr>
-            <w:r>
-              <w:rPr>
-                <w:smallCaps w:val="0"/>
-                <w:szCs w:val="24"/>
-                <w:lang w:val="en-GB" w:eastAsia="en-GB"/>
-              </w:rPr>
-              <w:t>273.2</w:t>
-            </w:r>
-          </w:p>
-        </w:tc>
-        <w:tc>
-          <w:tcPr>
-            <w:tcW w:w="1595" w:type="dxa"/>
-          </w:tcPr>
-          <w:p>
-            <w:pPr>
-              <w:pStyle w:val="tabel"/>
-              <w:ind w:firstLine="0"/>
-              <w:rPr>
-                <w:smallCaps w:val="0"/>
-                <w:szCs w:val="24"/>
-                <w:lang w:val="en-GB" w:eastAsia="en-GB"/>
-              </w:rPr>
-            </w:pPr>
-            <w:r>
-              <w:rPr>
-                <w:smallCaps w:val="0"/>
-                <w:szCs w:val="24"/>
-                <w:lang w:val="en-GB" w:eastAsia="en-GB"/>
-              </w:rPr>
-              <w:t>443.0</w:t>
-            </w:r>
-          </w:p>
-        </w:tc>
-        <w:tc>
-          <w:tcPr>
-            <w:tcW w:w="1595" w:type="dxa"/>
-          </w:tcPr>
-          <w:p>
-            <w:pPr>
-              <w:pStyle w:val="tabel"/>
-              <w:ind w:firstLine="0"/>
-              <w:rPr>
-                <w:smallCaps w:val="0"/>
-                <w:szCs w:val="24"/>
-                <w:lang w:val="en-GB" w:eastAsia="en-GB"/>
-              </w:rPr>
-            </w:pPr>
-            <w:r>
-              <w:rPr>
-                <w:smallCaps w:val="0"/>
-                <w:szCs w:val="24"/>
-                <w:lang w:val="en-GB" w:eastAsia="en-GB"/>
-              </w:rPr>
-              <w:t>436.7</w:t>
-            </w:r>
-          </w:p>
-        </w:tc>
-      </w:tr>
-    </w:tbl>
+        <w:rPr>
+          <w:lang w:val="en-GB"/>
+        </w:rPr>
+      </w:pPr>
+      <w:r>
+        <w:rPr>
+          <w:lang w:val="en-GB"/>
+        </w:rPr>
+        <w:t>Implementation Analysis</w:t>
+      </w:r>
+    </w:p>
+    <w:p>
+      <w:pPr>
+        <w:rPr>
+          <w:lang w:val="en-GB"/>
+        </w:rPr>
+      </w:pPr>
+    </w:p>
     <w:p>
       <w:pPr>
         <w:pStyle w:val="Heading2"/>
-        <w:keepNext w:val="0"/>
-        <w:numPr>
-          <w:ilvl w:val="1"/>
-          <w:numId w:val="1"/>
-        </w:numPr>
-        <w:spacing w:before="240"/>
-        <w:ind w:firstLine="0"/>
-        <w:rPr>
-          <w:lang w:val="en-GB"/>
-        </w:rPr>
-      </w:pPr>
-      <w:r>
-        <w:rPr>
-          <w:lang w:val="en-GB"/>
-        </w:rPr>
-        <w:t xml:space="preserve"> FORMUL</w:t>
-      </w:r>
-      <w:r>
-        <w:rPr>
-          <w:lang w:val="en-GB"/>
-        </w:rPr>
-        <w:t>AS</w:t>
-      </w:r>
-      <w:r>
-        <w:rPr>
-          <w:lang w:val="en-GB"/>
-        </w:rPr>
-        <w:t xml:space="preserve"> (12 pt, Bold, Uppercase, Left)</w:t>
-      </w:r>
-    </w:p>
-    <w:p>
-      <w:pPr>
-        <w:rPr>
-          <w:rFonts w:cs="Arial"/>
-          <w:lang w:val="en-GB"/>
-        </w:rPr>
-      </w:pPr>
-    </w:p>
-    <w:p>
-      <w:pPr>
-        <w:rPr>
-          <w:rFonts w:cs="Arial"/>
-          <w:lang w:val="en-GB"/>
-        </w:rPr>
-      </w:pPr>
-      <w:r>
-        <w:rPr>
-          <w:rFonts w:cs="Arial"/>
-          <w:lang w:val="en-GB"/>
-        </w:rPr>
-        <w:t>Formulas used in the text will be numbered in order of appearance in the paper. Alternatively, formulas can be numbered in order in each chapter, including the chapter number. The numbering of formulas is done in round brackets. A blank line (arial 12 pt) will be left between the text and the formula. Formulas will be aligned to the right.</w:t>
-      </w:r>
-    </w:p>
-    <w:p>
-      <w:pPr>
-        <w:rPr>
-          <w:rFonts w:cs="Arial"/>
-          <w:lang w:val="en-GB"/>
-        </w:rPr>
-      </w:pPr>
-    </w:p>
-    <w:p>
-      <w:pPr>
-        <w:ind w:left="851"/>
-        <w:jc w:val="right"/>
-        <w:rPr>
-          <w:rFonts w:cs="Arial"/>
-          <w:lang w:val="en-GB"/>
-        </w:rPr>
-      </w:pPr>
-      <m:oMath>
-        <m:r>
-          <w:rPr>
-            <w:rFonts w:ascii="Cambria Math" w:hAnsi="Cambria Math" w:cs="Arial"/>
-            <w:lang w:val="en-GB"/>
-          </w:rPr>
-          <m:t>A=π</m:t>
-        </m:r>
-        <m:sSup>
-          <m:sSupPr>
-            <m:ctrlPr>
-              <w:rPr>
-                <w:rFonts w:ascii="Cambria Math" w:hAnsi="Cambria Math" w:cs="Arial"/>
-                <w:lang w:val="en-GB"/>
-              </w:rPr>
-            </m:ctrlPr>
-          </m:sSupPr>
-          <m:e>
-            <m:r>
-              <w:rPr>
-                <w:rFonts w:ascii="Cambria Math" w:hAnsi="Cambria Math" w:cs="Arial"/>
-                <w:lang w:val="en-GB"/>
-              </w:rPr>
-              <m:t>r</m:t>
-            </m:r>
-          </m:e>
-          <m:sup>
-            <m:r>
-              <w:rPr>
-                <w:rFonts w:ascii="Cambria Math" w:hAnsi="Cambria Math" w:cs="Arial"/>
-                <w:lang w:val="en-GB"/>
-              </w:rPr>
-              <m:t>2</m:t>
-            </m:r>
-          </m:sup>
-        </m:sSup>
-      </m:oMath>
-      <w:r>
-        <w:rPr>
-          <w:rFonts w:cs="Arial"/>
-          <w:lang w:val="en-GB"/>
-        </w:rPr>
-        <w:tab/>
-      </w:r>
-      <w:r>
-        <w:rPr>
-          <w:rFonts w:cs="Arial"/>
-          <w:lang w:val="en-GB"/>
-        </w:rPr>
-        <w:tab/>
-      </w:r>
-      <w:r>
-        <w:rPr>
-          <w:rFonts w:cs="Arial"/>
-          <w:lang w:val="en-GB"/>
-        </w:rPr>
-        <w:tab/>
-      </w:r>
-      <w:r>
-        <w:rPr>
-          <w:rFonts w:cs="Arial"/>
-          <w:lang w:val="en-GB"/>
-        </w:rPr>
-        <w:tab/>
-      </w:r>
-      <w:r>
-        <w:rPr>
-          <w:rFonts w:cs="Arial"/>
-          <w:lang w:val="en-GB"/>
-        </w:rPr>
-        <w:tab/>
-      </w:r>
-      <w:r>
-        <w:rPr>
-          <w:rFonts w:cs="Arial"/>
-          <w:lang w:val="en-GB"/>
-        </w:rPr>
-        <w:tab/>
-      </w:r>
-      <w:r>
-        <w:rPr>
-          <w:rFonts w:cs="Arial"/>
-          <w:lang w:val="en-GB"/>
-        </w:rPr>
-        <w:t>(1)</w:t>
-      </w:r>
-    </w:p>
-    <w:p>
-      <w:pPr>
-        <w:rPr>
-          <w:rFonts w:cs="Arial"/>
-          <w:lang w:val="en-GB"/>
-        </w:rPr>
-      </w:pPr>
-    </w:p>
-    <w:p>
-      <w:pPr>
-        <w:pStyle w:val="Heading1"/>
         <w:numPr>
           <w:ilvl w:val="0"/>
           <w:numId w:val="0"/>
         </w:numPr>
-        <w:ind w:left="1571"/>
-        <w:jc w:val="both"/>
-        <w:rPr>
-          <w:lang w:val="en-GB"/>
-        </w:rPr>
-      </w:pPr>
-      <w:r>
-        <w:rPr>
-          <w:lang w:val="en-GB"/>
-        </w:rPr>
-        <w:t>CONCLU</w:t>
-      </w:r>
-      <w:r>
-        <w:rPr>
-          <w:lang w:val="en-GB"/>
-        </w:rPr>
-        <w:t>SIONS</w:t>
-      </w:r>
-      <w:r>
-        <w:rPr>
-          <w:lang w:val="en-GB"/>
-        </w:rPr>
-        <w:t xml:space="preserve"> (14 pt, Bold, Uppercase, Center)</w:t>
-      </w:r>
-    </w:p>
-    <w:p>
-      <w:pPr>
-        <w:rPr>
-          <w:lang w:val="en-GB"/>
-        </w:rPr>
-      </w:pPr>
-    </w:p>
-    <w:p>
-      <w:pPr>
-        <w:rPr>
-          <w:lang w:val="en-GB"/>
-        </w:rPr>
-      </w:pPr>
-      <w:r>
-        <w:rPr>
-          <w:lang w:val="en-GB"/>
-        </w:rPr>
-        <w:t>The paper will end with a chapter of conclusions. It will contain the main results of the work and their practical implications. In the case of diploma projects, the main synthetic data obtained from the design process will be mentioned.</w:t>
-      </w:r>
-    </w:p>
-    <w:p>
-      <w:pPr>
-        <w:pStyle w:val="Heading1"/>
-        <w:numPr>
-          <w:ilvl w:val="0"/>
-          <w:numId w:val="0"/>
-        </w:numPr>
-        <w:ind w:left="1211"/>
-        <w:rPr>
-          <w:lang w:val="en-GB"/>
-        </w:rPr>
-      </w:pPr>
-      <w:r>
-        <w:rPr>
-          <w:lang w:val="en-GB"/>
-        </w:rPr>
-        <w:t>BIBLIOGRAFIE</w:t>
-      </w:r>
-    </w:p>
-    <w:p>
-      <w:pPr>
-        <w:rPr>
-          <w:lang w:val="en-GB"/>
-        </w:rPr>
-      </w:pPr>
-      <w:r>
-        <w:rPr>
-          <w:lang w:val="en-GB"/>
-        </w:rPr>
-        <w:t>At the end of the paper will be given a list of references for the scientific texts consulted during the work. All sources will be listed, including those on the internet. These will be referenced in the text and listed in alphabetical order, as in the examples below.</w:t>
-      </w:r>
-    </w:p>
-    <w:p>
-      <w:pPr>
-        <w:spacing w:line="240" w:lineRule="auto"/>
-        <w:rPr>
-          <w:rFonts w:cs="Arial"/>
-          <w:color w:val="000000"/>
-          <w:lang w:val="en-GB" w:eastAsia="ro-RO"/>
-        </w:rPr>
-      </w:pPr>
-      <w:r>
-        <w:rPr>
-          <w:rFonts w:cs="Arial"/>
-          <w:color w:val="000000"/>
-          <w:lang w:val="en-GB" w:eastAsia="ro-RO"/>
-        </w:rPr>
-        <w:lastRenderedPageBreak/>
-        <w:t xml:space="preserve">Bibliography should include all literature titles that have served as a basis for documentation, i.e. authors who have been quoted in the text, in all chapters of the thesis paper. </w:t>
-      </w:r>
-    </w:p>
-    <w:p>
-      <w:pPr>
-        <w:spacing w:line="240" w:lineRule="auto"/>
-        <w:rPr>
-          <w:rFonts w:cs="Arial"/>
-          <w:color w:val="000000"/>
-          <w:lang w:val="en-GB" w:eastAsia="ro-RO"/>
-        </w:rPr>
-      </w:pPr>
-      <w:r>
-        <w:rPr>
-          <w:rFonts w:cs="Arial"/>
-          <w:color w:val="000000"/>
-          <w:lang w:val="en-GB" w:eastAsia="ro-RO"/>
-        </w:rPr>
-        <w:t xml:space="preserve">The Faculty of Automation and Computers requires the use of the IEEE citation style (details </w:t>
-      </w:r>
-      <w:hyperlink r:id="rId22" w:history="1">
-        <w:r>
-          <w:rPr>
-            <w:rStyle w:val="Hyperlink"/>
-          </w:rPr>
-          <w:t>IEEE Citation Guidelines2.doc (ieee-dataport.org)</w:t>
-        </w:r>
-      </w:hyperlink>
-      <w:r>
-        <w:rPr>
-          <w:rFonts w:cs="Arial"/>
-          <w:color w:val="000000"/>
-          <w:lang w:val="en-GB" w:eastAsia="ro-RO"/>
-        </w:rPr>
-        <w:t>), used primarily in scientific publications in the field of IT. The three important parts of the reference are:</w:t>
-      </w:r>
-    </w:p>
-    <w:p>
-      <w:pPr>
-        <w:spacing w:line="240" w:lineRule="auto"/>
-        <w:ind w:left="1418" w:hanging="567"/>
-        <w:rPr>
-          <w:rFonts w:cs="Arial"/>
-          <w:color w:val="000000"/>
-          <w:lang w:val="en-GB" w:eastAsia="ro-RO"/>
-        </w:rPr>
-      </w:pPr>
-      <w:r>
-        <w:rPr>
-          <w:rFonts w:cs="Arial"/>
-          <w:color w:val="000000"/>
-          <w:lang w:val="en-GB" w:eastAsia="ro-RO"/>
-        </w:rPr>
-        <w:t>• The name of the author indicated as the first initial of the first name, then the full name.</w:t>
-      </w:r>
-    </w:p>
-    <w:p>
-      <w:pPr>
-        <w:spacing w:line="240" w:lineRule="auto"/>
-        <w:rPr>
-          <w:rFonts w:cs="Arial"/>
-          <w:color w:val="000000"/>
-          <w:lang w:val="en-GB" w:eastAsia="ro-RO"/>
-        </w:rPr>
-      </w:pPr>
-      <w:r>
-        <w:rPr>
-          <w:rFonts w:cs="Arial"/>
-          <w:color w:val="000000"/>
-          <w:lang w:val="en-GB" w:eastAsia="ro-RO"/>
-        </w:rPr>
-        <w:t>• The title of the article, the patent, the conference paper, etc., in quotation marks.</w:t>
-      </w:r>
-    </w:p>
-    <w:p>
-      <w:pPr>
-        <w:spacing w:line="240" w:lineRule="auto"/>
-        <w:rPr>
-          <w:rFonts w:cs="Arial"/>
-          <w:color w:val="000000"/>
-          <w:lang w:val="en-GB" w:eastAsia="ro-RO"/>
-        </w:rPr>
-      </w:pPr>
-      <w:r>
-        <w:rPr>
-          <w:rFonts w:cs="Arial"/>
-          <w:color w:val="000000"/>
-          <w:lang w:val="en-GB" w:eastAsia="ro-RO"/>
-        </w:rPr>
-        <w:t>• The title of the magazine or book in italics</w:t>
-      </w:r>
-    </w:p>
-    <w:p>
-      <w:pPr>
-        <w:spacing w:line="240" w:lineRule="auto"/>
-        <w:rPr>
-          <w:rFonts w:cs="Arial"/>
-          <w:color w:val="000000"/>
-          <w:lang w:val="en-GB" w:eastAsia="ro-RO"/>
-        </w:rPr>
-      </w:pPr>
-      <w:r>
-        <w:rPr>
-          <w:rFonts w:cs="Arial"/>
-          <w:color w:val="000000"/>
-          <w:lang w:val="en-GB" w:eastAsia="ro-RO"/>
-        </w:rPr>
-        <w:t>How the reference is written depends on the type of publication, please follow the instructions at the link above carefully.</w:t>
-      </w:r>
-    </w:p>
-    <w:p>
-      <w:pPr>
-        <w:spacing w:line="240" w:lineRule="auto"/>
-        <w:rPr>
-          <w:rFonts w:cs="Arial"/>
-          <w:color w:val="000000"/>
-          <w:lang w:val="en-GB" w:eastAsia="ro-RO"/>
-        </w:rPr>
-      </w:pPr>
-      <w:r>
-        <w:rPr>
-          <w:rFonts w:cs="Arial"/>
-          <w:color w:val="000000"/>
-          <w:lang w:val="en-GB" w:eastAsia="ro-RO"/>
-        </w:rPr>
-        <w:t>Each citation should be noted in the text using simple sequential numbers. A number in square brackets, placed in the text of the report, indicates the specific reference. Citations are numbered in the order in which they appear. Once a source has been cited, the same number is used in all subsequent references in the text. No distinction is made between electronic and printed sources, except for the details of the cited references.</w:t>
-      </w:r>
-    </w:p>
-    <w:p>
-      <w:pPr>
-        <w:spacing w:line="240" w:lineRule="auto"/>
-        <w:rPr>
-          <w:rFonts w:cs="Arial"/>
-          <w:color w:val="000000"/>
-          <w:lang w:val="en-GB" w:eastAsia="ro-RO"/>
-        </w:rPr>
-      </w:pPr>
-      <w:r>
-        <w:rPr>
-          <w:rFonts w:cs="Arial"/>
-          <w:color w:val="000000"/>
-          <w:lang w:val="en-GB" w:eastAsia="ro-RO"/>
-        </w:rPr>
-        <w:t>Each reference number must be enclosed in square brackets on the same line as the text, before any punctuation mark, with a space before the parentheses.</w:t>
-      </w:r>
-    </w:p>
-    <w:p>
-      <w:pPr>
-        <w:spacing w:line="240" w:lineRule="auto"/>
-        <w:rPr>
-          <w:rFonts w:cs="Arial"/>
-          <w:color w:val="000000"/>
-          <w:lang w:val="en-GB" w:eastAsia="ro-RO"/>
-        </w:rPr>
-      </w:pPr>
-      <w:r>
-        <w:rPr>
-          <w:rFonts w:cs="Arial"/>
-          <w:color w:val="000000"/>
-          <w:lang w:val="en-GB" w:eastAsia="ro-RO"/>
-        </w:rPr>
-        <w:t>Examples</w:t>
-      </w:r>
-    </w:p>
-    <w:p>
-      <w:pPr>
-        <w:spacing w:line="240" w:lineRule="auto"/>
-        <w:rPr>
-          <w:rFonts w:cs="Arial"/>
-          <w:color w:val="000000"/>
-          <w:lang w:val="en-GB" w:eastAsia="ro-RO"/>
-        </w:rPr>
-      </w:pPr>
-      <w:r>
-        <w:rPr>
-          <w:rFonts w:cs="Arial"/>
-          <w:color w:val="000000"/>
-          <w:lang w:val="en-GB" w:eastAsia="ro-RO"/>
-        </w:rPr>
-        <w:t>„. . .the end of my research [13]. ”</w:t>
-      </w:r>
-    </w:p>
-    <w:p>
-      <w:pPr>
-        <w:spacing w:line="240" w:lineRule="auto"/>
-        <w:rPr>
-          <w:rFonts w:cs="Arial"/>
-          <w:color w:val="000000"/>
-          <w:lang w:val="en-GB" w:eastAsia="ro-RO"/>
-        </w:rPr>
-      </w:pPr>
-      <w:r>
-        <w:rPr>
-          <w:rFonts w:cs="Arial"/>
-          <w:color w:val="000000"/>
-          <w:lang w:val="en-GB" w:eastAsia="ro-RO"/>
-        </w:rPr>
-        <w:t>"The theory was first introduced in 1987 [1].</w:t>
-      </w:r>
-    </w:p>
-    <w:p>
-      <w:pPr>
-        <w:spacing w:line="240" w:lineRule="auto"/>
-        <w:rPr>
-          <w:rFonts w:cs="Arial"/>
-          <w:color w:val="000000"/>
-          <w:lang w:val="en-GB" w:eastAsia="ro-RO"/>
-        </w:rPr>
-      </w:pPr>
-      <w:r>
-        <w:rPr>
-          <w:rFonts w:cs="Arial"/>
-          <w:color w:val="000000"/>
-          <w:lang w:val="en-GB" w:eastAsia="ro-RO"/>
-        </w:rPr>
-        <w:t>The list of references in the bibliography is composed of all the sources used to document the paper and is made in the numerical order of the citation in the text and not in alphabetical order of the authors.</w:t>
-      </w:r>
-    </w:p>
-    <w:p>
-      <w:pPr>
-        <w:spacing w:line="240" w:lineRule="auto"/>
-        <w:rPr>
-          <w:rFonts w:cs="Arial"/>
-          <w:color w:val="000000"/>
-          <w:lang w:val="en-GB" w:eastAsia="ro-RO"/>
-        </w:rPr>
-      </w:pPr>
-      <w:r>
-        <w:rPr>
-          <w:rFonts w:cs="Arial"/>
-          <w:color w:val="000000"/>
-          <w:lang w:val="en-GB" w:eastAsia="ro-RO"/>
-        </w:rPr>
-        <w:t>The identical insertion of a sentence or paragraph shall be made by including the page from the source used, but also by quotation marks and the use of Italics; for sources taken from the Internet, the page addresses shall be included; in the final bibliographic list the works shall be entered in the alphabetical order of the authors' names. For collective works, the rule of alphabetical order applies to the first author.</w:t>
-      </w:r>
-    </w:p>
-    <w:p>
-      <w:pPr>
-        <w:spacing w:line="240" w:lineRule="auto"/>
-        <w:rPr>
-          <w:rFonts w:cs="Arial"/>
-          <w:color w:val="000000"/>
-          <w:lang w:val="en-GB" w:eastAsia="ro-RO"/>
-        </w:rPr>
-      </w:pPr>
-      <w:r>
-        <w:rPr>
-          <w:rFonts w:cs="Arial"/>
-          <w:color w:val="000000"/>
-          <w:lang w:val="en-GB" w:eastAsia="ro-RO"/>
-        </w:rPr>
-        <w:t>If websites, magazines or articles are quoted, three asterisks will appear before, and then information on the volume, the issue, the pages consulted, the exact website address of the article, the date of the site visit and the date of downloading, as well as the date of the accessing. Web page addresses will be entered at the end of the list.</w:t>
-      </w:r>
-    </w:p>
-    <w:p>
-      <w:pPr>
-        <w:spacing w:line="240" w:lineRule="auto"/>
-        <w:rPr>
-          <w:rFonts w:cs="Arial"/>
-          <w:color w:val="000000"/>
-          <w:lang w:val="en-GB" w:eastAsia="ro-RO"/>
-        </w:rPr>
-      </w:pPr>
-      <w:r>
-        <w:rPr>
-          <w:rFonts w:cs="Arial"/>
-          <w:color w:val="000000"/>
-          <w:lang w:val="en-GB" w:eastAsia="ro-RO"/>
-        </w:rPr>
-        <w:t>The bibliographical sources the author of which cannot be mentioned should be specified as "***" followed by the name of the article and/or book, the publishing house and the place of appearance (for books), the volume, the issue, the first and last page of the quoted work, and the year of appearance.</w:t>
-      </w:r>
-    </w:p>
-    <w:p>
-      <w:pPr>
-        <w:spacing w:line="240" w:lineRule="auto"/>
-        <w:rPr>
-          <w:rFonts w:cs="Arial"/>
-          <w:color w:val="000000"/>
-          <w:lang w:val="en-GB" w:eastAsia="ro-RO"/>
-        </w:rPr>
-      </w:pPr>
-    </w:p>
-    <w:p>
-      <w:pPr>
-        <w:pStyle w:val="NoSpacing"/>
-        <w:ind w:firstLine="0"/>
-        <w:rPr>
-          <w:lang w:val="en-GB"/>
-        </w:rPr>
-      </w:pPr>
-      <w:r>
-        <w:rPr>
-          <w:lang w:val="en-GB"/>
-        </w:rPr>
-        <w:t xml:space="preserve">*** https://ro.wikipedia.org/wiki/Motor_cu_reac%C8%9Bie </w:t>
-      </w:r>
-      <w:r>
-        <w:rPr>
-          <w:lang w:val="en-GB"/>
-        </w:rPr>
-        <w:t>accessed</w:t>
+        <w:rPr>
+          <w:lang w:val="en-GB"/>
+        </w:rPr>
+      </w:pPr>
+      <w:r>
+        <w:rPr>
+          <w:lang w:val="en-GB"/>
+        </w:rPr>
+        <w:t>5.1</w:t>
       </w:r>
       <w:r>
         <w:rPr>
@@ -7778,99 +6232,20 @@
         <w:rPr>
           <w:lang w:val="en-GB"/>
         </w:rPr>
-        <w:t>F</w:t>
-      </w:r>
-      <w:r>
-        <w:rPr>
-          <w:lang w:val="en-GB"/>
-        </w:rPr>
-        <w:t>ebruar</w:t>
-      </w:r>
-      <w:r>
-        <w:rPr>
-          <w:lang w:val="en-GB"/>
-        </w:rPr>
-        <w:t>y</w:t>
-      </w:r>
-      <w:r>
-        <w:rPr>
-          <w:lang w:val="en-GB"/>
-        </w:rPr>
-        <w:t xml:space="preserve"> 2022)</w:t>
-      </w:r>
-    </w:p>
-    <w:p>
-      <w:pPr>
-        <w:pStyle w:val="NoSpacing"/>
-        <w:rPr>
-          <w:lang w:val="en-GB"/>
-        </w:rPr>
-      </w:pPr>
-    </w:p>
-    <w:p>
-      <w:pPr>
-        <w:spacing w:line="240" w:lineRule="auto"/>
-        <w:ind w:firstLine="0"/>
-        <w:jc w:val="left"/>
-        <w:rPr>
-          <w:lang w:val="en-GB"/>
-        </w:rPr>
-      </w:pPr>
-      <w:r>
-        <w:rPr>
-          <w:lang w:val="en-GB"/>
-        </w:rPr>
-        <w:br w:type="page"/>
-      </w:r>
-    </w:p>
-    <w:p>
-      <w:pPr>
-        <w:rPr>
-          <w:lang w:val="en-GB"/>
-        </w:rPr>
-      </w:pPr>
-      <w:r>
-        <w:rPr>
-          <w:lang w:val="en-GB"/>
-        </w:rPr>
-        <w:lastRenderedPageBreak/>
-        <w:t>The last page of the thesis paper shall contain the „Statement regarding the authenticity of the thesis paper”, in handwriting, filled in according to the UPT’s requirements. The Statement shall be downloaded from the web, at:</w:t>
-      </w:r>
-    </w:p>
-    <w:p>
-      <w:pPr>
-        <w:rPr>
-          <w:lang w:val="en-GB"/>
-        </w:rPr>
-      </w:pPr>
-      <w:hyperlink r:id="rId23" w:history="1">
-        <w:r>
-          <w:rPr>
-            <w:rStyle w:val="Hyperlink"/>
-            <w:lang w:val="en-GB"/>
-          </w:rPr>
-          <w:t>http://www.upt.ro/img/files/Regulamente_UPT/2020/Declaratie_de_autenticitate_UPT_2020.doc</w:t>
-        </w:r>
-      </w:hyperlink>
-      <w:r>
-        <w:rPr>
-          <w:lang w:val="en-GB"/>
-        </w:rPr>
-        <w:t>;</w:t>
-      </w:r>
-    </w:p>
-    <w:p>
-      <w:pPr>
-        <w:rPr>
-          <w:strike/>
+        <w:t>Code Implementation Analysis</w:t>
+      </w:r>
+    </w:p>
+    <w:p>
+      <w:pPr>
+        <w:rPr>
           <w:lang w:val="en-GB"/>
         </w:rPr>
       </w:pPr>
     </w:p>
     <w:sectPr>
-      <w:headerReference w:type="default" r:id="rId24"/>
-      <w:footerReference w:type="default" r:id="rId25"/>
-      <w:headerReference w:type="first" r:id="rId26"/>
+      <w:headerReference w:type="default" r:id="rId27"/>
+      <w:footerReference w:type="default" r:id="rId28"/>
+      <w:headerReference w:type="first" r:id="rId29"/>
       <w:pgSz w:w="11907" w:h="16840" w:code="9"/>
       <w:pgMar w:top="709" w:right="1134" w:bottom="1134" w:left="1134" w:header="709" w:footer="709" w:gutter="0"/>
       <w:pgNumType w:start="1"/>

</xml_diff>

<commit_message>
Fix collider for spikehead
</commit_message>
<xml_diff>
--- a/DocumentationBachelor/Bachelor_Documentation_Eduard_Iorga.docx
+++ b/DocumentationBachelor/Bachelor_Documentation_Eduard_Iorga.docx
@@ -156,13 +156,10 @@
           <w:szCs w:val="28"/>
           <w:lang w:val="en-GB"/>
         </w:rPr>
-        <w:t xml:space="preserve"> Eduard Iorga</w:t>
-      </w:r>
-    </w:p>
-    <w:p>
-      <w:pPr>
-        <w:spacing w:before="280"/>
-        <w:ind w:right="-709"/>
+        <w:t xml:space="preserve"> Eduard </w:t>
+      </w:r>
+      <w:proofErr w:type="spellStart"/>
+      <w:r>
         <w:rPr>
           <w:rFonts w:cs="Arial"/>
           <w:b/>
@@ -170,8 +167,14 @@
           <w:szCs w:val="28"/>
           <w:lang w:val="en-GB"/>
         </w:rPr>
-      </w:pPr>
-      <w:r>
+        <w:t>Iorga</w:t>
+      </w:r>
+      <w:proofErr w:type="spellEnd"/>
+    </w:p>
+    <w:p>
+      <w:pPr>
+        <w:spacing w:before="280"/>
+        <w:ind w:right="-709"/>
         <w:rPr>
           <w:rFonts w:cs="Arial"/>
           <w:b/>
@@ -179,8 +182,7 @@
           <w:szCs w:val="28"/>
           <w:lang w:val="en-GB"/>
         </w:rPr>
-        <w:t>Scientific coordinator</w:t>
-      </w:r>
+      </w:pPr>
       <w:r>
         <w:rPr>
           <w:rFonts w:cs="Arial"/>
@@ -189,7 +191,7 @@
           <w:szCs w:val="28"/>
           <w:lang w:val="en-GB"/>
         </w:rPr>
-        <w:t xml:space="preserve">: </w:t>
+        <w:t>Scientific coordinator</w:t>
       </w:r>
       <w:r>
         <w:rPr>
@@ -199,7 +201,61 @@
           <w:szCs w:val="28"/>
           <w:lang w:val="en-GB"/>
         </w:rPr>
-        <w:t xml:space="preserve">Assistant Professor Alexandru Grosu </w:t>
+        <w:t xml:space="preserve">: </w:t>
+      </w:r>
+      <w:r>
+        <w:rPr>
+          <w:rFonts w:cs="Arial"/>
+          <w:b/>
+          <w:sz w:val="28"/>
+          <w:szCs w:val="28"/>
+          <w:lang w:val="en-GB"/>
+        </w:rPr>
+        <w:t xml:space="preserve">Assistant Professor </w:t>
+      </w:r>
+      <w:proofErr w:type="spellStart"/>
+      <w:r>
+        <w:rPr>
+          <w:rFonts w:cs="Arial"/>
+          <w:b/>
+          <w:sz w:val="28"/>
+          <w:szCs w:val="28"/>
+          <w:lang w:val="en-GB"/>
+        </w:rPr>
+        <w:t>Alexandru</w:t>
+      </w:r>
+      <w:proofErr w:type="spellEnd"/>
+      <w:r>
+        <w:rPr>
+          <w:rFonts w:cs="Arial"/>
+          <w:b/>
+          <w:sz w:val="28"/>
+          <w:szCs w:val="28"/>
+          <w:lang w:val="en-GB"/>
+        </w:rPr>
+        <w:t xml:space="preserve"> </w:t>
+      </w:r>
+      <w:proofErr w:type="spellStart"/>
+      <w:r>
+        <w:rPr>
+          <w:rFonts w:cs="Arial"/>
+          <w:b/>
+          <w:sz w:val="28"/>
+          <w:szCs w:val="28"/>
+          <w:lang w:val="en-GB"/>
+        </w:rPr>
+        <w:t>Grosu</w:t>
+      </w:r>
+      <w:proofErr w:type="spellEnd"/>
+      <w:r>
+        <w:rPr>
+          <w:rFonts w:cs="Arial"/>
+          <w:b/>
+          <w:sz w:val="28"/>
+          <w:szCs w:val="28"/>
+          <w:lang w:val="en-GB"/>
+        </w:rPr>
+        <w:t xml:space="preserve"> </w:t>
       </w:r>
     </w:p>
     <w:p>
@@ -315,12 +371,14 @@
         </w:rPr>
         <w:t xml:space="preserve">Sword of Time </w:t>
       </w:r>
+      <w:proofErr w:type="spellStart"/>
       <w:r>
         <w:rPr>
           <w:lang w:val="en-GB"/>
         </w:rPr>
         <w:t>este</w:t>
       </w:r>
+      <w:proofErr w:type="spellEnd"/>
       <w:r>
         <w:rPr>
           <w:lang w:val="en-GB"/>
@@ -331,7 +389,21 @@
         <w:rPr>
           <w:lang w:val="en-GB"/>
         </w:rPr>
-        <w:t>un joc video</w:t>
+        <w:t xml:space="preserve">un </w:t>
+      </w:r>
+      <w:proofErr w:type="spellStart"/>
+      <w:r>
+        <w:rPr>
+          <w:lang w:val="en-GB"/>
+        </w:rPr>
+        <w:t>joc</w:t>
+      </w:r>
+      <w:proofErr w:type="spellEnd"/>
+      <w:r>
+        <w:rPr>
+          <w:lang w:val="en-GB"/>
+        </w:rPr>
+        <w:t xml:space="preserve"> video</w:t>
       </w:r>
       <w:r>
         <w:rPr>
@@ -339,11 +411,68 @@
         </w:rPr>
         <w:t xml:space="preserve"> 2D platformer rogue-like </w:t>
       </w:r>
-      <w:r>
-        <w:rPr>
-          <w:lang w:val="en-GB"/>
-        </w:rPr>
-        <w:t>realizat ca parte a lucrarii mele de licen</w:t>
+      <w:proofErr w:type="spellStart"/>
+      <w:r>
+        <w:rPr>
+          <w:lang w:val="en-GB"/>
+        </w:rPr>
+        <w:t>realizat</w:t>
+      </w:r>
+      <w:proofErr w:type="spellEnd"/>
+      <w:r>
+        <w:rPr>
+          <w:lang w:val="en-GB"/>
+        </w:rPr>
+        <w:t xml:space="preserve"> ca </w:t>
+      </w:r>
+      <w:proofErr w:type="spellStart"/>
+      <w:r>
+        <w:rPr>
+          <w:lang w:val="en-GB"/>
+        </w:rPr>
+        <w:t>parte</w:t>
+      </w:r>
+      <w:proofErr w:type="spellEnd"/>
+      <w:r>
+        <w:rPr>
+          <w:lang w:val="en-GB"/>
+        </w:rPr>
+        <w:t xml:space="preserve"> a </w:t>
+      </w:r>
+      <w:proofErr w:type="spellStart"/>
+      <w:r>
+        <w:rPr>
+          <w:lang w:val="en-GB"/>
+        </w:rPr>
+        <w:t>lucrarii</w:t>
+      </w:r>
+      <w:proofErr w:type="spellEnd"/>
+      <w:r>
+        <w:rPr>
+          <w:lang w:val="en-GB"/>
+        </w:rPr>
+        <w:t xml:space="preserve"> </w:t>
+      </w:r>
+      <w:proofErr w:type="spellStart"/>
+      <w:r>
+        <w:rPr>
+          <w:lang w:val="en-GB"/>
+        </w:rPr>
+        <w:t>mele</w:t>
+      </w:r>
+      <w:proofErr w:type="spellEnd"/>
+      <w:r>
+        <w:rPr>
+          <w:lang w:val="en-GB"/>
+        </w:rPr>
+        <w:t xml:space="preserve"> de </w:t>
+      </w:r>
+      <w:proofErr w:type="spellStart"/>
+      <w:r>
+        <w:rPr>
+          <w:lang w:val="en-GB"/>
+        </w:rPr>
+        <w:t>licen</w:t>
       </w:r>
       <w:r>
         <w:rPr>
@@ -355,7 +484,21 @@
         <w:rPr>
           <w:lang w:val="en-GB"/>
         </w:rPr>
-        <w:t>a, explor</w:t>
+        <w:t>a</w:t>
+      </w:r>
+      <w:proofErr w:type="spellEnd"/>
+      <w:r>
+        <w:rPr>
+          <w:lang w:val="en-GB"/>
+        </w:rPr>
+        <w:t xml:space="preserve">, </w:t>
+      </w:r>
+      <w:proofErr w:type="spellStart"/>
+      <w:r>
+        <w:rPr>
+          <w:lang w:val="en-GB"/>
+        </w:rPr>
+        <w:t>explor</w:t>
       </w:r>
       <w:r>
         <w:rPr>
@@ -367,8 +510,30 @@
         <w:rPr>
           <w:lang w:val="en-GB"/>
         </w:rPr>
-        <w:t xml:space="preserve">nd mecanici de gameplay </w:t>
-      </w:r>
+        <w:t>nd</w:t>
+      </w:r>
+      <w:proofErr w:type="spellEnd"/>
+      <w:r>
+        <w:rPr>
+          <w:lang w:val="en-GB"/>
+        </w:rPr>
+        <w:t xml:space="preserve"> </w:t>
+      </w:r>
+      <w:proofErr w:type="spellStart"/>
+      <w:r>
+        <w:rPr>
+          <w:lang w:val="en-GB"/>
+        </w:rPr>
+        <w:t>mecanici</w:t>
+      </w:r>
+      <w:proofErr w:type="spellEnd"/>
+      <w:r>
+        <w:rPr>
+          <w:lang w:val="en-GB"/>
+        </w:rPr>
+        <w:t xml:space="preserve"> de gameplay </w:t>
+      </w:r>
+      <w:proofErr w:type="spellStart"/>
       <w:r>
         <w:rPr>
           <w:lang w:val="en-GB"/>
@@ -379,7 +544,28 @@
         <w:rPr>
           <w:lang w:val="en-GB"/>
         </w:rPr>
-        <w:t>i design-ul sistemelor.</w:t>
+        <w:t>i</w:t>
+      </w:r>
+      <w:proofErr w:type="spellEnd"/>
+      <w:r>
+        <w:rPr>
+          <w:lang w:val="en-GB"/>
+        </w:rPr>
+        <w:t xml:space="preserve"> design-ul </w:t>
+      </w:r>
+      <w:proofErr w:type="spellStart"/>
+      <w:r>
+        <w:rPr>
+          <w:lang w:val="en-GB"/>
+        </w:rPr>
+        <w:t>sistemelor</w:t>
+      </w:r>
+      <w:proofErr w:type="spellEnd"/>
+      <w:r>
+        <w:rPr>
+          <w:lang w:val="en-GB"/>
+        </w:rPr>
+        <w:t>.</w:t>
       </w:r>
       <w:r>
         <w:rPr>
@@ -387,11 +573,593 @@
         </w:rPr>
         <w:t xml:space="preserve"> </w:t>
       </w:r>
-      <w:r>
-        <w:rPr>
-          <w:lang w:val="en-GB"/>
-        </w:rPr>
-        <w:t>Principalul obiectiv al acestei lucrări a fost crearea unui joc dinamic și generat procedural care prezintă o provocare pentru jucători prin mecanici legate de manipularea timpului și a formei jucătorului precum și generarea aleatorie de niveluri. Toate aceste elemente îl provoacă pe jucător să gândească atât creativ cât și strategic pentru a completa obiectivul jocului.</w:t>
+      <w:proofErr w:type="spellStart"/>
+      <w:r>
+        <w:rPr>
+          <w:lang w:val="en-GB"/>
+        </w:rPr>
+        <w:t>Principalul</w:t>
+      </w:r>
+      <w:proofErr w:type="spellEnd"/>
+      <w:r>
+        <w:rPr>
+          <w:lang w:val="en-GB"/>
+        </w:rPr>
+        <w:t xml:space="preserve"> </w:t>
+      </w:r>
+      <w:proofErr w:type="spellStart"/>
+      <w:r>
+        <w:rPr>
+          <w:lang w:val="en-GB"/>
+        </w:rPr>
+        <w:t>obiectiv</w:t>
+      </w:r>
+      <w:proofErr w:type="spellEnd"/>
+      <w:r>
+        <w:rPr>
+          <w:lang w:val="en-GB"/>
+        </w:rPr>
+        <w:t xml:space="preserve"> al </w:t>
+      </w:r>
+      <w:proofErr w:type="spellStart"/>
+      <w:r>
+        <w:rPr>
+          <w:lang w:val="en-GB"/>
+        </w:rPr>
+        <w:t>acestei</w:t>
+      </w:r>
+      <w:proofErr w:type="spellEnd"/>
+      <w:r>
+        <w:rPr>
+          <w:lang w:val="en-GB"/>
+        </w:rPr>
+        <w:t xml:space="preserve"> </w:t>
+      </w:r>
+      <w:proofErr w:type="spellStart"/>
+      <w:r>
+        <w:rPr>
+          <w:lang w:val="en-GB"/>
+        </w:rPr>
+        <w:t>lucrări</w:t>
+      </w:r>
+      <w:proofErr w:type="spellEnd"/>
+      <w:r>
+        <w:rPr>
+          <w:lang w:val="en-GB"/>
+        </w:rPr>
+        <w:t xml:space="preserve"> a </w:t>
+      </w:r>
+      <w:proofErr w:type="spellStart"/>
+      <w:r>
+        <w:rPr>
+          <w:lang w:val="en-GB"/>
+        </w:rPr>
+        <w:t>fost</w:t>
+      </w:r>
+      <w:proofErr w:type="spellEnd"/>
+      <w:r>
+        <w:rPr>
+          <w:lang w:val="en-GB"/>
+        </w:rPr>
+        <w:t xml:space="preserve"> </w:t>
+      </w:r>
+      <w:proofErr w:type="spellStart"/>
+      <w:r>
+        <w:rPr>
+          <w:lang w:val="en-GB"/>
+        </w:rPr>
+        <w:t>crearea</w:t>
+      </w:r>
+      <w:proofErr w:type="spellEnd"/>
+      <w:r>
+        <w:rPr>
+          <w:lang w:val="en-GB"/>
+        </w:rPr>
+        <w:t xml:space="preserve"> </w:t>
+      </w:r>
+      <w:proofErr w:type="spellStart"/>
+      <w:r>
+        <w:rPr>
+          <w:lang w:val="en-GB"/>
+        </w:rPr>
+        <w:t>unui</w:t>
+      </w:r>
+      <w:proofErr w:type="spellEnd"/>
+      <w:r>
+        <w:rPr>
+          <w:lang w:val="en-GB"/>
+        </w:rPr>
+        <w:t xml:space="preserve"> </w:t>
+      </w:r>
+      <w:proofErr w:type="spellStart"/>
+      <w:r>
+        <w:rPr>
+          <w:lang w:val="en-GB"/>
+        </w:rPr>
+        <w:t>joc</w:t>
+      </w:r>
+      <w:proofErr w:type="spellEnd"/>
+      <w:r>
+        <w:rPr>
+          <w:lang w:val="en-GB"/>
+        </w:rPr>
+        <w:t xml:space="preserve"> </w:t>
+      </w:r>
+      <w:proofErr w:type="spellStart"/>
+      <w:r>
+        <w:rPr>
+          <w:lang w:val="en-GB"/>
+        </w:rPr>
+        <w:t>dinamic</w:t>
+      </w:r>
+      <w:proofErr w:type="spellEnd"/>
+      <w:r>
+        <w:rPr>
+          <w:lang w:val="en-GB"/>
+        </w:rPr>
+        <w:t xml:space="preserve"> </w:t>
+      </w:r>
+      <w:proofErr w:type="spellStart"/>
+      <w:r>
+        <w:rPr>
+          <w:lang w:val="en-GB"/>
+        </w:rPr>
+        <w:t>și</w:t>
+      </w:r>
+      <w:proofErr w:type="spellEnd"/>
+      <w:r>
+        <w:rPr>
+          <w:lang w:val="en-GB"/>
+        </w:rPr>
+        <w:t xml:space="preserve"> </w:t>
+      </w:r>
+      <w:proofErr w:type="spellStart"/>
+      <w:r>
+        <w:rPr>
+          <w:lang w:val="en-GB"/>
+        </w:rPr>
+        <w:t>generat</w:t>
+      </w:r>
+      <w:proofErr w:type="spellEnd"/>
+      <w:r>
+        <w:rPr>
+          <w:lang w:val="en-GB"/>
+        </w:rPr>
+        <w:t xml:space="preserve"> procedural care </w:t>
+      </w:r>
+      <w:proofErr w:type="spellStart"/>
+      <w:r>
+        <w:rPr>
+          <w:lang w:val="en-GB"/>
+        </w:rPr>
+        <w:t>prezintă</w:t>
+      </w:r>
+      <w:proofErr w:type="spellEnd"/>
+      <w:r>
+        <w:rPr>
+          <w:lang w:val="en-GB"/>
+        </w:rPr>
+        <w:t xml:space="preserve"> o </w:t>
+      </w:r>
+      <w:proofErr w:type="spellStart"/>
+      <w:r>
+        <w:rPr>
+          <w:lang w:val="en-GB"/>
+        </w:rPr>
+        <w:t>provocare</w:t>
+      </w:r>
+      <w:proofErr w:type="spellEnd"/>
+      <w:r>
+        <w:rPr>
+          <w:lang w:val="en-GB"/>
+        </w:rPr>
+        <w:t xml:space="preserve"> </w:t>
+      </w:r>
+      <w:proofErr w:type="spellStart"/>
+      <w:r>
+        <w:rPr>
+          <w:lang w:val="en-GB"/>
+        </w:rPr>
+        <w:t>pentru</w:t>
+      </w:r>
+      <w:proofErr w:type="spellEnd"/>
+      <w:r>
+        <w:rPr>
+          <w:lang w:val="en-GB"/>
+        </w:rPr>
+        <w:t xml:space="preserve"> </w:t>
+      </w:r>
+      <w:proofErr w:type="spellStart"/>
+      <w:r>
+        <w:rPr>
+          <w:lang w:val="en-GB"/>
+        </w:rPr>
+        <w:t>jucători</w:t>
+      </w:r>
+      <w:proofErr w:type="spellEnd"/>
+      <w:r>
+        <w:rPr>
+          <w:lang w:val="en-GB"/>
+        </w:rPr>
+        <w:t xml:space="preserve"> </w:t>
+      </w:r>
+      <w:proofErr w:type="spellStart"/>
+      <w:r>
+        <w:rPr>
+          <w:lang w:val="en-GB"/>
+        </w:rPr>
+        <w:t>prin</w:t>
+      </w:r>
+      <w:proofErr w:type="spellEnd"/>
+      <w:r>
+        <w:rPr>
+          <w:lang w:val="en-GB"/>
+        </w:rPr>
+        <w:t xml:space="preserve"> </w:t>
+      </w:r>
+      <w:proofErr w:type="spellStart"/>
+      <w:r>
+        <w:rPr>
+          <w:lang w:val="en-GB"/>
+        </w:rPr>
+        <w:t>mecanici</w:t>
+      </w:r>
+      <w:proofErr w:type="spellEnd"/>
+      <w:r>
+        <w:rPr>
+          <w:lang w:val="en-GB"/>
+        </w:rPr>
+        <w:t xml:space="preserve"> legate de </w:t>
+      </w:r>
+      <w:proofErr w:type="spellStart"/>
+      <w:r>
+        <w:rPr>
+          <w:lang w:val="en-GB"/>
+        </w:rPr>
+        <w:t>manipularea</w:t>
+      </w:r>
+      <w:proofErr w:type="spellEnd"/>
+      <w:r>
+        <w:rPr>
+          <w:lang w:val="en-GB"/>
+        </w:rPr>
+        <w:t xml:space="preserve"> </w:t>
+      </w:r>
+      <w:proofErr w:type="spellStart"/>
+      <w:r>
+        <w:rPr>
+          <w:lang w:val="en-GB"/>
+        </w:rPr>
+        <w:t>timpului</w:t>
+      </w:r>
+      <w:proofErr w:type="spellEnd"/>
+      <w:r>
+        <w:rPr>
+          <w:lang w:val="en-GB"/>
+        </w:rPr>
+        <w:t xml:space="preserve"> </w:t>
+      </w:r>
+      <w:proofErr w:type="spellStart"/>
+      <w:r>
+        <w:rPr>
+          <w:lang w:val="en-GB"/>
+        </w:rPr>
+        <w:t>și</w:t>
+      </w:r>
+      <w:proofErr w:type="spellEnd"/>
+      <w:r>
+        <w:rPr>
+          <w:lang w:val="en-GB"/>
+        </w:rPr>
+        <w:t xml:space="preserve"> a </w:t>
+      </w:r>
+      <w:proofErr w:type="spellStart"/>
+      <w:r>
+        <w:rPr>
+          <w:lang w:val="en-GB"/>
+        </w:rPr>
+        <w:t>formei</w:t>
+      </w:r>
+      <w:proofErr w:type="spellEnd"/>
+      <w:r>
+        <w:rPr>
+          <w:lang w:val="en-GB"/>
+        </w:rPr>
+        <w:t xml:space="preserve"> </w:t>
+      </w:r>
+      <w:proofErr w:type="spellStart"/>
+      <w:r>
+        <w:rPr>
+          <w:lang w:val="en-GB"/>
+        </w:rPr>
+        <w:t>jucătorului</w:t>
+      </w:r>
+      <w:proofErr w:type="spellEnd"/>
+      <w:r>
+        <w:rPr>
+          <w:lang w:val="en-GB"/>
+        </w:rPr>
+        <w:t xml:space="preserve"> precum </w:t>
+      </w:r>
+      <w:proofErr w:type="spellStart"/>
+      <w:r>
+        <w:rPr>
+          <w:lang w:val="en-GB"/>
+        </w:rPr>
+        <w:t>și</w:t>
+      </w:r>
+      <w:proofErr w:type="spellEnd"/>
+      <w:r>
+        <w:rPr>
+          <w:lang w:val="en-GB"/>
+        </w:rPr>
+        <w:t xml:space="preserve"> </w:t>
+      </w:r>
+      <w:proofErr w:type="spellStart"/>
+      <w:r>
+        <w:rPr>
+          <w:lang w:val="en-GB"/>
+        </w:rPr>
+        <w:t>generarea</w:t>
+      </w:r>
+      <w:proofErr w:type="spellEnd"/>
+      <w:r>
+        <w:rPr>
+          <w:lang w:val="en-GB"/>
+        </w:rPr>
+        <w:t xml:space="preserve"> </w:t>
+      </w:r>
+      <w:proofErr w:type="spellStart"/>
+      <w:r>
+        <w:rPr>
+          <w:lang w:val="en-GB"/>
+        </w:rPr>
+        <w:t>aleatorie</w:t>
+      </w:r>
+      <w:proofErr w:type="spellEnd"/>
+      <w:r>
+        <w:rPr>
+          <w:lang w:val="en-GB"/>
+        </w:rPr>
+        <w:t xml:space="preserve"> de </w:t>
+      </w:r>
+      <w:proofErr w:type="spellStart"/>
+      <w:r>
+        <w:rPr>
+          <w:lang w:val="en-GB"/>
+        </w:rPr>
+        <w:t>niveluri</w:t>
+      </w:r>
+      <w:proofErr w:type="spellEnd"/>
+      <w:r>
+        <w:rPr>
+          <w:lang w:val="en-GB"/>
+        </w:rPr>
+        <w:t xml:space="preserve">. </w:t>
+      </w:r>
+      <w:proofErr w:type="spellStart"/>
+      <w:r>
+        <w:rPr>
+          <w:lang w:val="en-GB"/>
+        </w:rPr>
+        <w:t>Toate</w:t>
+      </w:r>
+      <w:proofErr w:type="spellEnd"/>
+      <w:r>
+        <w:rPr>
+          <w:lang w:val="en-GB"/>
+        </w:rPr>
+        <w:t xml:space="preserve"> </w:t>
+      </w:r>
+      <w:proofErr w:type="spellStart"/>
+      <w:r>
+        <w:rPr>
+          <w:lang w:val="en-GB"/>
+        </w:rPr>
+        <w:t>aceste</w:t>
+      </w:r>
+      <w:proofErr w:type="spellEnd"/>
+      <w:r>
+        <w:rPr>
+          <w:lang w:val="en-GB"/>
+        </w:rPr>
+        <w:t xml:space="preserve"> </w:t>
+      </w:r>
+      <w:proofErr w:type="spellStart"/>
+      <w:r>
+        <w:rPr>
+          <w:lang w:val="en-GB"/>
+        </w:rPr>
+        <w:t>elemente</w:t>
+      </w:r>
+      <w:proofErr w:type="spellEnd"/>
+      <w:r>
+        <w:rPr>
+          <w:lang w:val="en-GB"/>
+        </w:rPr>
+        <w:t xml:space="preserve"> </w:t>
+      </w:r>
+      <w:proofErr w:type="spellStart"/>
+      <w:r>
+        <w:rPr>
+          <w:lang w:val="en-GB"/>
+        </w:rPr>
+        <w:t>îl</w:t>
+      </w:r>
+      <w:proofErr w:type="spellEnd"/>
+      <w:r>
+        <w:rPr>
+          <w:lang w:val="en-GB"/>
+        </w:rPr>
+        <w:t xml:space="preserve"> </w:t>
+      </w:r>
+      <w:proofErr w:type="spellStart"/>
+      <w:r>
+        <w:rPr>
+          <w:lang w:val="en-GB"/>
+        </w:rPr>
+        <w:t>provoacă</w:t>
+      </w:r>
+      <w:proofErr w:type="spellEnd"/>
+      <w:r>
+        <w:rPr>
+          <w:lang w:val="en-GB"/>
+        </w:rPr>
+        <w:t xml:space="preserve"> pe </w:t>
+      </w:r>
+      <w:proofErr w:type="spellStart"/>
+      <w:r>
+        <w:rPr>
+          <w:lang w:val="en-GB"/>
+        </w:rPr>
+        <w:t>jucător</w:t>
+      </w:r>
+      <w:proofErr w:type="spellEnd"/>
+      <w:r>
+        <w:rPr>
+          <w:lang w:val="en-GB"/>
+        </w:rPr>
+        <w:t xml:space="preserve"> </w:t>
+      </w:r>
+      <w:proofErr w:type="spellStart"/>
+      <w:r>
+        <w:rPr>
+          <w:lang w:val="en-GB"/>
+        </w:rPr>
+        <w:t>să</w:t>
+      </w:r>
+      <w:proofErr w:type="spellEnd"/>
+      <w:r>
+        <w:rPr>
+          <w:lang w:val="en-GB"/>
+        </w:rPr>
+        <w:t xml:space="preserve"> </w:t>
+      </w:r>
+      <w:proofErr w:type="spellStart"/>
+      <w:r>
+        <w:rPr>
+          <w:lang w:val="en-GB"/>
+        </w:rPr>
+        <w:t>gândească</w:t>
+      </w:r>
+      <w:proofErr w:type="spellEnd"/>
+      <w:r>
+        <w:rPr>
+          <w:lang w:val="en-GB"/>
+        </w:rPr>
+        <w:t xml:space="preserve"> </w:t>
+      </w:r>
+      <w:proofErr w:type="spellStart"/>
+      <w:r>
+        <w:rPr>
+          <w:lang w:val="en-GB"/>
+        </w:rPr>
+        <w:t>atât</w:t>
+      </w:r>
+      <w:proofErr w:type="spellEnd"/>
+      <w:r>
+        <w:rPr>
+          <w:lang w:val="en-GB"/>
+        </w:rPr>
+        <w:t xml:space="preserve"> </w:t>
+      </w:r>
+      <w:proofErr w:type="spellStart"/>
+      <w:r>
+        <w:rPr>
+          <w:lang w:val="en-GB"/>
+        </w:rPr>
+        <w:t>creativ</w:t>
+      </w:r>
+      <w:proofErr w:type="spellEnd"/>
+      <w:r>
+        <w:rPr>
+          <w:lang w:val="en-GB"/>
+        </w:rPr>
+        <w:t xml:space="preserve"> </w:t>
+      </w:r>
+      <w:proofErr w:type="spellStart"/>
+      <w:r>
+        <w:rPr>
+          <w:lang w:val="en-GB"/>
+        </w:rPr>
+        <w:t>cât</w:t>
+      </w:r>
+      <w:proofErr w:type="spellEnd"/>
+      <w:r>
+        <w:rPr>
+          <w:lang w:val="en-GB"/>
+        </w:rPr>
+        <w:t xml:space="preserve"> </w:t>
+      </w:r>
+      <w:proofErr w:type="spellStart"/>
+      <w:r>
+        <w:rPr>
+          <w:lang w:val="en-GB"/>
+        </w:rPr>
+        <w:t>și</w:t>
+      </w:r>
+      <w:proofErr w:type="spellEnd"/>
+      <w:r>
+        <w:rPr>
+          <w:lang w:val="en-GB"/>
+        </w:rPr>
+        <w:t xml:space="preserve"> strategic </w:t>
+      </w:r>
+      <w:proofErr w:type="spellStart"/>
+      <w:r>
+        <w:rPr>
+          <w:lang w:val="en-GB"/>
+        </w:rPr>
+        <w:t>pentru</w:t>
+      </w:r>
+      <w:proofErr w:type="spellEnd"/>
+      <w:r>
+        <w:rPr>
+          <w:lang w:val="en-GB"/>
+        </w:rPr>
+        <w:t xml:space="preserve"> a </w:t>
+      </w:r>
+      <w:proofErr w:type="spellStart"/>
+      <w:r>
+        <w:rPr>
+          <w:lang w:val="en-GB"/>
+        </w:rPr>
+        <w:t>completa</w:t>
+      </w:r>
+      <w:proofErr w:type="spellEnd"/>
+      <w:r>
+        <w:rPr>
+          <w:lang w:val="en-GB"/>
+        </w:rPr>
+        <w:t xml:space="preserve"> </w:t>
+      </w:r>
+      <w:proofErr w:type="spellStart"/>
+      <w:r>
+        <w:rPr>
+          <w:lang w:val="en-GB"/>
+        </w:rPr>
+        <w:t>obiectivul</w:t>
+      </w:r>
+      <w:proofErr w:type="spellEnd"/>
+      <w:r>
+        <w:rPr>
+          <w:lang w:val="en-GB"/>
+        </w:rPr>
+        <w:t xml:space="preserve"> </w:t>
+      </w:r>
+      <w:proofErr w:type="spellStart"/>
+      <w:r>
+        <w:rPr>
+          <w:lang w:val="en-GB"/>
+        </w:rPr>
+        <w:t>jocului</w:t>
+      </w:r>
+      <w:proofErr w:type="spellEnd"/>
+      <w:r>
+        <w:rPr>
+          <w:lang w:val="en-GB"/>
+        </w:rPr>
+        <w:t>.</w:t>
       </w:r>
       <w:r>
         <w:rPr>
@@ -399,18 +1167,132 @@
         </w:rPr>
         <w:t xml:space="preserve"> Sword of Time </w:t>
       </w:r>
-      <w:r>
-        <w:rPr>
-          <w:lang w:val="en-GB"/>
-        </w:rPr>
-        <w:t xml:space="preserve">combină platforming-ul cu elemente de progress de tip rogue-like, ce crează o buclă de repetiție unică </w:t>
-      </w:r>
-      <w:r>
-        <w:rPr>
-          <w:lang w:val="en-GB"/>
-        </w:rPr>
-        <w:t>la fiecare încercare</w:t>
-      </w:r>
+      <w:proofErr w:type="spellStart"/>
+      <w:r>
+        <w:rPr>
+          <w:lang w:val="en-GB"/>
+        </w:rPr>
+        <w:t>combină</w:t>
+      </w:r>
+      <w:proofErr w:type="spellEnd"/>
+      <w:r>
+        <w:rPr>
+          <w:lang w:val="en-GB"/>
+        </w:rPr>
+        <w:t xml:space="preserve"> platforming-ul cu </w:t>
+      </w:r>
+      <w:proofErr w:type="spellStart"/>
+      <w:r>
+        <w:rPr>
+          <w:lang w:val="en-GB"/>
+        </w:rPr>
+        <w:t>elemente</w:t>
+      </w:r>
+      <w:proofErr w:type="spellEnd"/>
+      <w:r>
+        <w:rPr>
+          <w:lang w:val="en-GB"/>
+        </w:rPr>
+        <w:t xml:space="preserve"> de progress de tip rogue-like, </w:t>
+      </w:r>
+      <w:proofErr w:type="spellStart"/>
+      <w:r>
+        <w:rPr>
+          <w:lang w:val="en-GB"/>
+        </w:rPr>
+        <w:t>ce</w:t>
+      </w:r>
+      <w:proofErr w:type="spellEnd"/>
+      <w:r>
+        <w:rPr>
+          <w:lang w:val="en-GB"/>
+        </w:rPr>
+        <w:t xml:space="preserve"> </w:t>
+      </w:r>
+      <w:proofErr w:type="spellStart"/>
+      <w:r>
+        <w:rPr>
+          <w:lang w:val="en-GB"/>
+        </w:rPr>
+        <w:t>crează</w:t>
+      </w:r>
+      <w:proofErr w:type="spellEnd"/>
+      <w:r>
+        <w:rPr>
+          <w:lang w:val="en-GB"/>
+        </w:rPr>
+        <w:t xml:space="preserve"> o </w:t>
+      </w:r>
+      <w:proofErr w:type="spellStart"/>
+      <w:r>
+        <w:rPr>
+          <w:lang w:val="en-GB"/>
+        </w:rPr>
+        <w:t>buclă</w:t>
+      </w:r>
+      <w:proofErr w:type="spellEnd"/>
+      <w:r>
+        <w:rPr>
+          <w:lang w:val="en-GB"/>
+        </w:rPr>
+        <w:t xml:space="preserve"> de </w:t>
+      </w:r>
+      <w:proofErr w:type="spellStart"/>
+      <w:r>
+        <w:rPr>
+          <w:lang w:val="en-GB"/>
+        </w:rPr>
+        <w:t>repetiție</w:t>
+      </w:r>
+      <w:proofErr w:type="spellEnd"/>
+      <w:r>
+        <w:rPr>
+          <w:lang w:val="en-GB"/>
+        </w:rPr>
+        <w:t xml:space="preserve"> </w:t>
+      </w:r>
+      <w:proofErr w:type="spellStart"/>
+      <w:r>
+        <w:rPr>
+          <w:lang w:val="en-GB"/>
+        </w:rPr>
+        <w:t>unică</w:t>
+      </w:r>
+      <w:proofErr w:type="spellEnd"/>
+      <w:r>
+        <w:rPr>
+          <w:lang w:val="en-GB"/>
+        </w:rPr>
+        <w:t xml:space="preserve"> </w:t>
+      </w:r>
+      <w:r>
+        <w:rPr>
+          <w:lang w:val="en-GB"/>
+        </w:rPr>
+        <w:t xml:space="preserve">la </w:t>
+      </w:r>
+      <w:proofErr w:type="spellStart"/>
+      <w:r>
+        <w:rPr>
+          <w:lang w:val="en-GB"/>
+        </w:rPr>
+        <w:t>fiecare</w:t>
+      </w:r>
+      <w:proofErr w:type="spellEnd"/>
+      <w:r>
+        <w:rPr>
+          <w:lang w:val="en-GB"/>
+        </w:rPr>
+        <w:t xml:space="preserve"> </w:t>
+      </w:r>
+      <w:proofErr w:type="spellStart"/>
+      <w:r>
+        <w:rPr>
+          <w:lang w:val="en-GB"/>
+        </w:rPr>
+        <w:t>încercare</w:t>
+      </w:r>
+      <w:proofErr w:type="spellEnd"/>
       <w:r>
         <w:rPr>
           <w:lang w:val="en-GB"/>
@@ -445,17 +1327,137 @@
         </w:rPr>
         <w:tab/>
       </w:r>
-      <w:r>
-        <w:rPr>
-          <w:lang w:val="en-GB"/>
-        </w:rPr>
-        <w:t>Procesul de dezvoltare a avut loc în Game Engine-ul Unity, punând accent pe algoritmi de gene</w:t>
-      </w:r>
-      <w:r>
-        <w:rPr>
-          <w:lang w:val="en-GB"/>
-        </w:rPr>
-        <w:t>rare procedural</w:t>
+      <w:proofErr w:type="spellStart"/>
+      <w:r>
+        <w:rPr>
+          <w:lang w:val="en-GB"/>
+        </w:rPr>
+        <w:t>Procesul</w:t>
+      </w:r>
+      <w:proofErr w:type="spellEnd"/>
+      <w:r>
+        <w:rPr>
+          <w:lang w:val="en-GB"/>
+        </w:rPr>
+        <w:t xml:space="preserve"> de </w:t>
+      </w:r>
+      <w:proofErr w:type="spellStart"/>
+      <w:r>
+        <w:rPr>
+          <w:lang w:val="en-GB"/>
+        </w:rPr>
+        <w:t>dezvoltare</w:t>
+      </w:r>
+      <w:proofErr w:type="spellEnd"/>
+      <w:r>
+        <w:rPr>
+          <w:lang w:val="en-GB"/>
+        </w:rPr>
+        <w:t xml:space="preserve"> </w:t>
+      </w:r>
+      <w:proofErr w:type="gramStart"/>
+      <w:r>
+        <w:rPr>
+          <w:lang w:val="en-GB"/>
+        </w:rPr>
+        <w:t>a</w:t>
+      </w:r>
+      <w:proofErr w:type="gramEnd"/>
+      <w:r>
+        <w:rPr>
+          <w:lang w:val="en-GB"/>
+        </w:rPr>
+        <w:t xml:space="preserve"> </w:t>
+      </w:r>
+      <w:proofErr w:type="spellStart"/>
+      <w:r>
+        <w:rPr>
+          <w:lang w:val="en-GB"/>
+        </w:rPr>
+        <w:t>avut</w:t>
+      </w:r>
+      <w:proofErr w:type="spellEnd"/>
+      <w:r>
+        <w:rPr>
+          <w:lang w:val="en-GB"/>
+        </w:rPr>
+        <w:t xml:space="preserve"> </w:t>
+      </w:r>
+      <w:proofErr w:type="spellStart"/>
+      <w:r>
+        <w:rPr>
+          <w:lang w:val="en-GB"/>
+        </w:rPr>
+        <w:t>loc</w:t>
+      </w:r>
+      <w:proofErr w:type="spellEnd"/>
+      <w:r>
+        <w:rPr>
+          <w:lang w:val="en-GB"/>
+        </w:rPr>
+        <w:t xml:space="preserve"> </w:t>
+      </w:r>
+      <w:proofErr w:type="spellStart"/>
+      <w:r>
+        <w:rPr>
+          <w:lang w:val="en-GB"/>
+        </w:rPr>
+        <w:t>în</w:t>
+      </w:r>
+      <w:proofErr w:type="spellEnd"/>
+      <w:r>
+        <w:rPr>
+          <w:lang w:val="en-GB"/>
+        </w:rPr>
+        <w:t xml:space="preserve"> Game Engine-ul Unity, </w:t>
+      </w:r>
+      <w:proofErr w:type="spellStart"/>
+      <w:r>
+        <w:rPr>
+          <w:lang w:val="en-GB"/>
+        </w:rPr>
+        <w:t>punând</w:t>
+      </w:r>
+      <w:proofErr w:type="spellEnd"/>
+      <w:r>
+        <w:rPr>
+          <w:lang w:val="en-GB"/>
+        </w:rPr>
+        <w:t xml:space="preserve"> accent pe </w:t>
+      </w:r>
+      <w:proofErr w:type="spellStart"/>
+      <w:r>
+        <w:rPr>
+          <w:lang w:val="en-GB"/>
+        </w:rPr>
+        <w:t>algoritmi</w:t>
+      </w:r>
+      <w:proofErr w:type="spellEnd"/>
+      <w:r>
+        <w:rPr>
+          <w:lang w:val="en-GB"/>
+        </w:rPr>
+        <w:t xml:space="preserve"> de </w:t>
+      </w:r>
+      <w:proofErr w:type="spellStart"/>
+      <w:r>
+        <w:rPr>
+          <w:lang w:val="en-GB"/>
+        </w:rPr>
+        <w:t>gene</w:t>
+      </w:r>
+      <w:r>
+        <w:rPr>
+          <w:lang w:val="en-GB"/>
+        </w:rPr>
+        <w:t>rare</w:t>
+      </w:r>
+      <w:proofErr w:type="spellEnd"/>
+      <w:r>
+        <w:rPr>
+          <w:lang w:val="en-GB"/>
+        </w:rPr>
+        <w:t xml:space="preserve"> procedural</w:t>
       </w:r>
       <w:r>
         <w:t>ă, abilități controlate de jucător și un sistem de combat.  Elemente cheie de design ce au prezentat o provocare sunt cele precum crearea unui mediu de joc și a unor mecanici balansate, astfel asigurând ca fiecare parcurgere a jocului este atât provocatoare cât și plină de recompensă. Jocul prezintă mecanici precum wind-dashing, derularea înapoi a timpului, varietate în inamici, obiecte și niveluri ce devin progresiv mai grele și necesită o adaptare strategică</w:t>
@@ -488,30 +1490,602 @@
         </w:rPr>
         <w:tab/>
       </w:r>
-      <w:r>
-        <w:rPr>
-          <w:lang w:val="en-GB"/>
-        </w:rPr>
-        <w:t>Rezultatul acestui proiect este un demo Sword of Time, unde jucătorii pot naviga prin niveluri generate procedural, învingând inamicii și depășind obstacolele din cale folosind abilități și obiecete pe care le obțin. Această lucrare concluzionează prin o analiză a eficienței sistemelor de jocuri</w:t>
-      </w:r>
-      <w:r>
-        <w:rPr>
-          <w:lang w:val="en-GB"/>
-        </w:rPr>
-        <w:t>, precum și sugestii</w:t>
-      </w:r>
+      <w:proofErr w:type="spellStart"/>
+      <w:r>
+        <w:rPr>
+          <w:lang w:val="en-GB"/>
+        </w:rPr>
+        <w:t>Rezultatul</w:t>
+      </w:r>
+      <w:proofErr w:type="spellEnd"/>
       <w:r>
         <w:rPr>
           <w:lang w:val="en-GB"/>
         </w:rPr>
         <w:t xml:space="preserve"> </w:t>
       </w:r>
-      <w:r>
-        <w:rPr>
-          <w:lang w:val="en-GB"/>
-        </w:rPr>
-        <w:t>pentru dezvoltarea viitoare ce va extinde narativa cât și raza de interacțiune a jucătorului</w:t>
-      </w:r>
+      <w:proofErr w:type="spellStart"/>
+      <w:r>
+        <w:rPr>
+          <w:lang w:val="en-GB"/>
+        </w:rPr>
+        <w:t>acestui</w:t>
+      </w:r>
+      <w:proofErr w:type="spellEnd"/>
+      <w:r>
+        <w:rPr>
+          <w:lang w:val="en-GB"/>
+        </w:rPr>
+        <w:t xml:space="preserve"> </w:t>
+      </w:r>
+      <w:proofErr w:type="spellStart"/>
+      <w:r>
+        <w:rPr>
+          <w:lang w:val="en-GB"/>
+        </w:rPr>
+        <w:t>proiect</w:t>
+      </w:r>
+      <w:proofErr w:type="spellEnd"/>
+      <w:r>
+        <w:rPr>
+          <w:lang w:val="en-GB"/>
+        </w:rPr>
+        <w:t xml:space="preserve"> </w:t>
+      </w:r>
+      <w:proofErr w:type="spellStart"/>
+      <w:r>
+        <w:rPr>
+          <w:lang w:val="en-GB"/>
+        </w:rPr>
+        <w:t>este</w:t>
+      </w:r>
+      <w:proofErr w:type="spellEnd"/>
+      <w:r>
+        <w:rPr>
+          <w:lang w:val="en-GB"/>
+        </w:rPr>
+        <w:t xml:space="preserve"> un demo Sword of Time, </w:t>
+      </w:r>
+      <w:proofErr w:type="spellStart"/>
+      <w:r>
+        <w:rPr>
+          <w:lang w:val="en-GB"/>
+        </w:rPr>
+        <w:t>unde</w:t>
+      </w:r>
+      <w:proofErr w:type="spellEnd"/>
+      <w:r>
+        <w:rPr>
+          <w:lang w:val="en-GB"/>
+        </w:rPr>
+        <w:t xml:space="preserve"> </w:t>
+      </w:r>
+      <w:proofErr w:type="spellStart"/>
+      <w:r>
+        <w:rPr>
+          <w:lang w:val="en-GB"/>
+        </w:rPr>
+        <w:t>jucătorii</w:t>
+      </w:r>
+      <w:proofErr w:type="spellEnd"/>
+      <w:r>
+        <w:rPr>
+          <w:lang w:val="en-GB"/>
+        </w:rPr>
+        <w:t xml:space="preserve"> pot </w:t>
+      </w:r>
+      <w:proofErr w:type="spellStart"/>
+      <w:r>
+        <w:rPr>
+          <w:lang w:val="en-GB"/>
+        </w:rPr>
+        <w:t>naviga</w:t>
+      </w:r>
+      <w:proofErr w:type="spellEnd"/>
+      <w:r>
+        <w:rPr>
+          <w:lang w:val="en-GB"/>
+        </w:rPr>
+        <w:t xml:space="preserve"> </w:t>
+      </w:r>
+      <w:proofErr w:type="spellStart"/>
+      <w:r>
+        <w:rPr>
+          <w:lang w:val="en-GB"/>
+        </w:rPr>
+        <w:t>prin</w:t>
+      </w:r>
+      <w:proofErr w:type="spellEnd"/>
+      <w:r>
+        <w:rPr>
+          <w:lang w:val="en-GB"/>
+        </w:rPr>
+        <w:t xml:space="preserve"> </w:t>
+      </w:r>
+      <w:proofErr w:type="spellStart"/>
+      <w:r>
+        <w:rPr>
+          <w:lang w:val="en-GB"/>
+        </w:rPr>
+        <w:t>niveluri</w:t>
+      </w:r>
+      <w:proofErr w:type="spellEnd"/>
+      <w:r>
+        <w:rPr>
+          <w:lang w:val="en-GB"/>
+        </w:rPr>
+        <w:t xml:space="preserve"> generate procedural, </w:t>
+      </w:r>
+      <w:proofErr w:type="spellStart"/>
+      <w:r>
+        <w:rPr>
+          <w:lang w:val="en-GB"/>
+        </w:rPr>
+        <w:t>învingând</w:t>
+      </w:r>
+      <w:proofErr w:type="spellEnd"/>
+      <w:r>
+        <w:rPr>
+          <w:lang w:val="en-GB"/>
+        </w:rPr>
+        <w:t xml:space="preserve"> </w:t>
+      </w:r>
+      <w:proofErr w:type="spellStart"/>
+      <w:r>
+        <w:rPr>
+          <w:lang w:val="en-GB"/>
+        </w:rPr>
+        <w:t>inamicii</w:t>
+      </w:r>
+      <w:proofErr w:type="spellEnd"/>
+      <w:r>
+        <w:rPr>
+          <w:lang w:val="en-GB"/>
+        </w:rPr>
+        <w:t xml:space="preserve"> </w:t>
+      </w:r>
+      <w:proofErr w:type="spellStart"/>
+      <w:r>
+        <w:rPr>
+          <w:lang w:val="en-GB"/>
+        </w:rPr>
+        <w:t>și</w:t>
+      </w:r>
+      <w:proofErr w:type="spellEnd"/>
+      <w:r>
+        <w:rPr>
+          <w:lang w:val="en-GB"/>
+        </w:rPr>
+        <w:t xml:space="preserve"> </w:t>
+      </w:r>
+      <w:proofErr w:type="spellStart"/>
+      <w:r>
+        <w:rPr>
+          <w:lang w:val="en-GB"/>
+        </w:rPr>
+        <w:t>depășind</w:t>
+      </w:r>
+      <w:proofErr w:type="spellEnd"/>
+      <w:r>
+        <w:rPr>
+          <w:lang w:val="en-GB"/>
+        </w:rPr>
+        <w:t xml:space="preserve"> </w:t>
+      </w:r>
+      <w:proofErr w:type="spellStart"/>
+      <w:r>
+        <w:rPr>
+          <w:lang w:val="en-GB"/>
+        </w:rPr>
+        <w:t>obstacolele</w:t>
+      </w:r>
+      <w:proofErr w:type="spellEnd"/>
+      <w:r>
+        <w:rPr>
+          <w:lang w:val="en-GB"/>
+        </w:rPr>
+        <w:t xml:space="preserve"> din </w:t>
+      </w:r>
+      <w:proofErr w:type="spellStart"/>
+      <w:r>
+        <w:rPr>
+          <w:lang w:val="en-GB"/>
+        </w:rPr>
+        <w:t>cale</w:t>
+      </w:r>
+      <w:proofErr w:type="spellEnd"/>
+      <w:r>
+        <w:rPr>
+          <w:lang w:val="en-GB"/>
+        </w:rPr>
+        <w:t xml:space="preserve"> </w:t>
+      </w:r>
+      <w:proofErr w:type="spellStart"/>
+      <w:r>
+        <w:rPr>
+          <w:lang w:val="en-GB"/>
+        </w:rPr>
+        <w:t>folosind</w:t>
+      </w:r>
+      <w:proofErr w:type="spellEnd"/>
+      <w:r>
+        <w:rPr>
+          <w:lang w:val="en-GB"/>
+        </w:rPr>
+        <w:t xml:space="preserve"> </w:t>
+      </w:r>
+      <w:proofErr w:type="spellStart"/>
+      <w:r>
+        <w:rPr>
+          <w:lang w:val="en-GB"/>
+        </w:rPr>
+        <w:t>abilități</w:t>
+      </w:r>
+      <w:proofErr w:type="spellEnd"/>
+      <w:r>
+        <w:rPr>
+          <w:lang w:val="en-GB"/>
+        </w:rPr>
+        <w:t xml:space="preserve"> </w:t>
+      </w:r>
+      <w:proofErr w:type="spellStart"/>
+      <w:r>
+        <w:rPr>
+          <w:lang w:val="en-GB"/>
+        </w:rPr>
+        <w:t>și</w:t>
+      </w:r>
+      <w:proofErr w:type="spellEnd"/>
+      <w:r>
+        <w:rPr>
+          <w:lang w:val="en-GB"/>
+        </w:rPr>
+        <w:t xml:space="preserve"> </w:t>
+      </w:r>
+      <w:proofErr w:type="spellStart"/>
+      <w:r>
+        <w:rPr>
+          <w:lang w:val="en-GB"/>
+        </w:rPr>
+        <w:t>obiecete</w:t>
+      </w:r>
+      <w:proofErr w:type="spellEnd"/>
+      <w:r>
+        <w:rPr>
+          <w:lang w:val="en-GB"/>
+        </w:rPr>
+        <w:t xml:space="preserve"> pe care le </w:t>
+      </w:r>
+      <w:proofErr w:type="spellStart"/>
+      <w:r>
+        <w:rPr>
+          <w:lang w:val="en-GB"/>
+        </w:rPr>
+        <w:t>obțin</w:t>
+      </w:r>
+      <w:proofErr w:type="spellEnd"/>
+      <w:r>
+        <w:rPr>
+          <w:lang w:val="en-GB"/>
+        </w:rPr>
+        <w:t xml:space="preserve">. </w:t>
+      </w:r>
+      <w:proofErr w:type="spellStart"/>
+      <w:r>
+        <w:rPr>
+          <w:lang w:val="en-GB"/>
+        </w:rPr>
+        <w:t>Această</w:t>
+      </w:r>
+      <w:proofErr w:type="spellEnd"/>
+      <w:r>
+        <w:rPr>
+          <w:lang w:val="en-GB"/>
+        </w:rPr>
+        <w:t xml:space="preserve"> </w:t>
+      </w:r>
+      <w:proofErr w:type="spellStart"/>
+      <w:r>
+        <w:rPr>
+          <w:lang w:val="en-GB"/>
+        </w:rPr>
+        <w:t>lucrare</w:t>
+      </w:r>
+      <w:proofErr w:type="spellEnd"/>
+      <w:r>
+        <w:rPr>
+          <w:lang w:val="en-GB"/>
+        </w:rPr>
+        <w:t xml:space="preserve"> </w:t>
+      </w:r>
+      <w:proofErr w:type="spellStart"/>
+      <w:r>
+        <w:rPr>
+          <w:lang w:val="en-GB"/>
+        </w:rPr>
+        <w:t>concluzionează</w:t>
+      </w:r>
+      <w:proofErr w:type="spellEnd"/>
+      <w:r>
+        <w:rPr>
+          <w:lang w:val="en-GB"/>
+        </w:rPr>
+        <w:t xml:space="preserve"> </w:t>
+      </w:r>
+      <w:proofErr w:type="spellStart"/>
+      <w:r>
+        <w:rPr>
+          <w:lang w:val="en-GB"/>
+        </w:rPr>
+        <w:t>prin</w:t>
+      </w:r>
+      <w:proofErr w:type="spellEnd"/>
+      <w:r>
+        <w:rPr>
+          <w:lang w:val="en-GB"/>
+        </w:rPr>
+        <w:t xml:space="preserve"> o </w:t>
+      </w:r>
+      <w:proofErr w:type="spellStart"/>
+      <w:r>
+        <w:rPr>
+          <w:lang w:val="en-GB"/>
+        </w:rPr>
+        <w:t>analiză</w:t>
+      </w:r>
+      <w:proofErr w:type="spellEnd"/>
+      <w:r>
+        <w:rPr>
+          <w:lang w:val="en-GB"/>
+        </w:rPr>
+        <w:t xml:space="preserve"> </w:t>
+      </w:r>
+      <w:proofErr w:type="gramStart"/>
+      <w:r>
+        <w:rPr>
+          <w:lang w:val="en-GB"/>
+        </w:rPr>
+        <w:t>a</w:t>
+      </w:r>
+      <w:proofErr w:type="gramEnd"/>
+      <w:r>
+        <w:rPr>
+          <w:lang w:val="en-GB"/>
+        </w:rPr>
+        <w:t xml:space="preserve"> </w:t>
+      </w:r>
+      <w:proofErr w:type="spellStart"/>
+      <w:r>
+        <w:rPr>
+          <w:lang w:val="en-GB"/>
+        </w:rPr>
+        <w:t>eficienței</w:t>
+      </w:r>
+      <w:proofErr w:type="spellEnd"/>
+      <w:r>
+        <w:rPr>
+          <w:lang w:val="en-GB"/>
+        </w:rPr>
+        <w:t xml:space="preserve"> </w:t>
+      </w:r>
+      <w:proofErr w:type="spellStart"/>
+      <w:r>
+        <w:rPr>
+          <w:lang w:val="en-GB"/>
+        </w:rPr>
+        <w:t>sistemelor</w:t>
+      </w:r>
+      <w:proofErr w:type="spellEnd"/>
+      <w:r>
+        <w:rPr>
+          <w:lang w:val="en-GB"/>
+        </w:rPr>
+        <w:t xml:space="preserve"> de </w:t>
+      </w:r>
+      <w:proofErr w:type="spellStart"/>
+      <w:r>
+        <w:rPr>
+          <w:lang w:val="en-GB"/>
+        </w:rPr>
+        <w:t>jocuri</w:t>
+      </w:r>
+      <w:proofErr w:type="spellEnd"/>
+      <w:r>
+        <w:rPr>
+          <w:lang w:val="en-GB"/>
+        </w:rPr>
+        <w:t xml:space="preserve">, precum </w:t>
+      </w:r>
+      <w:proofErr w:type="spellStart"/>
+      <w:r>
+        <w:rPr>
+          <w:lang w:val="en-GB"/>
+        </w:rPr>
+        <w:t>și</w:t>
+      </w:r>
+      <w:proofErr w:type="spellEnd"/>
+      <w:r>
+        <w:rPr>
+          <w:lang w:val="en-GB"/>
+        </w:rPr>
+        <w:t xml:space="preserve"> </w:t>
+      </w:r>
+      <w:proofErr w:type="spellStart"/>
+      <w:r>
+        <w:rPr>
+          <w:lang w:val="en-GB"/>
+        </w:rPr>
+        <w:t>sugestii</w:t>
+      </w:r>
+      <w:proofErr w:type="spellEnd"/>
+      <w:r>
+        <w:rPr>
+          <w:lang w:val="en-GB"/>
+        </w:rPr>
+        <w:t xml:space="preserve"> </w:t>
+      </w:r>
+      <w:proofErr w:type="spellStart"/>
+      <w:r>
+        <w:rPr>
+          <w:lang w:val="en-GB"/>
+        </w:rPr>
+        <w:t>pentru</w:t>
+      </w:r>
+      <w:proofErr w:type="spellEnd"/>
+      <w:r>
+        <w:rPr>
+          <w:lang w:val="en-GB"/>
+        </w:rPr>
+        <w:t xml:space="preserve"> </w:t>
+      </w:r>
+      <w:proofErr w:type="spellStart"/>
+      <w:r>
+        <w:rPr>
+          <w:lang w:val="en-GB"/>
+        </w:rPr>
+        <w:t>dezvoltarea</w:t>
+      </w:r>
+      <w:proofErr w:type="spellEnd"/>
+      <w:r>
+        <w:rPr>
+          <w:lang w:val="en-GB"/>
+        </w:rPr>
+        <w:t xml:space="preserve"> </w:t>
+      </w:r>
+      <w:proofErr w:type="spellStart"/>
+      <w:r>
+        <w:rPr>
+          <w:lang w:val="en-GB"/>
+        </w:rPr>
+        <w:t>viitoare</w:t>
+      </w:r>
+      <w:proofErr w:type="spellEnd"/>
+      <w:r>
+        <w:rPr>
+          <w:lang w:val="en-GB"/>
+        </w:rPr>
+        <w:t xml:space="preserve"> </w:t>
+      </w:r>
+      <w:proofErr w:type="spellStart"/>
+      <w:r>
+        <w:rPr>
+          <w:lang w:val="en-GB"/>
+        </w:rPr>
+        <w:t>ce</w:t>
+      </w:r>
+      <w:proofErr w:type="spellEnd"/>
+      <w:r>
+        <w:rPr>
+          <w:lang w:val="en-GB"/>
+        </w:rPr>
+        <w:t xml:space="preserve"> </w:t>
+      </w:r>
+      <w:proofErr w:type="spellStart"/>
+      <w:r>
+        <w:rPr>
+          <w:lang w:val="en-GB"/>
+        </w:rPr>
+        <w:t>va</w:t>
+      </w:r>
+      <w:proofErr w:type="spellEnd"/>
+      <w:r>
+        <w:rPr>
+          <w:lang w:val="en-GB"/>
+        </w:rPr>
+        <w:t xml:space="preserve"> </w:t>
+      </w:r>
+      <w:proofErr w:type="spellStart"/>
+      <w:r>
+        <w:rPr>
+          <w:lang w:val="en-GB"/>
+        </w:rPr>
+        <w:t>extinde</w:t>
+      </w:r>
+      <w:proofErr w:type="spellEnd"/>
+      <w:r>
+        <w:rPr>
+          <w:lang w:val="en-GB"/>
+        </w:rPr>
+        <w:t xml:space="preserve"> </w:t>
+      </w:r>
+      <w:proofErr w:type="spellStart"/>
+      <w:r>
+        <w:rPr>
+          <w:lang w:val="en-GB"/>
+        </w:rPr>
+        <w:t>narativa</w:t>
+      </w:r>
+      <w:proofErr w:type="spellEnd"/>
+      <w:r>
+        <w:rPr>
+          <w:lang w:val="en-GB"/>
+        </w:rPr>
+        <w:t xml:space="preserve"> </w:t>
+      </w:r>
+      <w:proofErr w:type="spellStart"/>
+      <w:r>
+        <w:rPr>
+          <w:lang w:val="en-GB"/>
+        </w:rPr>
+        <w:t>cât</w:t>
+      </w:r>
+      <w:proofErr w:type="spellEnd"/>
+      <w:r>
+        <w:rPr>
+          <w:lang w:val="en-GB"/>
+        </w:rPr>
+        <w:t xml:space="preserve"> </w:t>
+      </w:r>
+      <w:proofErr w:type="spellStart"/>
+      <w:r>
+        <w:rPr>
+          <w:lang w:val="en-GB"/>
+        </w:rPr>
+        <w:t>și</w:t>
+      </w:r>
+      <w:proofErr w:type="spellEnd"/>
+      <w:r>
+        <w:rPr>
+          <w:lang w:val="en-GB"/>
+        </w:rPr>
+        <w:t xml:space="preserve"> </w:t>
+      </w:r>
+      <w:proofErr w:type="spellStart"/>
+      <w:r>
+        <w:rPr>
+          <w:lang w:val="en-GB"/>
+        </w:rPr>
+        <w:t>raza</w:t>
+      </w:r>
+      <w:proofErr w:type="spellEnd"/>
+      <w:r>
+        <w:rPr>
+          <w:lang w:val="en-GB"/>
+        </w:rPr>
+        <w:t xml:space="preserve"> de </w:t>
+      </w:r>
+      <w:proofErr w:type="spellStart"/>
+      <w:r>
+        <w:rPr>
+          <w:lang w:val="en-GB"/>
+        </w:rPr>
+        <w:t>interacțiune</w:t>
+      </w:r>
+      <w:proofErr w:type="spellEnd"/>
+      <w:r>
+        <w:rPr>
+          <w:lang w:val="en-GB"/>
+        </w:rPr>
+        <w:t xml:space="preserve"> a </w:t>
+      </w:r>
+      <w:proofErr w:type="spellStart"/>
+      <w:r>
+        <w:rPr>
+          <w:lang w:val="en-GB"/>
+        </w:rPr>
+        <w:t>jucătorului</w:t>
+      </w:r>
+      <w:proofErr w:type="spellEnd"/>
       <w:r>
         <w:rPr>
           <w:lang w:val="en-GB"/>
@@ -1337,7 +2911,25 @@
           <w:szCs w:val="28"/>
           <w:lang w:val="en-GB"/>
         </w:rPr>
-        <w:t xml:space="preserve"> Apart from these, some other notable features would be its high replayability through a well put together weapon system and randomized level layout.</w:t>
+        <w:t xml:space="preserve"> Apart from these, some other notable features would be its high </w:t>
+      </w:r>
+      <w:proofErr w:type="spellStart"/>
+      <w:r>
+        <w:rPr>
+          <w:iCs/>
+          <w:szCs w:val="28"/>
+          <w:lang w:val="en-GB"/>
+        </w:rPr>
+        <w:t>replayability</w:t>
+      </w:r>
+      <w:proofErr w:type="spellEnd"/>
+      <w:r>
+        <w:rPr>
+          <w:iCs/>
+          <w:szCs w:val="28"/>
+          <w:lang w:val="en-GB"/>
+        </w:rPr>
+        <w:t xml:space="preserve"> through a well put together weapon system and randomized level layout.</w:t>
       </w:r>
     </w:p>
     <w:p>
@@ -1546,6 +3138,7 @@
         <w:t xml:space="preserve">(source: </w:t>
       </w:r>
       <w:hyperlink r:id="rId9" w:history="1">
+        <w:proofErr w:type="spellStart"/>
         <w:r>
           <w:rPr>
             <w:rStyle w:val="Hyperlink"/>
@@ -1554,6 +3147,7 @@
           </w:rPr>
           <w:t>Retronator</w:t>
         </w:r>
+        <w:proofErr w:type="spellEnd"/>
       </w:hyperlink>
       <w:r>
         <w:rPr>
@@ -1610,15 +3204,51 @@
           <w:szCs w:val="28"/>
           <w:lang w:val="en-GB"/>
         </w:rPr>
-        <w:t xml:space="preserve">video game developed by Team Cherry which sets itself apart with mechanics such as precision platforming, unlockable abilities (e.g. double jump, dash). This game, </w:t>
-      </w:r>
+        <w:t>video game developed by Team Cherry which sets itself apart with mechanics such as precision platforming, unlockable abilities (</w:t>
+      </w:r>
+      <w:proofErr w:type="gramStart"/>
       <w:r>
         <w:rPr>
           <w:iCs/>
           <w:szCs w:val="28"/>
           <w:lang w:val="en-GB"/>
         </w:rPr>
-        <w:t>stands apart from the others through its metroidvania elements; this implies that Hollow Knight isn’t your typical platformer where the player has a clear path to go through. In this game, you can explore different areas with different levels of difficulties, some may even need you to unlock new abilities in order to access them. The game was developed in Unity using hand-drawn animations, another feature that makes it remark itself by its aest</w:t>
+        <w:t>e.g.</w:t>
+      </w:r>
+      <w:proofErr w:type="gramEnd"/>
+      <w:r>
+        <w:rPr>
+          <w:iCs/>
+          <w:szCs w:val="28"/>
+          <w:lang w:val="en-GB"/>
+        </w:rPr>
+        <w:t xml:space="preserve"> double jump, dash). This game, </w:t>
+      </w:r>
+      <w:r>
+        <w:rPr>
+          <w:iCs/>
+          <w:szCs w:val="28"/>
+          <w:lang w:val="en-GB"/>
+        </w:rPr>
+        <w:t xml:space="preserve">stands apart from the others through its </w:t>
+      </w:r>
+      <w:proofErr w:type="spellStart"/>
+      <w:r>
+        <w:rPr>
+          <w:iCs/>
+          <w:szCs w:val="28"/>
+          <w:lang w:val="en-GB"/>
+        </w:rPr>
+        <w:t>metroidvania</w:t>
+      </w:r>
+      <w:proofErr w:type="spellEnd"/>
+      <w:r>
+        <w:rPr>
+          <w:iCs/>
+          <w:szCs w:val="28"/>
+          <w:lang w:val="en-GB"/>
+        </w:rPr>
+        <w:t xml:space="preserve"> elements; this implies that Hollow Knight isn’t your typical platformer where the player has a clear path to go through. In this game, you can explore different areas with different levels of difficulties, some may even need you to unlock new abilities in order to access them. The game was developed in Unity using hand-drawn animations, another feature that makes it remark itself by its aest</w:t>
       </w:r>
       <w:r>
         <w:rPr>
@@ -1729,9 +3359,28 @@
           <w:szCs w:val="28"/>
           <w:lang w:val="en-GB"/>
         </w:rPr>
-        <w:t xml:space="preserve">Figure 2.1.1- Showcase of Hollow Knight’s Metroidvania aspect (source: </w:t>
+        <w:t xml:space="preserve">Figure 2.1.1- Showcase of Hollow Knight’s </w:t>
+      </w:r>
+      <w:proofErr w:type="spellStart"/>
+      <w:r>
+        <w:rPr>
+          <w:iCs/>
+          <w:szCs w:val="28"/>
+          <w:lang w:val="en-GB"/>
+        </w:rPr>
+        <w:t>Metroidvania</w:t>
+      </w:r>
+      <w:proofErr w:type="spellEnd"/>
+      <w:r>
+        <w:rPr>
+          <w:iCs/>
+          <w:szCs w:val="28"/>
+          <w:lang w:val="en-GB"/>
+        </w:rPr>
+        <w:t xml:space="preserve"> aspect (source: </w:t>
       </w:r>
       <w:hyperlink r:id="rId11" w:history="1">
+        <w:proofErr w:type="spellStart"/>
         <w:r>
           <w:rPr>
             <w:rStyle w:val="Hyperlink"/>
@@ -1741,6 +3390,7 @@
           </w:rPr>
           <w:t>VGChartz</w:t>
         </w:r>
+        <w:proofErr w:type="spellEnd"/>
       </w:hyperlink>
       <w:r>
         <w:rPr>
@@ -1782,23 +3432,25 @@
           <w:szCs w:val="28"/>
           <w:lang w:val="en-GB"/>
         </w:rPr>
-        <w:t>is a rogue-lite video game developed by SuperGiant Games and similar to Dead Cells, it features procedural dungeon generation, boss encounters, but adds its own touch t</w:t>
-      </w:r>
+        <w:t xml:space="preserve">is a rogue-lite video game developed by </w:t>
+      </w:r>
+      <w:proofErr w:type="spellStart"/>
       <w:r>
         <w:rPr>
           <w:iCs/>
           <w:szCs w:val="28"/>
           <w:lang w:val="en-GB"/>
         </w:rPr>
-        <w:t>hr</w:t>
-      </w:r>
+        <w:t>SuperGiant</w:t>
+      </w:r>
+      <w:proofErr w:type="spellEnd"/>
       <w:r>
         <w:rPr>
           <w:iCs/>
           <w:szCs w:val="28"/>
           <w:lang w:val="en-GB"/>
         </w:rPr>
-        <w:t xml:space="preserve">ough ability combos that are unlocked via boons, hub world, as well as rich voice-acted narrative. </w:t>
+        <w:t xml:space="preserve"> Games and similar to Dead Cells, it features procedural dungeon generation, boss encounters, but adds its own touch t</w:t>
       </w:r>
       <w:r>
         <w:rPr>
@@ -1806,7 +3458,41 @@
           <w:szCs w:val="28"/>
           <w:lang w:val="en-GB"/>
         </w:rPr>
-        <w:t xml:space="preserve">Hades sets itself apart through its rich and captivating story, encouraging replayability in </w:t>
+        <w:t>hr</w:t>
+      </w:r>
+      <w:r>
+        <w:rPr>
+          <w:iCs/>
+          <w:szCs w:val="28"/>
+          <w:lang w:val="en-GB"/>
+        </w:rPr>
+        <w:t xml:space="preserve">ough ability combos that are unlocked via boons, hub world, as well as rich voice-acted narrative. </w:t>
+      </w:r>
+      <w:r>
+        <w:rPr>
+          <w:iCs/>
+          <w:szCs w:val="28"/>
+          <w:lang w:val="en-GB"/>
+        </w:rPr>
+        <w:t xml:space="preserve">Hades sets itself apart through its rich and captivating story, encouraging </w:t>
+      </w:r>
+      <w:proofErr w:type="spellStart"/>
+      <w:r>
+        <w:rPr>
+          <w:iCs/>
+          <w:szCs w:val="28"/>
+          <w:lang w:val="en-GB"/>
+        </w:rPr>
+        <w:t>replayability</w:t>
+      </w:r>
+      <w:proofErr w:type="spellEnd"/>
+      <w:r>
+        <w:rPr>
+          <w:iCs/>
+          <w:szCs w:val="28"/>
+          <w:lang w:val="en-GB"/>
+        </w:rPr>
+        <w:t xml:space="preserve"> in </w:t>
       </w:r>
       <w:r>
         <w:rPr>
@@ -2003,7 +3689,24 @@
           <w:szCs w:val="28"/>
           <w:lang w:val="en-GB"/>
         </w:rPr>
-        <w:t>Figure 2.1.2- Showcase of Hades’ Boon System(source:</w:t>
+        <w:t xml:space="preserve">Figure 2.1.2- Showcase of Hades’ Boon </w:t>
+      </w:r>
+      <w:proofErr w:type="gramStart"/>
+      <w:r>
+        <w:rPr>
+          <w:szCs w:val="28"/>
+          <w:lang w:val="en-GB"/>
+        </w:rPr>
+        <w:t>System(</w:t>
+      </w:r>
+      <w:proofErr w:type="spellStart"/>
+      <w:proofErr w:type="gramEnd"/>
+      <w:r>
+        <w:rPr>
+          <w:szCs w:val="28"/>
+          <w:lang w:val="en-GB"/>
+        </w:rPr>
+        <w:t>source:</w:t>
       </w:r>
       <w:hyperlink r:id="rId13" w:history="1">
         <w:r>
@@ -2014,6 +3717,7 @@
           </w:rPr>
           <w:t>Boons</w:t>
         </w:r>
+        <w:proofErr w:type="spellEnd"/>
       </w:hyperlink>
       <w:r>
         <w:rPr>
@@ -2114,7 +3818,35 @@
         <w:rPr>
           <w:lang w:val="en-GB"/>
         </w:rPr>
-        <w:t>procedurally generated rooms, are riddled with enemies, traps, items(that could be the ones that unlock abilities or simply health pickups that give you health back) and also different types of decorations, that can help ease your playthrough.</w:t>
+        <w:t xml:space="preserve">procedurally generated rooms, are riddled with enemies, traps, </w:t>
+      </w:r>
+      <w:proofErr w:type="gramStart"/>
+      <w:r>
+        <w:rPr>
+          <w:lang w:val="en-GB"/>
+        </w:rPr>
+        <w:t>items(</w:t>
+      </w:r>
+      <w:proofErr w:type="gramEnd"/>
+      <w:r>
+        <w:rPr>
+          <w:lang w:val="en-GB"/>
+        </w:rPr>
+        <w:t xml:space="preserve">that could be the ones that unlock abilities or simply health pickups that give </w:t>
+      </w:r>
+      <w:proofErr w:type="spellStart"/>
+      <w:r>
+        <w:rPr>
+          <w:lang w:val="en-GB"/>
+        </w:rPr>
+        <w:t>you</w:t>
+      </w:r>
+      <w:proofErr w:type="spellEnd"/>
+      <w:r>
+        <w:rPr>
+          <w:lang w:val="en-GB"/>
+        </w:rPr>
+        <w:t xml:space="preserve"> health back) and also different types of decorations, that can help ease your playthrough.</w:t>
       </w:r>
     </w:p>
     <w:p>
@@ -2129,7 +3861,21 @@
         <w:rPr>
           <w:lang w:val="en-GB"/>
         </w:rPr>
-        <w:t>Figure 2.1.3- Showcase of one such procedurally generated room(source: screenshot)</w:t>
+        <w:t xml:space="preserve">Figure 2.1.3- Showcase of one such procedurally generated </w:t>
+      </w:r>
+      <w:proofErr w:type="gramStart"/>
+      <w:r>
+        <w:rPr>
+          <w:lang w:val="en-GB"/>
+        </w:rPr>
+        <w:t>room(</w:t>
+      </w:r>
+      <w:proofErr w:type="gramEnd"/>
+      <w:r>
+        <w:rPr>
+          <w:lang w:val="en-GB"/>
+        </w:rPr>
+        <w:t>source: screenshot)</w:t>
       </w:r>
     </w:p>
     <w:p>
@@ -2355,7 +4101,21 @@
           <w:lang w:val="en-GB"/>
         </w:rPr>
         <w:lastRenderedPageBreak/>
-        <w:t>respective “item” system, namely Hades with the Boons and Hollow Knight with charms. While these games may take a more complex approach to their combat system, Sword of Time follows a more simplistic approach, that forces the player to be efficient and precise  with their movement and attacks</w:t>
+        <w:t xml:space="preserve">respective “item” system, namely Hades with the Boons and Hollow Knight with charms. While these games may take a more complex approach to their combat system, Sword of Time follows a more simplistic approach, that forces the player to be efficient and </w:t>
+      </w:r>
+      <w:proofErr w:type="gramStart"/>
+      <w:r>
+        <w:rPr>
+          <w:lang w:val="en-GB"/>
+        </w:rPr>
+        <w:t>precise  with</w:t>
+      </w:r>
+      <w:proofErr w:type="gramEnd"/>
+      <w:r>
+        <w:rPr>
+          <w:lang w:val="en-GB"/>
+        </w:rPr>
+        <w:t xml:space="preserve"> their movement and attacks</w:t>
       </w:r>
       <w:r>
         <w:rPr>
@@ -2408,7 +4168,35 @@
         <w:rPr>
           <w:lang w:val="en-GB"/>
         </w:rPr>
-        <w:t>start from the beginning with nothing that you had on the previous run present on you. This ensures a challenging experience, making every action matter, even though at time it can be frustrating, it brings novelty to each playthrough. Hollow Knight on the other hand, takes the metroidvania genre approach, upon death, the player may lose some currency, but whatever items he had previously on him, stay even after death. Furthermore Hollow Knight has checkpoints system, meaning you don’t have to start from the beginning every time you die</w:t>
+        <w:t xml:space="preserve">start from the beginning with nothing that you had on the previous run present on you. This ensures a challenging experience, making every action matter, even though at time it can be frustrating, it brings novelty to each playthrough. Hollow Knight on the other hand, takes the </w:t>
+      </w:r>
+      <w:proofErr w:type="spellStart"/>
+      <w:r>
+        <w:rPr>
+          <w:lang w:val="en-GB"/>
+        </w:rPr>
+        <w:t>metroidvania</w:t>
+      </w:r>
+      <w:proofErr w:type="spellEnd"/>
+      <w:r>
+        <w:rPr>
+          <w:lang w:val="en-GB"/>
+        </w:rPr>
+        <w:t xml:space="preserve"> genre approach, upon death, the player may lose some currency, but whatever items he had previously on him, stay even after death. </w:t>
+      </w:r>
+      <w:proofErr w:type="gramStart"/>
+      <w:r>
+        <w:rPr>
+          <w:lang w:val="en-GB"/>
+        </w:rPr>
+        <w:t>Furthermore</w:t>
+      </w:r>
+      <w:proofErr w:type="gramEnd"/>
+      <w:r>
+        <w:rPr>
+          <w:lang w:val="en-GB"/>
+        </w:rPr>
+        <w:t xml:space="preserve"> Hollow Knight has checkpoints system, meaning you don’t have to start from the beginning every time you die</w:t>
       </w:r>
       <w:r>
         <w:rPr>
@@ -2457,7 +4245,21 @@
         <w:rPr>
           <w:lang w:val="en-GB"/>
         </w:rPr>
-        <w:t>a stylish and minimalist 2.5D art. Sword of Time also makes use of things such a particle system and grayscaling, that activate upon using the Rewinding Time ability, making the experience overall more immersive. Dead Cells on the other hand fully embraces pixel art, well mixing the 2D and 3D aspects of it, while Hades sets the tone with vibrant animations that make for an enjoyable visual experience.</w:t>
+        <w:t xml:space="preserve">a stylish and minimalist 2.5D art. Sword of Time also makes use of things such a particle system and </w:t>
+      </w:r>
+      <w:proofErr w:type="spellStart"/>
+      <w:r>
+        <w:rPr>
+          <w:lang w:val="en-GB"/>
+        </w:rPr>
+        <w:t>grayscaling</w:t>
+      </w:r>
+      <w:proofErr w:type="spellEnd"/>
+      <w:r>
+        <w:rPr>
+          <w:lang w:val="en-GB"/>
+        </w:rPr>
+        <w:t>, that activate upon using the Rewinding Time ability, making the experience overall more immersive. Dead Cells on the other hand fully embraces pixel art, well mixing the 2D and 3D aspects of it, while Hades sets the tone with vibrant animations that make for an enjoyable visual experience.</w:t>
       </w:r>
     </w:p>
     <w:p>
@@ -2811,11 +4613,19 @@
                 <w:lang w:val="en-GB"/>
               </w:rPr>
             </w:pPr>
+            <w:proofErr w:type="spellStart"/>
             <w:r>
               <w:rPr>
                 <w:lang w:val="en-GB"/>
               </w:rPr>
-              <w:t>Metroidvania, ability-based map access</w:t>
+              <w:t>Metroidvania</w:t>
+            </w:r>
+            <w:proofErr w:type="spellEnd"/>
+            <w:r>
+              <w:rPr>
+                <w:lang w:val="en-GB"/>
+              </w:rPr>
+              <w:t>, ability-based map access</w:t>
             </w:r>
           </w:p>
         </w:tc>
@@ -3486,7 +5296,47 @@
           <w:szCs w:val="24"/>
           <w:lang w:val="en-GB"/>
         </w:rPr>
-        <w:t>Component-Based Design -&gt; used to modularize functionality into reusable scripts, such as EnemyPatrol.cs and HealthSystem.cs scripts, that don’t have only one single purpose.</w:t>
+        <w:t xml:space="preserve">Component-Based Design -&gt; used to modularize functionality into reusable scripts, such as </w:t>
+      </w:r>
+      <w:proofErr w:type="spellStart"/>
+      <w:r>
+        <w:rPr>
+          <w:rFonts w:ascii="Arial" w:hAnsi="Arial" w:cs="Arial"/>
+          <w:sz w:val="24"/>
+          <w:szCs w:val="24"/>
+          <w:lang w:val="en-GB"/>
+        </w:rPr>
+        <w:t>EnemyPatrol.cs</w:t>
+      </w:r>
+      <w:proofErr w:type="spellEnd"/>
+      <w:r>
+        <w:rPr>
+          <w:rFonts w:ascii="Arial" w:hAnsi="Arial" w:cs="Arial"/>
+          <w:sz w:val="24"/>
+          <w:szCs w:val="24"/>
+          <w:lang w:val="en-GB"/>
+        </w:rPr>
+        <w:t xml:space="preserve"> and </w:t>
+      </w:r>
+      <w:proofErr w:type="spellStart"/>
+      <w:r>
+        <w:rPr>
+          <w:rFonts w:ascii="Arial" w:hAnsi="Arial" w:cs="Arial"/>
+          <w:sz w:val="24"/>
+          <w:szCs w:val="24"/>
+          <w:lang w:val="en-GB"/>
+        </w:rPr>
+        <w:t>HealthSystem.cs</w:t>
+      </w:r>
+      <w:proofErr w:type="spellEnd"/>
+      <w:r>
+        <w:rPr>
+          <w:rFonts w:ascii="Arial" w:hAnsi="Arial" w:cs="Arial"/>
+          <w:sz w:val="24"/>
+          <w:szCs w:val="24"/>
+          <w:lang w:val="en-GB"/>
+        </w:rPr>
+        <w:t xml:space="preserve"> scripts, that don’t have only one single purpose.</w:t>
       </w:r>
     </w:p>
     <w:p>
@@ -3843,8 +5693,16 @@
         <w:rPr>
           <w:lang w:val="en-GB"/>
         </w:rPr>
-        <w:t>is done through direct manipulation of the enemy’s Transform.position</w:t>
-      </w:r>
+        <w:t xml:space="preserve">is done through direct manipulation of the enemy’s </w:t>
+      </w:r>
+      <w:proofErr w:type="spellStart"/>
+      <w:r>
+        <w:rPr>
+          <w:lang w:val="en-GB"/>
+        </w:rPr>
+        <w:t>Transform.position</w:t>
+      </w:r>
+      <w:proofErr w:type="spellEnd"/>
       <w:r>
         <w:rPr>
           <w:lang w:val="en-GB"/>
@@ -3867,7 +5725,21 @@
         <w:rPr>
           <w:lang w:val="en-GB"/>
         </w:rPr>
-        <w:t>to the way an enemy patrols. The animator triggers in order to sync movement with visual state.</w:t>
+        <w:t xml:space="preserve">to the way an </w:t>
+      </w:r>
+      <w:proofErr w:type="gramStart"/>
+      <w:r>
+        <w:rPr>
+          <w:lang w:val="en-GB"/>
+        </w:rPr>
+        <w:t>enemy patrols</w:t>
+      </w:r>
+      <w:proofErr w:type="gramEnd"/>
+      <w:r>
+        <w:rPr>
+          <w:lang w:val="en-GB"/>
+        </w:rPr>
+        <w:t>. The animator triggers in order to sync movement with visual state.</w:t>
       </w:r>
     </w:p>
     <w:p>
@@ -4014,7 +5886,21 @@
         <w:rPr>
           <w:lang w:val="en-GB"/>
         </w:rPr>
-        <w:t>brings a unique take on the gameplay depth. Through it players can correct mistakes, escape traps or plan attacks in a strategic way. Time Rewind affects both the player and environment, making the player immune to damage while rewinding and the enemies immobilized, allowing for breathing room. The way this mechanic works is that it stores the positions and rotations in a buffer, and when triggered, time is reversed by restoring the previous positions/rotations frame-by-frame.</w:t>
+        <w:t xml:space="preserve">brings a unique take on the gameplay depth. Through </w:t>
+      </w:r>
+      <w:proofErr w:type="gramStart"/>
+      <w:r>
+        <w:rPr>
+          <w:lang w:val="en-GB"/>
+        </w:rPr>
+        <w:t>it</w:t>
+      </w:r>
+      <w:proofErr w:type="gramEnd"/>
+      <w:r>
+        <w:rPr>
+          <w:lang w:val="en-GB"/>
+        </w:rPr>
+        <w:t xml:space="preserve"> players can correct mistakes, escape traps or plan attacks in a strategic way. Time Rewind affects both the player and environment, making the player immune to damage while rewinding and the enemies immobilized, allowing for breathing room. The way this mechanic works is that it stores the positions and rotations in a buffer, and when triggered, time is reversed by restoring the previous positions/rotations frame-by-frame.</w:t>
       </w:r>
     </w:p>
     <w:p>
@@ -4041,7 +5927,21 @@
         <w:rPr>
           <w:lang w:val="en-GB"/>
         </w:rPr>
-        <w:t xml:space="preserve"> The other objects such as traps also include a TimeRewind component that manages their own recorded state. This way, it allows for reusable rewind behaviour across multiple object types, making them affected by this ability. In order to create an immersive experience, Unity’s Volume system comes into play, through enabling the grayscale effect and particles during the use of the ability.</w:t>
+        <w:t xml:space="preserve"> The other objects such as traps also include a </w:t>
+      </w:r>
+      <w:proofErr w:type="spellStart"/>
+      <w:r>
+        <w:rPr>
+          <w:lang w:val="en-GB"/>
+        </w:rPr>
+        <w:t>TimeRewind</w:t>
+      </w:r>
+      <w:proofErr w:type="spellEnd"/>
+      <w:r>
+        <w:rPr>
+          <w:lang w:val="en-GB"/>
+        </w:rPr>
+        <w:t xml:space="preserve"> component that manages their own recorded state. This way, it allows for reusable rewind behaviour across multiple object types, making them affected by this ability. In order to create an immersive experience, Unity’s Volume system comes into play, through enabling the grayscale effect and particles during the use of the ability.</w:t>
       </w:r>
     </w:p>
     <w:p>
@@ -4453,7 +6353,35 @@
         <w:rPr>
           <w:lang w:val="en-GB"/>
         </w:rPr>
-        <w:t>The game Sword of Time centers around rogue-like mechanics in a procedurally generated 2D platformer environment. The player explores rooms, battles enemies and makes use of his abilities strategically to overcome obstacles. The overall game architecture is designed in a modular, component based manner, allowing systems like combat, movement and enemy AI to function independently yet interact seamlessly.</w:t>
+        <w:t xml:space="preserve">The game Sword of Time </w:t>
+      </w:r>
+      <w:proofErr w:type="spellStart"/>
+      <w:r>
+        <w:rPr>
+          <w:lang w:val="en-GB"/>
+        </w:rPr>
+        <w:t>centers</w:t>
+      </w:r>
+      <w:proofErr w:type="spellEnd"/>
+      <w:r>
+        <w:rPr>
+          <w:lang w:val="en-GB"/>
+        </w:rPr>
+        <w:t xml:space="preserve"> around rogue-like mechanics in a procedurally generated 2D platformer environment. The player explores rooms, battles enemies and makes use of his abilities strategically to overcome obstacles. The overall game architecture is designed in a modular, </w:t>
+      </w:r>
+      <w:proofErr w:type="gramStart"/>
+      <w:r>
+        <w:rPr>
+          <w:lang w:val="en-GB"/>
+        </w:rPr>
+        <w:t>component based</w:t>
+      </w:r>
+      <w:proofErr w:type="gramEnd"/>
+      <w:r>
+        <w:rPr>
+          <w:lang w:val="en-GB"/>
+        </w:rPr>
+        <w:t xml:space="preserve"> manner, allowing systems like combat, movement and enemy AI to function independently yet interact seamlessly.</w:t>
       </w:r>
     </w:p>
     <w:p>
@@ -4598,8 +6526,9 @@
           <w:szCs w:val="24"/>
           <w:lang w:val="en-GB"/>
         </w:rPr>
-        <w:t xml:space="preserve">is made out of ranged attacks with a fireball when it comes to the player’s perspective. When it comes to the enemies they can have melee attacks with swords or ranged attacks with fireballs. The boss has a mix of </w:t>
-      </w:r>
+        <w:t xml:space="preserve">is made out of ranged attacks with a fireball when it comes to the player’s perspective. When it comes to the </w:t>
+      </w:r>
+      <w:proofErr w:type="gramStart"/>
       <w:r>
         <w:rPr>
           <w:rFonts w:ascii="Arial" w:hAnsi="Arial" w:cs="Arial"/>
@@ -4607,8 +6536,67 @@
           <w:szCs w:val="24"/>
           <w:lang w:val="en-GB"/>
         </w:rPr>
+        <w:t>enemies</w:t>
+      </w:r>
+      <w:proofErr w:type="gramEnd"/>
+      <w:r>
+        <w:rPr>
+          <w:rFonts w:ascii="Arial" w:hAnsi="Arial" w:cs="Arial"/>
+          <w:sz w:val="24"/>
+          <w:szCs w:val="24"/>
+          <w:lang w:val="en-GB"/>
+        </w:rPr>
+        <w:t xml:space="preserve"> they can have melee attacks with swords or ranged attacks with fireballs. The boss has a mix of </w:t>
+      </w:r>
+      <w:r>
+        <w:rPr>
+          <w:rFonts w:ascii="Arial" w:hAnsi="Arial" w:cs="Arial"/>
+          <w:sz w:val="24"/>
+          <w:szCs w:val="24"/>
+          <w:lang w:val="en-GB"/>
+        </w:rPr>
         <w:lastRenderedPageBreak/>
-        <w:t>ranged and melee attacks, making him more unpredictable then the rest of the enemy npcs.</w:t>
+        <w:t xml:space="preserve">ranged and melee attacks, making him more unpredictable </w:t>
+      </w:r>
+      <w:proofErr w:type="gramStart"/>
+      <w:r>
+        <w:rPr>
+          <w:rFonts w:ascii="Arial" w:hAnsi="Arial" w:cs="Arial"/>
+          <w:sz w:val="24"/>
+          <w:szCs w:val="24"/>
+          <w:lang w:val="en-GB"/>
+        </w:rPr>
+        <w:t>then</w:t>
+      </w:r>
+      <w:proofErr w:type="gramEnd"/>
+      <w:r>
+        <w:rPr>
+          <w:rFonts w:ascii="Arial" w:hAnsi="Arial" w:cs="Arial"/>
+          <w:sz w:val="24"/>
+          <w:szCs w:val="24"/>
+          <w:lang w:val="en-GB"/>
+        </w:rPr>
+        <w:t xml:space="preserve"> the rest of the enemy </w:t>
+      </w:r>
+      <w:proofErr w:type="spellStart"/>
+      <w:r>
+        <w:rPr>
+          <w:rFonts w:ascii="Arial" w:hAnsi="Arial" w:cs="Arial"/>
+          <w:sz w:val="24"/>
+          <w:szCs w:val="24"/>
+          <w:lang w:val="en-GB"/>
+        </w:rPr>
+        <w:t>npcs</w:t>
+      </w:r>
+      <w:proofErr w:type="spellEnd"/>
+      <w:r>
+        <w:rPr>
+          <w:rFonts w:ascii="Arial" w:hAnsi="Arial" w:cs="Arial"/>
+          <w:sz w:val="24"/>
+          <w:szCs w:val="24"/>
+          <w:lang w:val="en-GB"/>
+        </w:rPr>
+        <w:t>.</w:t>
       </w:r>
     </w:p>
     <w:p>
@@ -4645,7 +6633,27 @@
           <w:szCs w:val="24"/>
           <w:lang w:val="en-GB"/>
         </w:rPr>
-        <w:t xml:space="preserve"> can be of several types. The most important ones would be the time rewind and wind dashing abilities. Through time rewind the player goes back in time a few seconds, enemies and traps stop from moving, and he is immune during the rewind. Wind Dash provides the player the ability to transform into wind and pass through objects, traps or even enemies in order to avoid combat. There can also be abilities such as jump enhancing, where the player can double jump or even triple jump, or even abilities that enhance the player’s attack.</w:t>
+        <w:t xml:space="preserve"> can be of several types. The most important ones would be the time rewind and wind dashing abilities. Through time rewind the player goes back in time a few seconds, enemies and traps stop from moving, and he is immune during the rewind. Wind Dash provides the player the ability to transform into wind and </w:t>
+      </w:r>
+      <w:proofErr w:type="gramStart"/>
+      <w:r>
+        <w:rPr>
+          <w:rFonts w:ascii="Arial" w:hAnsi="Arial" w:cs="Arial"/>
+          <w:sz w:val="24"/>
+          <w:szCs w:val="24"/>
+          <w:lang w:val="en-GB"/>
+        </w:rPr>
+        <w:t>pass through</w:t>
+      </w:r>
+      <w:proofErr w:type="gramEnd"/>
+      <w:r>
+        <w:rPr>
+          <w:rFonts w:ascii="Arial" w:hAnsi="Arial" w:cs="Arial"/>
+          <w:sz w:val="24"/>
+          <w:szCs w:val="24"/>
+          <w:lang w:val="en-GB"/>
+        </w:rPr>
+        <w:t xml:space="preserve"> objects, traps or even enemies in order to avoid combat. There can also be abilities such as jump enhancing, where the player can double jump or even triple jump, or even abilities that enhance the player’s attack.</w:t>
       </w:r>
     </w:p>
     <w:p>
@@ -4764,7 +6772,27 @@
           <w:szCs w:val="24"/>
           <w:lang w:val="en-GB"/>
         </w:rPr>
-        <w:t>is done through the player completing the rooms he has in front of him, namely surviving the room and reaching the next one, until he reaches the boss room. After the boss is defeated the game is completed</w:t>
+        <w:t xml:space="preserve">is done through the player completing the rooms he has in front of him, namely surviving the room and reaching the next one, until he reaches the boss room. After the boss is </w:t>
+      </w:r>
+      <w:proofErr w:type="gramStart"/>
+      <w:r>
+        <w:rPr>
+          <w:rFonts w:ascii="Arial" w:hAnsi="Arial" w:cs="Arial"/>
+          <w:sz w:val="24"/>
+          <w:szCs w:val="24"/>
+          <w:lang w:val="en-GB"/>
+        </w:rPr>
+        <w:t>defeated</w:t>
+      </w:r>
+      <w:proofErr w:type="gramEnd"/>
+      <w:r>
+        <w:rPr>
+          <w:rFonts w:ascii="Arial" w:hAnsi="Arial" w:cs="Arial"/>
+          <w:sz w:val="24"/>
+          <w:szCs w:val="24"/>
+          <w:lang w:val="en-GB"/>
+        </w:rPr>
+        <w:t xml:space="preserve"> the game is completed</w:t>
       </w:r>
     </w:p>
     <w:p>
@@ -5109,7 +7137,27 @@
           <w:szCs w:val="24"/>
           <w:lang w:val="en-GB"/>
         </w:rPr>
-        <w:t>has components such as ground, ceiling and wall tiles and is responsible for placing them in the right position. Ground and ceiling tiles are placed using roomSize.x for horizontal layout, while the wall is placed once per room.</w:t>
+        <w:t xml:space="preserve">has components such as ground, ceiling and wall tiles and is responsible for placing them in the right position. Ground and ceiling tiles are placed using </w:t>
+      </w:r>
+      <w:proofErr w:type="spellStart"/>
+      <w:r>
+        <w:rPr>
+          <w:rFonts w:ascii="Arial" w:hAnsi="Arial" w:cs="Arial"/>
+          <w:sz w:val="24"/>
+          <w:szCs w:val="24"/>
+          <w:lang w:val="en-GB"/>
+        </w:rPr>
+        <w:t>roomSize.x</w:t>
+      </w:r>
+      <w:proofErr w:type="spellEnd"/>
+      <w:r>
+        <w:rPr>
+          <w:rFonts w:ascii="Arial" w:hAnsi="Arial" w:cs="Arial"/>
+          <w:sz w:val="24"/>
+          <w:szCs w:val="24"/>
+          <w:lang w:val="en-GB"/>
+        </w:rPr>
+        <w:t xml:space="preserve"> for horizontal layout, while the wall is placed once per room.</w:t>
       </w:r>
     </w:p>
     <w:p>
@@ -5147,7 +7195,27 @@
           <w:szCs w:val="24"/>
           <w:lang w:val="en-GB"/>
         </w:rPr>
-        <w:t>’ responsibility is to spawn traps between an input given interval. The traps can be SpikeHeads, Saws or Spikes</w:t>
+        <w:t xml:space="preserve">’ responsibility is to spawn traps between an input given interval. The traps can be </w:t>
+      </w:r>
+      <w:proofErr w:type="spellStart"/>
+      <w:r>
+        <w:rPr>
+          <w:rFonts w:ascii="Arial" w:hAnsi="Arial" w:cs="Arial"/>
+          <w:sz w:val="24"/>
+          <w:szCs w:val="24"/>
+          <w:lang w:val="en-GB"/>
+        </w:rPr>
+        <w:t>SpikeHeads</w:t>
+      </w:r>
+      <w:proofErr w:type="spellEnd"/>
+      <w:r>
+        <w:rPr>
+          <w:rFonts w:ascii="Arial" w:hAnsi="Arial" w:cs="Arial"/>
+          <w:sz w:val="24"/>
+          <w:szCs w:val="24"/>
+          <w:lang w:val="en-GB"/>
+        </w:rPr>
+        <w:t>, Saws or Spikes</w:t>
       </w:r>
       <w:r>
         <w:rPr>
@@ -5232,7 +7300,27 @@
           <w:szCs w:val="24"/>
           <w:lang w:val="en-GB"/>
         </w:rPr>
-        <w:t>has 2 types of enemies it can select from: static and patrolling enemies. Static enemies are taken from an array called EnemyPrefab and it contains both melee and ranged enemies. In a similar manner the ranged and melee patrolling enemies are handled. There is a 50% chance to spawn a patrolling enemy, its type being randomly chosen.</w:t>
+        <w:t xml:space="preserve">has 2 types of enemies it can select from: static and patrolling enemies. Static enemies are taken from an array called </w:t>
+      </w:r>
+      <w:proofErr w:type="spellStart"/>
+      <w:r>
+        <w:rPr>
+          <w:rFonts w:ascii="Arial" w:hAnsi="Arial" w:cs="Arial"/>
+          <w:sz w:val="24"/>
+          <w:szCs w:val="24"/>
+          <w:lang w:val="en-GB"/>
+        </w:rPr>
+        <w:t>EnemyPrefab</w:t>
+      </w:r>
+      <w:proofErr w:type="spellEnd"/>
+      <w:r>
+        <w:rPr>
+          <w:rFonts w:ascii="Arial" w:hAnsi="Arial" w:cs="Arial"/>
+          <w:sz w:val="24"/>
+          <w:szCs w:val="24"/>
+          <w:lang w:val="en-GB"/>
+        </w:rPr>
+        <w:t xml:space="preserve"> and it contains both melee and ranged enemies. In a similar manner the ranged and melee patrolling enemies are handled. There is a 50% chance to spawn a patrolling enemy, its type being randomly chosen.</w:t>
       </w:r>
     </w:p>
     <w:p>
@@ -5402,6 +7490,7 @@
           <w:lang w:val="en-GB"/>
         </w:rPr>
       </w:pPr>
+      <w:proofErr w:type="spellStart"/>
       <w:r>
         <w:rPr>
           <w:rFonts w:ascii="Arial" w:hAnsi="Arial" w:cs="Arial"/>
@@ -5422,7 +7511,19 @@
           <w:szCs w:val="24"/>
           <w:lang w:val="en-GB"/>
         </w:rPr>
-        <w:t xml:space="preserve">’s </w:t>
+        <w:t>’s</w:t>
+      </w:r>
+      <w:proofErr w:type="spellEnd"/>
+      <w:r>
+        <w:rPr>
+          <w:rFonts w:ascii="Arial" w:hAnsi="Arial" w:cs="Arial"/>
+          <w:b/>
+          <w:bCs/>
+          <w:sz w:val="24"/>
+          <w:szCs w:val="24"/>
+          <w:lang w:val="en-GB"/>
+        </w:rPr>
+        <w:t xml:space="preserve"> </w:t>
       </w:r>
       <w:r>
         <w:rPr>
@@ -5868,7 +7969,207 @@
           <w:szCs w:val="24"/>
           <w:lang w:val="en-GB"/>
         </w:rPr>
-        <w:t>class contains GameObjects such as firepoint, fireballHolder and particleSystem. The latter is used for the Rewind ability, with the purpose of giving rewind a more immersive aesthetic. PlayerMovement, PlayerAttack, PlayerAbility, PlayerMovement, Projectile are scripts linked to the player GameObject. For our purpose we will focus on how the PlayerAttack works.</w:t>
+        <w:t xml:space="preserve">class contains </w:t>
+      </w:r>
+      <w:proofErr w:type="spellStart"/>
+      <w:r>
+        <w:rPr>
+          <w:rFonts w:ascii="Arial" w:hAnsi="Arial" w:cs="Arial"/>
+          <w:sz w:val="24"/>
+          <w:szCs w:val="24"/>
+          <w:lang w:val="en-GB"/>
+        </w:rPr>
+        <w:t>GameObjects</w:t>
+      </w:r>
+      <w:proofErr w:type="spellEnd"/>
+      <w:r>
+        <w:rPr>
+          <w:rFonts w:ascii="Arial" w:hAnsi="Arial" w:cs="Arial"/>
+          <w:sz w:val="24"/>
+          <w:szCs w:val="24"/>
+          <w:lang w:val="en-GB"/>
+        </w:rPr>
+        <w:t xml:space="preserve"> such as </w:t>
+      </w:r>
+      <w:proofErr w:type="spellStart"/>
+      <w:r>
+        <w:rPr>
+          <w:rFonts w:ascii="Arial" w:hAnsi="Arial" w:cs="Arial"/>
+          <w:sz w:val="24"/>
+          <w:szCs w:val="24"/>
+          <w:lang w:val="en-GB"/>
+        </w:rPr>
+        <w:t>firepoint</w:t>
+      </w:r>
+      <w:proofErr w:type="spellEnd"/>
+      <w:r>
+        <w:rPr>
+          <w:rFonts w:ascii="Arial" w:hAnsi="Arial" w:cs="Arial"/>
+          <w:sz w:val="24"/>
+          <w:szCs w:val="24"/>
+          <w:lang w:val="en-GB"/>
+        </w:rPr>
+        <w:t xml:space="preserve">, </w:t>
+      </w:r>
+      <w:proofErr w:type="spellStart"/>
+      <w:r>
+        <w:rPr>
+          <w:rFonts w:ascii="Arial" w:hAnsi="Arial" w:cs="Arial"/>
+          <w:sz w:val="24"/>
+          <w:szCs w:val="24"/>
+          <w:lang w:val="en-GB"/>
+        </w:rPr>
+        <w:t>fireballHolder</w:t>
+      </w:r>
+      <w:proofErr w:type="spellEnd"/>
+      <w:r>
+        <w:rPr>
+          <w:rFonts w:ascii="Arial" w:hAnsi="Arial" w:cs="Arial"/>
+          <w:sz w:val="24"/>
+          <w:szCs w:val="24"/>
+          <w:lang w:val="en-GB"/>
+        </w:rPr>
+        <w:t xml:space="preserve"> and </w:t>
+      </w:r>
+      <w:proofErr w:type="spellStart"/>
+      <w:r>
+        <w:rPr>
+          <w:rFonts w:ascii="Arial" w:hAnsi="Arial" w:cs="Arial"/>
+          <w:sz w:val="24"/>
+          <w:szCs w:val="24"/>
+          <w:lang w:val="en-GB"/>
+        </w:rPr>
+        <w:t>particleSystem</w:t>
+      </w:r>
+      <w:proofErr w:type="spellEnd"/>
+      <w:r>
+        <w:rPr>
+          <w:rFonts w:ascii="Arial" w:hAnsi="Arial" w:cs="Arial"/>
+          <w:sz w:val="24"/>
+          <w:szCs w:val="24"/>
+          <w:lang w:val="en-GB"/>
+        </w:rPr>
+        <w:t xml:space="preserve">. The latter is used for the Rewind ability, with the purpose of giving rewind a more immersive aesthetic. </w:t>
+      </w:r>
+      <w:proofErr w:type="spellStart"/>
+      <w:r>
+        <w:rPr>
+          <w:rFonts w:ascii="Arial" w:hAnsi="Arial" w:cs="Arial"/>
+          <w:sz w:val="24"/>
+          <w:szCs w:val="24"/>
+          <w:lang w:val="en-GB"/>
+        </w:rPr>
+        <w:t>PlayerMovement</w:t>
+      </w:r>
+      <w:proofErr w:type="spellEnd"/>
+      <w:r>
+        <w:rPr>
+          <w:rFonts w:ascii="Arial" w:hAnsi="Arial" w:cs="Arial"/>
+          <w:sz w:val="24"/>
+          <w:szCs w:val="24"/>
+          <w:lang w:val="en-GB"/>
+        </w:rPr>
+        <w:t xml:space="preserve">, </w:t>
+      </w:r>
+      <w:proofErr w:type="spellStart"/>
+      <w:r>
+        <w:rPr>
+          <w:rFonts w:ascii="Arial" w:hAnsi="Arial" w:cs="Arial"/>
+          <w:sz w:val="24"/>
+          <w:szCs w:val="24"/>
+          <w:lang w:val="en-GB"/>
+        </w:rPr>
+        <w:t>PlayerAttack</w:t>
+      </w:r>
+      <w:proofErr w:type="spellEnd"/>
+      <w:r>
+        <w:rPr>
+          <w:rFonts w:ascii="Arial" w:hAnsi="Arial" w:cs="Arial"/>
+          <w:sz w:val="24"/>
+          <w:szCs w:val="24"/>
+          <w:lang w:val="en-GB"/>
+        </w:rPr>
+        <w:t xml:space="preserve">, </w:t>
+      </w:r>
+      <w:proofErr w:type="spellStart"/>
+      <w:r>
+        <w:rPr>
+          <w:rFonts w:ascii="Arial" w:hAnsi="Arial" w:cs="Arial"/>
+          <w:sz w:val="24"/>
+          <w:szCs w:val="24"/>
+          <w:lang w:val="en-GB"/>
+        </w:rPr>
+        <w:t>PlayerAbility</w:t>
+      </w:r>
+      <w:proofErr w:type="spellEnd"/>
+      <w:r>
+        <w:rPr>
+          <w:rFonts w:ascii="Arial" w:hAnsi="Arial" w:cs="Arial"/>
+          <w:sz w:val="24"/>
+          <w:szCs w:val="24"/>
+          <w:lang w:val="en-GB"/>
+        </w:rPr>
+        <w:t xml:space="preserve">, </w:t>
+      </w:r>
+      <w:proofErr w:type="spellStart"/>
+      <w:r>
+        <w:rPr>
+          <w:rFonts w:ascii="Arial" w:hAnsi="Arial" w:cs="Arial"/>
+          <w:sz w:val="24"/>
+          <w:szCs w:val="24"/>
+          <w:lang w:val="en-GB"/>
+        </w:rPr>
+        <w:t>PlayerMovement</w:t>
+      </w:r>
+      <w:proofErr w:type="spellEnd"/>
+      <w:r>
+        <w:rPr>
+          <w:rFonts w:ascii="Arial" w:hAnsi="Arial" w:cs="Arial"/>
+          <w:sz w:val="24"/>
+          <w:szCs w:val="24"/>
+          <w:lang w:val="en-GB"/>
+        </w:rPr>
+        <w:t xml:space="preserve">, Projectile are scripts linked to the player </w:t>
+      </w:r>
+      <w:proofErr w:type="spellStart"/>
+      <w:r>
+        <w:rPr>
+          <w:rFonts w:ascii="Arial" w:hAnsi="Arial" w:cs="Arial"/>
+          <w:sz w:val="24"/>
+          <w:szCs w:val="24"/>
+          <w:lang w:val="en-GB"/>
+        </w:rPr>
+        <w:t>GameObject</w:t>
+      </w:r>
+      <w:proofErr w:type="spellEnd"/>
+      <w:r>
+        <w:rPr>
+          <w:rFonts w:ascii="Arial" w:hAnsi="Arial" w:cs="Arial"/>
+          <w:sz w:val="24"/>
+          <w:szCs w:val="24"/>
+          <w:lang w:val="en-GB"/>
+        </w:rPr>
+        <w:t xml:space="preserve">. For our purpose we will focus on how the </w:t>
+      </w:r>
+      <w:proofErr w:type="spellStart"/>
+      <w:r>
+        <w:rPr>
+          <w:rFonts w:ascii="Arial" w:hAnsi="Arial" w:cs="Arial"/>
+          <w:sz w:val="24"/>
+          <w:szCs w:val="24"/>
+          <w:lang w:val="en-GB"/>
+        </w:rPr>
+        <w:t>PlayerAttack</w:t>
+      </w:r>
+      <w:proofErr w:type="spellEnd"/>
+      <w:r>
+        <w:rPr>
+          <w:rFonts w:ascii="Arial" w:hAnsi="Arial" w:cs="Arial"/>
+          <w:sz w:val="24"/>
+          <w:szCs w:val="24"/>
+          <w:lang w:val="en-GB"/>
+        </w:rPr>
+        <w:t xml:space="preserve"> works.</w:t>
       </w:r>
     </w:p>
     <w:p>
@@ -5916,8 +8217,9 @@
           <w:szCs w:val="24"/>
           <w:lang w:val="en-GB"/>
         </w:rPr>
-        <w:t>objects. A fireball has attributes such as speed, direction and lifetime. They are used in order to make sure the gameplay is well balanced, but their values can be modified through items. Namely, the speed and direction can be modified. Once a fireball reaches its lifetime limit, it will deactivate through deactivate() function. Update() is used for the general behaviour of the fireball and Awake() is used in order to initialize variables. The function onTrig</w:t>
-      </w:r>
+        <w:t xml:space="preserve">objects. A fireball has attributes such as speed, direction and lifetime. They are used in order to make sure the gameplay is well balanced, but their values can be modified through items. Namely, the speed and direction can be modified. Once a fireball reaches its lifetime limit, it will deactivate through </w:t>
+      </w:r>
+      <w:proofErr w:type="gramStart"/>
       <w:r>
         <w:rPr>
           <w:rFonts w:ascii="Arial" w:hAnsi="Arial" w:cs="Arial"/>
@@ -5925,8 +8227,9 @@
           <w:szCs w:val="24"/>
           <w:lang w:val="en-GB"/>
         </w:rPr>
-        <w:t>g</w:t>
-      </w:r>
+        <w:t>deactivate(</w:t>
+      </w:r>
+      <w:proofErr w:type="gramEnd"/>
       <w:r>
         <w:rPr>
           <w:rFonts w:ascii="Arial" w:hAnsi="Arial" w:cs="Arial"/>
@@ -5934,7 +8237,65 @@
           <w:szCs w:val="24"/>
           <w:lang w:val="en-GB"/>
         </w:rPr>
-        <w:t>erEnter2D() has the purpose of handling the behaviour of a fireball once it collides with an object, more specifically set the animator and call deactivate after the collision</w:t>
+        <w:t xml:space="preserve">) function. </w:t>
+      </w:r>
+      <w:proofErr w:type="gramStart"/>
+      <w:r>
+        <w:rPr>
+          <w:rFonts w:ascii="Arial" w:hAnsi="Arial" w:cs="Arial"/>
+          <w:sz w:val="24"/>
+          <w:szCs w:val="24"/>
+          <w:lang w:val="en-GB"/>
+        </w:rPr>
+        <w:t>Update(</w:t>
+      </w:r>
+      <w:proofErr w:type="gramEnd"/>
+      <w:r>
+        <w:rPr>
+          <w:rFonts w:ascii="Arial" w:hAnsi="Arial" w:cs="Arial"/>
+          <w:sz w:val="24"/>
+          <w:szCs w:val="24"/>
+          <w:lang w:val="en-GB"/>
+        </w:rPr>
+        <w:t>) is used for the general behaviour of the fireball and Awake() is used in order to initialize variables. The function onTrig</w:t>
+      </w:r>
+      <w:r>
+        <w:rPr>
+          <w:rFonts w:ascii="Arial" w:hAnsi="Arial" w:cs="Arial"/>
+          <w:sz w:val="24"/>
+          <w:szCs w:val="24"/>
+          <w:lang w:val="en-GB"/>
+        </w:rPr>
+        <w:t>g</w:t>
+      </w:r>
+      <w:r>
+        <w:rPr>
+          <w:rFonts w:ascii="Arial" w:hAnsi="Arial" w:cs="Arial"/>
+          <w:sz w:val="24"/>
+          <w:szCs w:val="24"/>
+          <w:lang w:val="en-GB"/>
+        </w:rPr>
+        <w:t>erEnter2</w:t>
+      </w:r>
+      <w:proofErr w:type="gramStart"/>
+      <w:r>
+        <w:rPr>
+          <w:rFonts w:ascii="Arial" w:hAnsi="Arial" w:cs="Arial"/>
+          <w:sz w:val="24"/>
+          <w:szCs w:val="24"/>
+          <w:lang w:val="en-GB"/>
+        </w:rPr>
+        <w:t>D(</w:t>
+      </w:r>
+      <w:proofErr w:type="gramEnd"/>
+      <w:r>
+        <w:rPr>
+          <w:rFonts w:ascii="Arial" w:hAnsi="Arial" w:cs="Arial"/>
+          <w:sz w:val="24"/>
+          <w:szCs w:val="24"/>
+          <w:lang w:val="en-GB"/>
+        </w:rPr>
+        <w:t>) has the purpose of handling the behaviour of a fireball once it collides with an object, more specifically set the animator and call deactivate after the collision</w:t>
       </w:r>
     </w:p>
     <w:p>
@@ -5954,6 +8315,7 @@
           <w:lang w:val="en-GB"/>
         </w:rPr>
       </w:pPr>
+      <w:proofErr w:type="spellStart"/>
       <w:r>
         <w:rPr>
           <w:rFonts w:ascii="Arial" w:hAnsi="Arial" w:cs="Arial"/>
@@ -5965,6 +8327,7 @@
         </w:rPr>
         <w:t>FireballHolder</w:t>
       </w:r>
+      <w:proofErr w:type="spellEnd"/>
       <w:r>
         <w:rPr>
           <w:rFonts w:ascii="Arial" w:hAnsi="Arial" w:cs="Arial"/>
@@ -6080,7 +8443,21 @@
         <w:rPr>
           <w:lang w:val="en-GB"/>
         </w:rPr>
-        <w:t>Figure 4.6.1 – Showcase of Firepoint importance</w:t>
+        <w:t xml:space="preserve">Figure 4.6.1 – Showcase of </w:t>
+      </w:r>
+      <w:proofErr w:type="spellStart"/>
+      <w:r>
+        <w:rPr>
+          <w:lang w:val="en-GB"/>
+        </w:rPr>
+        <w:t>Firepoint</w:t>
+      </w:r>
+      <w:proofErr w:type="spellEnd"/>
+      <w:r>
+        <w:rPr>
+          <w:lang w:val="en-GB"/>
+        </w:rPr>
+        <w:t xml:space="preserve"> importance</w:t>
       </w:r>
       <w:r>
         <w:rPr>
@@ -6220,20 +8597,1382 @@
         <w:rPr>
           <w:lang w:val="en-GB"/>
         </w:rPr>
+        <w:t>5.1 Code Implementation Analysis</w:t>
+      </w:r>
+    </w:p>
+    <w:p>
+      <w:pPr>
+        <w:pStyle w:val="Heading2"/>
+        <w:numPr>
+          <w:ilvl w:val="0"/>
+          <w:numId w:val="0"/>
+        </w:numPr>
+        <w:ind w:left="576" w:hanging="576"/>
+        <w:rPr>
+          <w:lang w:val="en-GB"/>
+        </w:rPr>
+      </w:pPr>
+      <w:r>
+        <w:rPr>
+          <w:lang w:val="en-GB"/>
+        </w:rPr>
+        <w:t xml:space="preserve">       </w:t>
+      </w:r>
+      <w:r>
+        <w:rPr>
+          <w:lang w:val="en-GB"/>
+        </w:rPr>
         <w:t>5.1</w:t>
       </w:r>
       <w:r>
         <w:rPr>
           <w:lang w:val="en-GB"/>
         </w:rPr>
+        <w:t>.1 Player Movement</w:t>
+      </w:r>
+    </w:p>
+    <w:p>
+      <w:pPr>
+        <w:rPr>
+          <w:lang w:val="en-GB"/>
+        </w:rPr>
+      </w:pPr>
+      <w:r>
+        <w:rPr>
+          <w:lang w:val="en-GB"/>
+        </w:rPr>
+        <w:drawing>
+          <wp:anchor distT="0" distB="0" distL="114300" distR="114300" simplePos="0" relativeHeight="251671552" behindDoc="0" locked="0" layoutInCell="1" allowOverlap="1" wp14:anchorId="5943761F" wp14:editId="12EE35FD">
+            <wp:simplePos x="0" y="0"/>
+            <wp:positionH relativeFrom="column">
+              <wp:posOffset>203835</wp:posOffset>
+            </wp:positionH>
+            <wp:positionV relativeFrom="paragraph">
+              <wp:posOffset>913130</wp:posOffset>
+            </wp:positionV>
+            <wp:extent cx="6120765" cy="467995"/>
+            <wp:effectExtent l="0" t="0" r="0" b="8255"/>
+            <wp:wrapSquare wrapText="bothSides"/>
+            <wp:docPr id="15" name="Picture 15"/>
+            <wp:cNvGraphicFramePr>
+              <a:graphicFrameLocks xmlns:a="http://schemas.openxmlformats.org/drawingml/2006/main" noChangeAspect="1"/>
+            </wp:cNvGraphicFramePr>
+            <a:graphic xmlns:a="http://schemas.openxmlformats.org/drawingml/2006/main">
+              <a:graphicData uri="http://schemas.openxmlformats.org/drawingml/2006/picture">
+                <pic:pic xmlns:pic="http://schemas.openxmlformats.org/drawingml/2006/picture">
+                  <pic:nvPicPr>
+                    <pic:cNvPr id="1" name=""/>
+                    <pic:cNvPicPr/>
+                  </pic:nvPicPr>
+                  <pic:blipFill>
+                    <a:blip r:embed="rId27">
+                      <a:extLst>
+                        <a:ext uri="{28A0092B-C50C-407E-A947-70E740481C1C}">
+                          <a14:useLocalDpi xmlns:a14="http://schemas.microsoft.com/office/drawing/2010/main" val="0"/>
+                        </a:ext>
+                      </a:extLst>
+                    </a:blip>
+                    <a:stretch>
+                      <a:fillRect/>
+                    </a:stretch>
+                  </pic:blipFill>
+                  <pic:spPr>
+                    <a:xfrm>
+                      <a:off x="0" y="0"/>
+                      <a:ext cx="6120765" cy="467995"/>
+                    </a:xfrm>
+                    <a:prstGeom prst="rect">
+                      <a:avLst/>
+                    </a:prstGeom>
+                  </pic:spPr>
+                </pic:pic>
+              </a:graphicData>
+            </a:graphic>
+          </wp:anchor>
+        </w:drawing>
+      </w:r>
+      <w:r>
+        <w:rPr>
+          <w:lang w:val="en-GB"/>
+        </w:rPr>
+        <w:t xml:space="preserve">The player makes use of Unity’s Rigidbody2D for physics-based movement. The movement input is captured using </w:t>
+      </w:r>
+      <w:proofErr w:type="spellStart"/>
+      <w:r>
+        <w:rPr>
+          <w:lang w:val="en-GB"/>
+        </w:rPr>
+        <w:t>Input.GetAxis</w:t>
+      </w:r>
+      <w:proofErr w:type="spellEnd"/>
+      <w:r>
+        <w:rPr>
+          <w:lang w:val="en-GB"/>
+        </w:rPr>
+        <w:t xml:space="preserve">(“Horizontal”), which further controls the RigidBody2D’s velocity, allowing for smooth and responsive movement. The player’s orientation is flipped using </w:t>
+      </w:r>
+      <w:proofErr w:type="spellStart"/>
+      <w:proofErr w:type="gramStart"/>
+      <w:r>
+        <w:rPr>
+          <w:lang w:val="en-GB"/>
+        </w:rPr>
+        <w:t>transform.localScale</w:t>
+      </w:r>
+      <w:proofErr w:type="spellEnd"/>
+      <w:proofErr w:type="gramEnd"/>
+      <w:r>
+        <w:rPr>
+          <w:lang w:val="en-GB"/>
+        </w:rPr>
+        <w:t xml:space="preserve"> based on input direction. </w:t>
+      </w:r>
+    </w:p>
+    <w:p>
+      <w:pPr>
+        <w:jc w:val="center"/>
+        <w:rPr>
+          <w:lang w:val="en-GB"/>
+        </w:rPr>
+      </w:pPr>
+      <w:r>
+        <w:rPr>
+          <w:lang w:val="en-GB"/>
+        </w:rPr>
+        <w:t>Figure 5.1.1.0- Showcase of horizontal movement implementation (Source: screenshot)</w:t>
+      </w:r>
+    </w:p>
+    <w:p>
+      <w:pPr>
+        <w:jc w:val="center"/>
+        <w:rPr>
+          <w:lang w:val="en-GB"/>
+        </w:rPr>
+      </w:pPr>
+    </w:p>
+    <w:p>
+      <w:pPr>
+        <w:ind w:firstLine="0"/>
+        <w:rPr>
+          <w:lang w:val="en-GB"/>
+        </w:rPr>
+      </w:pPr>
+      <w:r>
+        <w:rPr>
+          <w:lang w:val="en-GB"/>
+        </w:rPr>
+        <w:drawing>
+          <wp:anchor distT="0" distB="0" distL="114300" distR="114300" simplePos="0" relativeHeight="251673600" behindDoc="0" locked="0" layoutInCell="1" allowOverlap="1" wp14:anchorId="5D8D840C" wp14:editId="2AB960BA">
+            <wp:simplePos x="0" y="0"/>
+            <wp:positionH relativeFrom="margin">
+              <wp:align>center</wp:align>
+            </wp:positionH>
+            <wp:positionV relativeFrom="paragraph">
+              <wp:posOffset>1678305</wp:posOffset>
+            </wp:positionV>
+            <wp:extent cx="5811061" cy="3572374"/>
+            <wp:effectExtent l="0" t="0" r="0" b="9525"/>
+            <wp:wrapSquare wrapText="bothSides"/>
+            <wp:docPr id="19" name="Picture 19"/>
+            <wp:cNvGraphicFramePr>
+              <a:graphicFrameLocks xmlns:a="http://schemas.openxmlformats.org/drawingml/2006/main" noChangeAspect="1"/>
+            </wp:cNvGraphicFramePr>
+            <a:graphic xmlns:a="http://schemas.openxmlformats.org/drawingml/2006/main">
+              <a:graphicData uri="http://schemas.openxmlformats.org/drawingml/2006/picture">
+                <pic:pic xmlns:pic="http://schemas.openxmlformats.org/drawingml/2006/picture">
+                  <pic:nvPicPr>
+                    <pic:cNvPr id="1" name=""/>
+                    <pic:cNvPicPr/>
+                  </pic:nvPicPr>
+                  <pic:blipFill>
+                    <a:blip r:embed="rId28">
+                      <a:extLst>
+                        <a:ext uri="{28A0092B-C50C-407E-A947-70E740481C1C}">
+                          <a14:useLocalDpi xmlns:a14="http://schemas.microsoft.com/office/drawing/2010/main" val="0"/>
+                        </a:ext>
+                      </a:extLst>
+                    </a:blip>
+                    <a:stretch>
+                      <a:fillRect/>
+                    </a:stretch>
+                  </pic:blipFill>
+                  <pic:spPr>
+                    <a:xfrm>
+                      <a:off x="0" y="0"/>
+                      <a:ext cx="5811061" cy="3572374"/>
+                    </a:xfrm>
+                    <a:prstGeom prst="rect">
+                      <a:avLst/>
+                    </a:prstGeom>
+                  </pic:spPr>
+                </pic:pic>
+              </a:graphicData>
+            </a:graphic>
+          </wp:anchor>
+        </w:drawing>
+      </w:r>
+      <w:r>
+        <w:rPr>
+          <w:lang w:val="en-GB"/>
+        </w:rPr>
+        <w:tab/>
+        <w:t>The player can jump using the spacebar</w:t>
+      </w:r>
+      <w:r>
+        <w:rPr>
+          <w:lang w:val="en-GB"/>
+        </w:rPr>
+        <w:t>, the jumping system having three enhancements</w:t>
+      </w:r>
+      <w:r>
+        <w:rPr>
+          <w:lang w:val="en-GB"/>
+        </w:rPr>
+        <w:t>. The first one being the Coyote Time, which allows players to jump shortly after walking off a platform. The second one is Multiple Jumps and as the name suggests it allows for setting double jumping or more, in our case we at most can have only have double jumping if the player picks up a certain item. Lastly, there is Variable Jump Height, which in the case that the player releases the jump key early, the jump is cut short by halving the upward velocity. Asides from these enhancements the player can also jump on walls and stick there for strategic purposes.</w:t>
+      </w:r>
+    </w:p>
+    <w:p>
+      <w:pPr>
+        <w:ind w:firstLine="0"/>
+        <w:rPr>
+          <w:lang w:val="en-GB"/>
+        </w:rPr>
+      </w:pPr>
+      <w:r>
+        <w:rPr>
+          <w:lang w:val="en-GB"/>
+        </w:rPr>
+        <w:tab/>
+      </w:r>
+      <w:r>
+        <w:rPr>
+          <w:lang w:val="en-GB"/>
+        </w:rPr>
+        <w:tab/>
+      </w:r>
+      <w:r>
+        <w:rPr>
+          <w:lang w:val="en-GB"/>
+        </w:rPr>
+        <w:t>Figure 5.1.1.1- Showcase of jump mechanic (Source: screenshot)</w:t>
+      </w:r>
+    </w:p>
+    <w:p>
+      <w:pPr>
+        <w:ind w:firstLine="0"/>
+        <w:rPr>
+          <w:lang w:val="en-GB"/>
+        </w:rPr>
+      </w:pPr>
+      <w:r>
+        <w:rPr>
+          <w:lang w:val="en-GB"/>
+        </w:rPr>
+        <w:lastRenderedPageBreak/>
+        <w:drawing>
+          <wp:anchor distT="0" distB="0" distL="114300" distR="114300" simplePos="0" relativeHeight="251672576" behindDoc="0" locked="0" layoutInCell="1" allowOverlap="1" wp14:anchorId="3C00B9FB" wp14:editId="5F1664E7">
+            <wp:simplePos x="0" y="0"/>
+            <wp:positionH relativeFrom="column">
+              <wp:posOffset>375285</wp:posOffset>
+            </wp:positionH>
+            <wp:positionV relativeFrom="paragraph">
+              <wp:posOffset>277495</wp:posOffset>
+            </wp:positionV>
+            <wp:extent cx="6120765" cy="1352550"/>
+            <wp:effectExtent l="0" t="0" r="0" b="0"/>
+            <wp:wrapSquare wrapText="bothSides"/>
+            <wp:docPr id="18" name="Picture 18"/>
+            <wp:cNvGraphicFramePr>
+              <a:graphicFrameLocks xmlns:a="http://schemas.openxmlformats.org/drawingml/2006/main" noChangeAspect="1"/>
+            </wp:cNvGraphicFramePr>
+            <a:graphic xmlns:a="http://schemas.openxmlformats.org/drawingml/2006/main">
+              <a:graphicData uri="http://schemas.openxmlformats.org/drawingml/2006/picture">
+                <pic:pic xmlns:pic="http://schemas.openxmlformats.org/drawingml/2006/picture">
+                  <pic:nvPicPr>
+                    <pic:cNvPr id="1" name=""/>
+                    <pic:cNvPicPr/>
+                  </pic:nvPicPr>
+                  <pic:blipFill>
+                    <a:blip r:embed="rId29">
+                      <a:extLst>
+                        <a:ext uri="{28A0092B-C50C-407E-A947-70E740481C1C}">
+                          <a14:useLocalDpi xmlns:a14="http://schemas.microsoft.com/office/drawing/2010/main" val="0"/>
+                        </a:ext>
+                      </a:extLst>
+                    </a:blip>
+                    <a:stretch>
+                      <a:fillRect/>
+                    </a:stretch>
+                  </pic:blipFill>
+                  <pic:spPr>
+                    <a:xfrm>
+                      <a:off x="0" y="0"/>
+                      <a:ext cx="6120765" cy="1352550"/>
+                    </a:xfrm>
+                    <a:prstGeom prst="rect">
+                      <a:avLst/>
+                    </a:prstGeom>
+                  </pic:spPr>
+                </pic:pic>
+              </a:graphicData>
+            </a:graphic>
+          </wp:anchor>
+        </w:drawing>
+      </w:r>
+    </w:p>
+    <w:p>
+      <w:pPr>
+        <w:ind w:firstLine="0"/>
+        <w:jc w:val="center"/>
+        <w:rPr>
+          <w:lang w:val="en-GB"/>
+        </w:rPr>
+      </w:pPr>
+    </w:p>
+    <w:p>
+      <w:pPr>
+        <w:tabs>
+          <w:tab w:val="left" w:pos="2220"/>
+        </w:tabs>
+        <w:jc w:val="center"/>
+        <w:rPr>
+          <w:lang w:val="en-GB"/>
+        </w:rPr>
+      </w:pPr>
+      <w:r>
+        <w:rPr>
+          <w:lang w:val="en-GB"/>
+        </w:rPr>
+        <w:t>Figure 5.1.1.2- Showcase of how jumping input is handled (Source: screenshot)</w:t>
+      </w:r>
+    </w:p>
+    <w:p>
+      <w:pPr>
+        <w:tabs>
+          <w:tab w:val="left" w:pos="2100"/>
+        </w:tabs>
+        <w:ind w:firstLine="0"/>
+        <w:rPr>
+          <w:lang w:val="en-GB"/>
+        </w:rPr>
+      </w:pPr>
+    </w:p>
+    <w:p>
+      <w:pPr>
+        <w:tabs>
+          <w:tab w:val="left" w:pos="2100"/>
+        </w:tabs>
+        <w:rPr>
+          <w:lang w:val="en-GB"/>
+        </w:rPr>
+      </w:pPr>
+      <w:r>
+        <w:rPr>
+          <w:lang w:val="en-GB"/>
+        </w:rPr>
+        <w:drawing>
+          <wp:anchor distT="0" distB="0" distL="114300" distR="114300" simplePos="0" relativeHeight="251674624" behindDoc="0" locked="0" layoutInCell="1" allowOverlap="1" wp14:anchorId="220FACE4" wp14:editId="6829F40D">
+            <wp:simplePos x="0" y="0"/>
+            <wp:positionH relativeFrom="column">
+              <wp:posOffset>518160</wp:posOffset>
+            </wp:positionH>
+            <wp:positionV relativeFrom="paragraph">
+              <wp:posOffset>1854835</wp:posOffset>
+            </wp:positionV>
+            <wp:extent cx="5563376" cy="3496163"/>
+            <wp:effectExtent l="0" t="0" r="0" b="9525"/>
+            <wp:wrapSquare wrapText="bothSides"/>
+            <wp:docPr id="22" name="Picture 22"/>
+            <wp:cNvGraphicFramePr>
+              <a:graphicFrameLocks xmlns:a="http://schemas.openxmlformats.org/drawingml/2006/main" noChangeAspect="1"/>
+            </wp:cNvGraphicFramePr>
+            <a:graphic xmlns:a="http://schemas.openxmlformats.org/drawingml/2006/main">
+              <a:graphicData uri="http://schemas.openxmlformats.org/drawingml/2006/picture">
+                <pic:pic xmlns:pic="http://schemas.openxmlformats.org/drawingml/2006/picture">
+                  <pic:nvPicPr>
+                    <pic:cNvPr id="1" name=""/>
+                    <pic:cNvPicPr/>
+                  </pic:nvPicPr>
+                  <pic:blipFill>
+                    <a:blip r:embed="rId30">
+                      <a:extLst>
+                        <a:ext uri="{28A0092B-C50C-407E-A947-70E740481C1C}">
+                          <a14:useLocalDpi xmlns:a14="http://schemas.microsoft.com/office/drawing/2010/main" val="0"/>
+                        </a:ext>
+                      </a:extLst>
+                    </a:blip>
+                    <a:stretch>
+                      <a:fillRect/>
+                    </a:stretch>
+                  </pic:blipFill>
+                  <pic:spPr>
+                    <a:xfrm>
+                      <a:off x="0" y="0"/>
+                      <a:ext cx="5563376" cy="3496163"/>
+                    </a:xfrm>
+                    <a:prstGeom prst="rect">
+                      <a:avLst/>
+                    </a:prstGeom>
+                  </pic:spPr>
+                </pic:pic>
+              </a:graphicData>
+            </a:graphic>
+          </wp:anchor>
+        </w:drawing>
+      </w:r>
+      <w:r>
+        <w:rPr>
+          <w:lang w:val="en-GB"/>
+        </w:rPr>
+        <w:t xml:space="preserve"> Wind Form Dashing </w:t>
+      </w:r>
+      <w:r>
+        <w:rPr>
+          <w:lang w:val="en-GB"/>
+        </w:rPr>
+        <w:t xml:space="preserve">is activated using L-Shift and if the </w:t>
+      </w:r>
+      <w:proofErr w:type="spellStart"/>
+      <w:r>
+        <w:rPr>
+          <w:lang w:val="en-GB"/>
+        </w:rPr>
+        <w:t>PlayerAbility.canDash</w:t>
+      </w:r>
+      <w:proofErr w:type="spellEnd"/>
+      <w:r>
+        <w:rPr>
+          <w:lang w:val="en-GB"/>
+        </w:rPr>
+        <w:t xml:space="preserve"> flag is true. Through this ability the player temporarily changes his physics layer so that he can pass through enemies, traps and boxes. While in Wind Form, a timer counts down and the player becomes intangible by using Physics2D.IgnoreCollision. Upon the timer’s expiration, the system checks if the player is inside any ignored collider before reverting back to the original layer and player shape. This mechanic is used in order to ease traversal in difficult situations and escape tight spaces. The player’s visual transformation from its original form to that of the wind is done using the Animator Controller component attached to the player, which can be set on and off through a trigger. </w:t>
+      </w:r>
+    </w:p>
+    <w:p>
+      <w:pPr>
+        <w:tabs>
+          <w:tab w:val="left" w:pos="2100"/>
+        </w:tabs>
+        <w:jc w:val="center"/>
+        <w:rPr>
+          <w:lang w:val="en-GB"/>
+        </w:rPr>
+      </w:pPr>
+      <w:r>
+        <w:rPr>
+          <w:lang w:val="en-GB"/>
+        </w:rPr>
+        <w:t>Figure 5.1.1.3- Showcase of Wind Form Dashing Mechanic (Source: screenshot)</w:t>
+      </w:r>
+    </w:p>
+    <w:p>
+      <w:pPr>
+        <w:tabs>
+          <w:tab w:val="left" w:pos="2100"/>
+        </w:tabs>
+        <w:jc w:val="center"/>
+        <w:rPr>
+          <w:lang w:val="en-GB"/>
+        </w:rPr>
+      </w:pPr>
+    </w:p>
+    <w:p>
+      <w:pPr>
+        <w:tabs>
+          <w:tab w:val="left" w:pos="2100"/>
+        </w:tabs>
+        <w:jc w:val="center"/>
+        <w:rPr>
+          <w:lang w:val="en-GB"/>
+        </w:rPr>
+      </w:pPr>
+    </w:p>
+    <w:p>
+      <w:pPr>
+        <w:tabs>
+          <w:tab w:val="left" w:pos="2100"/>
+        </w:tabs>
+        <w:jc w:val="center"/>
+        <w:rPr>
+          <w:lang w:val="en-GB"/>
+        </w:rPr>
+      </w:pPr>
+    </w:p>
+    <w:p>
+      <w:pPr>
+        <w:tabs>
+          <w:tab w:val="left" w:pos="2100"/>
+        </w:tabs>
+        <w:jc w:val="center"/>
+        <w:rPr>
+          <w:lang w:val="en-GB"/>
+        </w:rPr>
+      </w:pPr>
+    </w:p>
+    <w:p>
+      <w:pPr>
+        <w:tabs>
+          <w:tab w:val="left" w:pos="2100"/>
+        </w:tabs>
+        <w:jc w:val="center"/>
+        <w:rPr>
+          <w:lang w:val="en-GB"/>
+        </w:rPr>
+      </w:pPr>
+    </w:p>
+    <w:p>
+      <w:pPr>
+        <w:tabs>
+          <w:tab w:val="left" w:pos="2100"/>
+        </w:tabs>
+        <w:jc w:val="center"/>
+        <w:rPr>
+          <w:lang w:val="en-GB"/>
+        </w:rPr>
+      </w:pPr>
+    </w:p>
+    <w:p>
+      <w:pPr>
+        <w:rPr>
+          <w:lang w:val="en-GB"/>
+        </w:rPr>
+      </w:pPr>
+      <w:r>
+        <w:rPr>
+          <w:lang w:val="en-GB"/>
+        </w:rPr>
+        <w:lastRenderedPageBreak/>
+        <w:drawing>
+          <wp:anchor distT="0" distB="0" distL="114300" distR="114300" simplePos="0" relativeHeight="251677696" behindDoc="0" locked="0" layoutInCell="1" allowOverlap="1" wp14:anchorId="7DB9B07F" wp14:editId="0A9D6103">
+            <wp:simplePos x="0" y="0"/>
+            <wp:positionH relativeFrom="column">
+              <wp:posOffset>984885</wp:posOffset>
+            </wp:positionH>
+            <wp:positionV relativeFrom="paragraph">
+              <wp:posOffset>10795</wp:posOffset>
+            </wp:positionV>
+            <wp:extent cx="4401164" cy="3553321"/>
+            <wp:effectExtent l="0" t="0" r="0" b="9525"/>
+            <wp:wrapSquare wrapText="bothSides"/>
+            <wp:docPr id="23" name="Picture 23"/>
+            <wp:cNvGraphicFramePr>
+              <a:graphicFrameLocks xmlns:a="http://schemas.openxmlformats.org/drawingml/2006/main" noChangeAspect="1"/>
+            </wp:cNvGraphicFramePr>
+            <a:graphic xmlns:a="http://schemas.openxmlformats.org/drawingml/2006/main">
+              <a:graphicData uri="http://schemas.openxmlformats.org/drawingml/2006/picture">
+                <pic:pic xmlns:pic="http://schemas.openxmlformats.org/drawingml/2006/picture">
+                  <pic:nvPicPr>
+                    <pic:cNvPr id="1" name=""/>
+                    <pic:cNvPicPr/>
+                  </pic:nvPicPr>
+                  <pic:blipFill>
+                    <a:blip r:embed="rId31">
+                      <a:extLst>
+                        <a:ext uri="{28A0092B-C50C-407E-A947-70E740481C1C}">
+                          <a14:useLocalDpi xmlns:a14="http://schemas.microsoft.com/office/drawing/2010/main" val="0"/>
+                        </a:ext>
+                      </a:extLst>
+                    </a:blip>
+                    <a:stretch>
+                      <a:fillRect/>
+                    </a:stretch>
+                  </pic:blipFill>
+                  <pic:spPr>
+                    <a:xfrm>
+                      <a:off x="0" y="0"/>
+                      <a:ext cx="4401164" cy="3553321"/>
+                    </a:xfrm>
+                    <a:prstGeom prst="rect">
+                      <a:avLst/>
+                    </a:prstGeom>
+                  </pic:spPr>
+                </pic:pic>
+              </a:graphicData>
+            </a:graphic>
+          </wp:anchor>
+        </w:drawing>
+      </w:r>
+    </w:p>
+    <w:p>
+      <w:pPr>
+        <w:rPr>
+          <w:lang w:val="en-GB"/>
+        </w:rPr>
+      </w:pPr>
+    </w:p>
+    <w:p>
+      <w:pPr>
+        <w:rPr>
+          <w:lang w:val="en-GB"/>
+        </w:rPr>
+      </w:pPr>
+    </w:p>
+    <w:p>
+      <w:pPr>
+        <w:rPr>
+          <w:lang w:val="en-GB"/>
+        </w:rPr>
+      </w:pPr>
+    </w:p>
+    <w:p>
+      <w:pPr>
+        <w:rPr>
+          <w:lang w:val="en-GB"/>
+        </w:rPr>
+      </w:pPr>
+    </w:p>
+    <w:p>
+      <w:pPr>
+        <w:rPr>
+          <w:lang w:val="en-GB"/>
+        </w:rPr>
+      </w:pPr>
+    </w:p>
+    <w:p>
+      <w:pPr>
+        <w:rPr>
+          <w:lang w:val="en-GB"/>
+        </w:rPr>
+      </w:pPr>
+    </w:p>
+    <w:p>
+      <w:pPr>
+        <w:rPr>
+          <w:lang w:val="en-GB"/>
+        </w:rPr>
+      </w:pPr>
+    </w:p>
+    <w:p>
+      <w:pPr>
+        <w:rPr>
+          <w:lang w:val="en-GB"/>
+        </w:rPr>
+      </w:pPr>
+    </w:p>
+    <w:p>
+      <w:pPr>
+        <w:rPr>
+          <w:lang w:val="en-GB"/>
+        </w:rPr>
+      </w:pPr>
+    </w:p>
+    <w:p>
+      <w:pPr>
+        <w:rPr>
+          <w:lang w:val="en-GB"/>
+        </w:rPr>
+      </w:pPr>
+    </w:p>
+    <w:p>
+      <w:pPr>
+        <w:rPr>
+          <w:lang w:val="en-GB"/>
+        </w:rPr>
+      </w:pPr>
+    </w:p>
+    <w:p>
+      <w:pPr>
+        <w:rPr>
+          <w:lang w:val="en-GB"/>
+        </w:rPr>
+      </w:pPr>
+    </w:p>
+    <w:p>
+      <w:pPr>
+        <w:rPr>
+          <w:lang w:val="en-GB"/>
+        </w:rPr>
+      </w:pPr>
+    </w:p>
+    <w:p>
+      <w:pPr>
+        <w:rPr>
+          <w:lang w:val="en-GB"/>
+        </w:rPr>
+      </w:pPr>
+    </w:p>
+    <w:p>
+      <w:pPr>
+        <w:rPr>
+          <w:lang w:val="en-GB"/>
+        </w:rPr>
+      </w:pPr>
+    </w:p>
+    <w:p>
+      <w:pPr>
+        <w:rPr>
+          <w:lang w:val="en-GB"/>
+        </w:rPr>
+      </w:pPr>
+    </w:p>
+    <w:p>
+      <w:pPr>
+        <w:rPr>
+          <w:lang w:val="en-GB"/>
+        </w:rPr>
+      </w:pPr>
+    </w:p>
+    <w:p>
+      <w:pPr>
+        <w:jc w:val="center"/>
+        <w:rPr>
+          <w:lang w:val="en-GB"/>
+        </w:rPr>
+      </w:pPr>
+      <w:r>
+        <w:rPr>
+          <w:lang w:val="en-GB"/>
+        </w:rPr>
+        <w:t>Figure 5.1.1.4- Showcase of Animator Controller interaction (Source: screenshot)</w:t>
+      </w:r>
+    </w:p>
+    <w:p>
+      <w:pPr>
+        <w:rPr>
+          <w:lang w:val="en-GB"/>
+        </w:rPr>
+      </w:pPr>
+    </w:p>
+    <w:p>
+      <w:pPr>
+        <w:rPr>
+          <w:lang w:val="en-GB"/>
+        </w:rPr>
+      </w:pPr>
+      <w:r>
+        <w:rPr>
+          <w:lang w:val="en-GB"/>
+        </w:rPr>
+        <w:t xml:space="preserve">Crouching is done using the L-CTRL button, thus changing accordingly the player’s BoxCollider2D size and offsetting in order to simulate crouching. The collider resizing is animated using a Boolean </w:t>
+      </w:r>
+      <w:proofErr w:type="spellStart"/>
+      <w:r>
+        <w:rPr>
+          <w:lang w:val="en-GB"/>
+        </w:rPr>
+        <w:t>isCrouching</w:t>
+      </w:r>
+      <w:proofErr w:type="spellEnd"/>
+      <w:r>
+        <w:rPr>
+          <w:lang w:val="en-GB"/>
+        </w:rPr>
+        <w:t xml:space="preserve"> in the animator.</w:t>
+      </w:r>
+    </w:p>
+    <w:p>
+      <w:pPr>
+        <w:rPr>
+          <w:lang w:val="en-GB"/>
+        </w:rPr>
+      </w:pPr>
+      <w:r>
+        <w:rPr>
+          <w:lang w:val="en-GB"/>
+        </w:rPr>
+        <w:drawing>
+          <wp:anchor distT="0" distB="0" distL="114300" distR="114300" simplePos="0" relativeHeight="251676672" behindDoc="0" locked="0" layoutInCell="1" allowOverlap="1" wp14:anchorId="4C19D284" wp14:editId="15ADE068">
+            <wp:simplePos x="0" y="0"/>
+            <wp:positionH relativeFrom="margin">
+              <wp:align>center</wp:align>
+            </wp:positionH>
+            <wp:positionV relativeFrom="paragraph">
+              <wp:posOffset>68580</wp:posOffset>
+            </wp:positionV>
+            <wp:extent cx="3705742" cy="1867161"/>
+            <wp:effectExtent l="0" t="0" r="0" b="0"/>
+            <wp:wrapSquare wrapText="bothSides"/>
+            <wp:docPr id="20" name="Picture 20"/>
+            <wp:cNvGraphicFramePr>
+              <a:graphicFrameLocks xmlns:a="http://schemas.openxmlformats.org/drawingml/2006/main" noChangeAspect="1"/>
+            </wp:cNvGraphicFramePr>
+            <a:graphic xmlns:a="http://schemas.openxmlformats.org/drawingml/2006/main">
+              <a:graphicData uri="http://schemas.openxmlformats.org/drawingml/2006/picture">
+                <pic:pic xmlns:pic="http://schemas.openxmlformats.org/drawingml/2006/picture">
+                  <pic:nvPicPr>
+                    <pic:cNvPr id="1" name=""/>
+                    <pic:cNvPicPr/>
+                  </pic:nvPicPr>
+                  <pic:blipFill>
+                    <a:blip r:embed="rId32">
+                      <a:extLst>
+                        <a:ext uri="{28A0092B-C50C-407E-A947-70E740481C1C}">
+                          <a14:useLocalDpi xmlns:a14="http://schemas.microsoft.com/office/drawing/2010/main" val="0"/>
+                        </a:ext>
+                      </a:extLst>
+                    </a:blip>
+                    <a:stretch>
+                      <a:fillRect/>
+                    </a:stretch>
+                  </pic:blipFill>
+                  <pic:spPr>
+                    <a:xfrm>
+                      <a:off x="0" y="0"/>
+                      <a:ext cx="3705742" cy="1867161"/>
+                    </a:xfrm>
+                    <a:prstGeom prst="rect">
+                      <a:avLst/>
+                    </a:prstGeom>
+                  </pic:spPr>
+                </pic:pic>
+              </a:graphicData>
+            </a:graphic>
+          </wp:anchor>
+        </w:drawing>
+      </w:r>
+    </w:p>
+    <w:p>
+      <w:pPr>
+        <w:rPr>
+          <w:lang w:val="en-GB"/>
+        </w:rPr>
+      </w:pPr>
+    </w:p>
+    <w:p>
+      <w:pPr>
+        <w:rPr>
+          <w:lang w:val="en-GB"/>
+        </w:rPr>
+      </w:pPr>
+    </w:p>
+    <w:p>
+      <w:pPr>
+        <w:rPr>
+          <w:lang w:val="en-GB"/>
+        </w:rPr>
+      </w:pPr>
+    </w:p>
+    <w:p>
+      <w:pPr>
+        <w:rPr>
+          <w:lang w:val="en-GB"/>
+        </w:rPr>
+      </w:pPr>
+    </w:p>
+    <w:p>
+      <w:pPr>
+        <w:rPr>
+          <w:lang w:val="en-GB"/>
+        </w:rPr>
+      </w:pPr>
+    </w:p>
+    <w:p>
+      <w:pPr>
+        <w:rPr>
+          <w:lang w:val="en-GB"/>
+        </w:rPr>
+      </w:pPr>
+    </w:p>
+    <w:p>
+      <w:pPr>
+        <w:rPr>
+          <w:lang w:val="en-GB"/>
+        </w:rPr>
+      </w:pPr>
+    </w:p>
+    <w:p>
+      <w:pPr>
+        <w:rPr>
+          <w:lang w:val="en-GB"/>
+        </w:rPr>
+      </w:pPr>
+    </w:p>
+    <w:p>
+      <w:pPr>
+        <w:ind w:firstLine="0"/>
+        <w:rPr>
+          <w:lang w:val="en-GB"/>
+        </w:rPr>
+      </w:pPr>
+    </w:p>
+    <w:p>
+      <w:pPr>
+        <w:tabs>
+          <w:tab w:val="left" w:pos="2100"/>
+        </w:tabs>
+        <w:jc w:val="center"/>
+        <w:rPr>
+          <w:lang w:val="en-GB"/>
+        </w:rPr>
+      </w:pPr>
+      <w:r>
+        <w:rPr>
+          <w:lang w:val="en-GB"/>
+        </w:rPr>
+        <w:t>Figure 5.1.1.</w:t>
+      </w:r>
+      <w:r>
+        <w:rPr>
+          <w:lang w:val="en-GB"/>
+        </w:rPr>
+        <w:t>5</w:t>
+      </w:r>
+      <w:r>
+        <w:rPr>
+          <w:lang w:val="en-GB"/>
+        </w:rPr>
+        <w:t>- Showcase of Crouching Mechanic (Source: screenshot)</w:t>
+      </w:r>
+    </w:p>
+    <w:p>
+      <w:pPr>
+        <w:ind w:firstLine="0"/>
+        <w:rPr>
+          <w:lang w:val="en-GB"/>
+        </w:rPr>
+      </w:pPr>
+    </w:p>
+    <w:p>
+      <w:pPr>
+        <w:ind w:firstLine="0"/>
+        <w:rPr>
+          <w:lang w:val="en-GB"/>
+        </w:rPr>
+      </w:pPr>
+      <w:r>
+        <w:rPr>
+          <w:lang w:val="en-GB"/>
+        </w:rPr>
+        <w:tab/>
+        <w:t>As stated for the Wind Form Dashing, I am making use of the animator controller, thus not only the dash uses it, but the run, crouching and grounded checker are using in order to ensure smooth transitions. The way the animator is controlled ca</w:t>
+      </w:r>
+      <w:r>
+        <w:rPr>
+          <w:lang w:val="en-GB"/>
+        </w:rPr>
+        <w:t>n</w:t>
+      </w:r>
+      <w:r>
+        <w:rPr>
+          <w:lang w:val="en-GB"/>
+        </w:rPr>
+        <w:t xml:space="preserve"> be seen through Figure 5.1.1.4 and Figure 5.1.1.5.</w:t>
+      </w:r>
+      <w:r>
+        <w:rPr>
+          <w:lang w:val="en-GB"/>
+        </w:rPr>
+        <w:t xml:space="preserve"> In a similar manner running is handled, using </w:t>
+      </w:r>
+      <w:proofErr w:type="spellStart"/>
+      <w:proofErr w:type="gramStart"/>
+      <w:r>
+        <w:rPr>
+          <w:lang w:val="en-GB"/>
+        </w:rPr>
+        <w:t>animator.SetBool</w:t>
+      </w:r>
+      <w:proofErr w:type="spellEnd"/>
+      <w:proofErr w:type="gramEnd"/>
+      <w:r>
+        <w:rPr>
+          <w:lang w:val="en-GB"/>
+        </w:rPr>
+        <w:t xml:space="preserve"> and making sure the player is grounded while running, through the grounded Boolean.</w:t>
+      </w:r>
+    </w:p>
+    <w:p>
+      <w:pPr>
+        <w:ind w:firstLine="0"/>
+        <w:rPr>
+          <w:lang w:val="en-GB"/>
+        </w:rPr>
+      </w:pPr>
+      <w:r>
+        <w:rPr>
+          <w:lang w:val="en-GB"/>
+        </w:rPr>
+        <w:tab/>
+      </w:r>
+    </w:p>
+    <w:p>
+      <w:pPr>
+        <w:ind w:firstLine="0"/>
+        <w:rPr>
+          <w:lang w:val="en-GB"/>
+        </w:rPr>
+      </w:pPr>
+    </w:p>
+    <w:p>
+      <w:pPr>
+        <w:ind w:firstLine="0"/>
+        <w:rPr>
+          <w:lang w:val="en-GB"/>
+        </w:rPr>
+      </w:pPr>
+      <w:r>
+        <w:rPr>
+          <w:lang w:val="en-GB"/>
+        </w:rPr>
+        <w:lastRenderedPageBreak/>
+        <w:drawing>
+          <wp:anchor distT="0" distB="0" distL="114300" distR="114300" simplePos="0" relativeHeight="251678720" behindDoc="0" locked="0" layoutInCell="1" allowOverlap="1" wp14:anchorId="2C01714D" wp14:editId="6921D25E">
+            <wp:simplePos x="0" y="0"/>
+            <wp:positionH relativeFrom="column">
+              <wp:posOffset>1013460</wp:posOffset>
+            </wp:positionH>
+            <wp:positionV relativeFrom="paragraph">
+              <wp:posOffset>10795</wp:posOffset>
+            </wp:positionV>
+            <wp:extent cx="3724795" cy="1305107"/>
+            <wp:effectExtent l="0" t="0" r="9525" b="9525"/>
+            <wp:wrapSquare wrapText="bothSides"/>
+            <wp:docPr id="24" name="Picture 24"/>
+            <wp:cNvGraphicFramePr>
+              <a:graphicFrameLocks xmlns:a="http://schemas.openxmlformats.org/drawingml/2006/main" noChangeAspect="1"/>
+            </wp:cNvGraphicFramePr>
+            <a:graphic xmlns:a="http://schemas.openxmlformats.org/drawingml/2006/main">
+              <a:graphicData uri="http://schemas.openxmlformats.org/drawingml/2006/picture">
+                <pic:pic xmlns:pic="http://schemas.openxmlformats.org/drawingml/2006/picture">
+                  <pic:nvPicPr>
+                    <pic:cNvPr id="1" name=""/>
+                    <pic:cNvPicPr/>
+                  </pic:nvPicPr>
+                  <pic:blipFill>
+                    <a:blip r:embed="rId33">
+                      <a:extLst>
+                        <a:ext uri="{28A0092B-C50C-407E-A947-70E740481C1C}">
+                          <a14:useLocalDpi xmlns:a14="http://schemas.microsoft.com/office/drawing/2010/main" val="0"/>
+                        </a:ext>
+                      </a:extLst>
+                    </a:blip>
+                    <a:stretch>
+                      <a:fillRect/>
+                    </a:stretch>
+                  </pic:blipFill>
+                  <pic:spPr>
+                    <a:xfrm>
+                      <a:off x="0" y="0"/>
+                      <a:ext cx="3724795" cy="1305107"/>
+                    </a:xfrm>
+                    <a:prstGeom prst="rect">
+                      <a:avLst/>
+                    </a:prstGeom>
+                  </pic:spPr>
+                </pic:pic>
+              </a:graphicData>
+            </a:graphic>
+          </wp:anchor>
+        </w:drawing>
+      </w:r>
+    </w:p>
+    <w:p>
+      <w:pPr>
+        <w:rPr>
+          <w:lang w:val="en-GB"/>
+        </w:rPr>
+      </w:pPr>
+    </w:p>
+    <w:p>
+      <w:pPr>
+        <w:rPr>
+          <w:lang w:val="en-GB"/>
+        </w:rPr>
+      </w:pPr>
+    </w:p>
+    <w:p>
+      <w:pPr>
+        <w:rPr>
+          <w:lang w:val="en-GB"/>
+        </w:rPr>
+      </w:pPr>
+    </w:p>
+    <w:p>
+      <w:pPr>
+        <w:rPr>
+          <w:lang w:val="en-GB"/>
+        </w:rPr>
+      </w:pPr>
+    </w:p>
+    <w:p>
+      <w:pPr>
+        <w:rPr>
+          <w:lang w:val="en-GB"/>
+        </w:rPr>
+      </w:pPr>
+    </w:p>
+    <w:p>
+      <w:pPr>
+        <w:rPr>
+          <w:lang w:val="en-GB"/>
+        </w:rPr>
+      </w:pPr>
+    </w:p>
+    <w:p>
+      <w:pPr>
+        <w:tabs>
+          <w:tab w:val="left" w:pos="2505"/>
+        </w:tabs>
+        <w:ind w:firstLine="0"/>
+        <w:jc w:val="center"/>
+        <w:rPr>
+          <w:lang w:val="en-GB"/>
+        </w:rPr>
+      </w:pPr>
+      <w:r>
+        <w:rPr>
+          <w:lang w:val="en-GB"/>
+        </w:rPr>
+        <w:t>Figure 5.1.1.6- Showcase of Animator for Running</w:t>
+      </w:r>
+      <w:r>
+        <w:rPr>
+          <w:lang w:val="en-GB"/>
+        </w:rPr>
         <w:t xml:space="preserve"> </w:t>
       </w:r>
       <w:r>
         <w:rPr>
           <w:lang w:val="en-GB"/>
         </w:rPr>
-        <w:t>Code Implementation Analysis</w:t>
-      </w:r>
+        <w:t>(Source: screenshot)</w:t>
+      </w:r>
+    </w:p>
+    <w:p>
+      <w:pPr>
+        <w:tabs>
+          <w:tab w:val="left" w:pos="2505"/>
+        </w:tabs>
+        <w:ind w:firstLine="0"/>
+        <w:rPr>
+          <w:lang w:val="en-GB"/>
+        </w:rPr>
+      </w:pPr>
+    </w:p>
+    <w:p>
+      <w:pPr>
+        <w:tabs>
+          <w:tab w:val="left" w:pos="2505"/>
+        </w:tabs>
+        <w:ind w:firstLine="0"/>
+        <w:rPr>
+          <w:lang w:val="en-GB"/>
+        </w:rPr>
+      </w:pPr>
+      <w:r>
+        <w:rPr>
+          <w:lang w:val="en-GB"/>
+        </w:rPr>
+        <w:t xml:space="preserve">            Collision Management for Wind Form Dash is done using collision ignoring logic thus dynamically allowing passing through specific tagged objects such as enemies, traps, boxes and the boss. When Wind Form ends, all ignored collisions are restored and null references are cleaned up to avoid memory issues from any destroyed objects.</w:t>
+      </w:r>
+    </w:p>
+    <w:p>
+      <w:pPr>
+        <w:tabs>
+          <w:tab w:val="left" w:pos="2505"/>
+        </w:tabs>
+        <w:ind w:firstLine="0"/>
+        <w:rPr>
+          <w:lang w:val="en-GB"/>
+        </w:rPr>
+      </w:pPr>
+      <w:r>
+        <w:rPr>
+          <w:lang w:val="en-GB"/>
+        </w:rPr>
+        <w:drawing>
+          <wp:anchor distT="0" distB="0" distL="114300" distR="114300" simplePos="0" relativeHeight="251679744" behindDoc="0" locked="0" layoutInCell="1" allowOverlap="1" wp14:anchorId="75BCC65E" wp14:editId="487D45D8">
+            <wp:simplePos x="0" y="0"/>
+            <wp:positionH relativeFrom="column">
+              <wp:posOffset>622300</wp:posOffset>
+            </wp:positionH>
+            <wp:positionV relativeFrom="paragraph">
+              <wp:posOffset>57785</wp:posOffset>
+            </wp:positionV>
+            <wp:extent cx="5362575" cy="4461510"/>
+            <wp:effectExtent l="0" t="0" r="9525" b="0"/>
+            <wp:wrapSquare wrapText="bothSides"/>
+            <wp:docPr id="25" name="Picture 25"/>
+            <wp:cNvGraphicFramePr>
+              <a:graphicFrameLocks xmlns:a="http://schemas.openxmlformats.org/drawingml/2006/main" noChangeAspect="1"/>
+            </wp:cNvGraphicFramePr>
+            <a:graphic xmlns:a="http://schemas.openxmlformats.org/drawingml/2006/main">
+              <a:graphicData uri="http://schemas.openxmlformats.org/drawingml/2006/picture">
+                <pic:pic xmlns:pic="http://schemas.openxmlformats.org/drawingml/2006/picture">
+                  <pic:nvPicPr>
+                    <pic:cNvPr id="1" name=""/>
+                    <pic:cNvPicPr/>
+                  </pic:nvPicPr>
+                  <pic:blipFill>
+                    <a:blip r:embed="rId34">
+                      <a:extLst>
+                        <a:ext uri="{28A0092B-C50C-407E-A947-70E740481C1C}">
+                          <a14:useLocalDpi xmlns:a14="http://schemas.microsoft.com/office/drawing/2010/main" val="0"/>
+                        </a:ext>
+                      </a:extLst>
+                    </a:blip>
+                    <a:stretch>
+                      <a:fillRect/>
+                    </a:stretch>
+                  </pic:blipFill>
+                  <pic:spPr>
+                    <a:xfrm>
+                      <a:off x="0" y="0"/>
+                      <a:ext cx="5362575" cy="4461510"/>
+                    </a:xfrm>
+                    <a:prstGeom prst="rect">
+                      <a:avLst/>
+                    </a:prstGeom>
+                  </pic:spPr>
+                </pic:pic>
+              </a:graphicData>
+            </a:graphic>
+            <wp14:sizeRelH relativeFrom="margin">
+              <wp14:pctWidth>0</wp14:pctWidth>
+            </wp14:sizeRelH>
+            <wp14:sizeRelV relativeFrom="margin">
+              <wp14:pctHeight>0</wp14:pctHeight>
+            </wp14:sizeRelV>
+          </wp:anchor>
+        </w:drawing>
+      </w:r>
+    </w:p>
+    <w:p>
+      <w:pPr>
+        <w:tabs>
+          <w:tab w:val="left" w:pos="2505"/>
+        </w:tabs>
+        <w:ind w:firstLine="0"/>
+        <w:rPr>
+          <w:lang w:val="en-GB"/>
+        </w:rPr>
+      </w:pPr>
+    </w:p>
+    <w:p>
+      <w:pPr>
+        <w:tabs>
+          <w:tab w:val="left" w:pos="1275"/>
+        </w:tabs>
+        <w:ind w:firstLine="0"/>
+        <w:rPr>
+          <w:lang w:val="en-GB"/>
+        </w:rPr>
+      </w:pPr>
+    </w:p>
+    <w:p>
+      <w:pPr>
+        <w:jc w:val="center"/>
+        <w:rPr>
+          <w:lang w:val="en-GB"/>
+        </w:rPr>
+      </w:pPr>
+      <w:r>
+        <w:rPr>
+          <w:lang w:val="en-GB"/>
+        </w:rPr>
+        <w:t>Figure 5.1.1.7- Showcase of how collisions are handled (Source: screenshot)</w:t>
+      </w:r>
+    </w:p>
+    <w:p>
+      <w:pPr>
+        <w:rPr>
+          <w:lang w:val="en-GB"/>
+        </w:rPr>
+      </w:pPr>
+    </w:p>
+    <w:p>
+      <w:pPr>
+        <w:rPr>
+          <w:lang w:val="en-GB"/>
+        </w:rPr>
+      </w:pPr>
+    </w:p>
+    <w:p>
+      <w:pPr>
+        <w:rPr>
+          <w:lang w:val="en-GB"/>
+        </w:rPr>
+      </w:pPr>
+    </w:p>
+    <w:p>
+      <w:pPr>
+        <w:rPr>
+          <w:lang w:val="en-GB"/>
+        </w:rPr>
+      </w:pPr>
+    </w:p>
+    <w:p>
+      <w:pPr>
+        <w:rPr>
+          <w:lang w:val="en-GB"/>
+        </w:rPr>
+      </w:pPr>
+    </w:p>
+    <w:p>
+      <w:pPr>
+        <w:rPr>
+          <w:lang w:val="en-GB"/>
+        </w:rPr>
+      </w:pPr>
+    </w:p>
+    <w:p>
+      <w:pPr>
+        <w:rPr>
+          <w:lang w:val="en-GB"/>
+        </w:rPr>
+      </w:pPr>
+    </w:p>
+    <w:p>
+      <w:pPr>
+        <w:rPr>
+          <w:lang w:val="en-GB"/>
+        </w:rPr>
+      </w:pPr>
+    </w:p>
+    <w:p>
+      <w:pPr>
+        <w:rPr>
+          <w:lang w:val="en-GB"/>
+        </w:rPr>
+      </w:pPr>
+    </w:p>
+    <w:p>
+      <w:pPr>
+        <w:rPr>
+          <w:lang w:val="en-GB"/>
+        </w:rPr>
+      </w:pPr>
+    </w:p>
+    <w:p>
+      <w:pPr>
+        <w:rPr>
+          <w:lang w:val="en-GB"/>
+        </w:rPr>
+      </w:pPr>
+    </w:p>
+    <w:p>
+      <w:pPr>
+        <w:rPr>
+          <w:lang w:val="en-GB"/>
+        </w:rPr>
+      </w:pPr>
+    </w:p>
+    <w:p>
+      <w:pPr>
+        <w:rPr>
+          <w:lang w:val="en-GB"/>
+        </w:rPr>
+      </w:pPr>
+    </w:p>
+    <w:p>
+      <w:pPr>
+        <w:rPr>
+          <w:lang w:val="en-GB"/>
+        </w:rPr>
+      </w:pPr>
+    </w:p>
+    <w:p>
+      <w:pPr>
+        <w:rPr>
+          <w:lang w:val="en-GB"/>
+        </w:rPr>
+      </w:pPr>
+    </w:p>
+    <w:p>
+      <w:pPr>
+        <w:rPr>
+          <w:lang w:val="en-GB"/>
+        </w:rPr>
+      </w:pPr>
     </w:p>
     <w:p>
       <w:pPr>
@@ -6243,9 +9982,9 @@
       </w:pPr>
     </w:p>
     <w:sectPr>
-      <w:headerReference w:type="default" r:id="rId27"/>
-      <w:footerReference w:type="default" r:id="rId28"/>
-      <w:headerReference w:type="first" r:id="rId29"/>
+      <w:headerReference w:type="default" r:id="rId35"/>
+      <w:footerReference w:type="default" r:id="rId36"/>
+      <w:headerReference w:type="first" r:id="rId37"/>
       <w:pgSz w:w="11907" w:h="16840" w:code="9"/>
       <w:pgMar w:top="709" w:right="1134" w:bottom="1134" w:left="1134" w:header="709" w:footer="709" w:gutter="0"/>
       <w:pgNumType w:start="1"/>

</xml_diff>